<commit_message>
Refina fluxo AE, historico do banco e limpeza do projeto
</commit_message>
<xml_diff>
--- a/DOCUMENTACAO_ESTRUTURA_CORE_PLANOS_LUAN.docx
+++ b/DOCUMENTACAO_ESTRUTURA_CORE_PLANOS_LUAN.docx
@@ -20,7 +20,7 @@
         <w:rPr>
           <w:i/>
         </w:rPr>
-        <w:t>Documento de referencia em linguagem simples, baseado no comportamento atual do codigo.</w:t>
+        <w:t>Documento atualizado em 05/06/2026, em linguagem simples, com foco na estrutura real do codigo.</w:t>
       </w:r>
     </w:p>
     <w:p>
@@ -28,7 +28,7 @@
         <w:spacing w:after="200"/>
       </w:pPr>
       <w:r>
-        <w:t xml:space="preserve">Objetivo: explicar o papel de cada arquivo mostrado na pasta </w:t>
+        <w:t xml:space="preserve">Objetivo: registrar como a pasta </w:t>
       </w:r>
       <w:r>
         <w:rPr>
@@ -37,7 +37,7 @@
         <w:t>core</w:t>
       </w:r>
       <w:r>
-        <w:t>, indicando para que ele serve no sistema, em que momento entra no fluxo e qual sua importancia pratica.</w:t>
+        <w:t xml:space="preserve"> esta organizada hoje, o papel de cada modulo ou subpacote e em que parte do fluxo ele entra.</w:t>
       </w:r>
     </w:p>
     <w:p>
@@ -51,62 +51,94 @@
     <w:p>
       <w:pPr>
         <w:pStyle w:val="ListBullet"/>
+        <w:spacing w:after="80"/>
       </w:pPr>
       <w:r>
-        <w:t>A pasta core concentra a maior parte da inteligencia de negocio do PLANOS_LUAN.</w:t>
+        <w:t>A pasta core continua sendo o centro da inteligencia de negocio do PLANOS_LUAN, mas hoje ela esta mais distribuida do que estava na versao anterior da documentacao.</w:t>
       </w:r>
     </w:p>
     <w:p>
       <w:pPr>
         <w:pStyle w:val="ListBullet"/>
+        <w:spacing w:after="80"/>
       </w:pPr>
       <w:r>
-        <w:t>Alguns arquivos cuidam do cadastro e dos modelos em Word; outros tratam da leitura pedagogica dos PDFs, do modo CDP, do uso de IA e da validacao da qualidade final.</w:t>
+        <w:t>Ela combina arquivos de infraestrutura, motores pedagogicos, camadas especializadas por disciplina ou modalidade e subpacotes como core/lib, core/cdp e core/eja.</w:t>
       </w:r>
     </w:p>
     <w:p>
       <w:pPr>
         <w:pStyle w:val="ListBullet"/>
+        <w:spacing w:after="80"/>
       </w:pPr>
       <w:r>
-        <w:t>Hoje o modulo mais central para geracao de aulas comuns a partir dos PDFs e o lote.py.</w:t>
+        <w:t>Para aulas comuns vindas de PDF, lote.py continua sendo o nucleo principal.</w:t>
       </w:r>
     </w:p>
     <w:p>
       <w:pPr>
+        <w:pStyle w:val="ListBullet"/>
+        <w:spacing w:after="80"/>
+      </w:pPr>
+      <w:r>
+        <w:t>Para CDP, o projeto passou a conviver com uma camada nova em pacote e uma camada legada de compatibilidade.</w:t>
+      </w:r>
+    </w:p>
+    <w:p>
+      <w:pPr>
+        <w:pStyle w:val="ListBullet"/>
+        <w:spacing w:after="80"/>
+      </w:pPr>
+      <w:r>
+        <w:t>Tambem surgiu uma integracao nova com o guia priorizado por meio de ae_priorizado.py.</w:t>
+      </w:r>
+    </w:p>
+    <w:p>
+      <w:pPr>
         <w:pStyle w:val="Heading1"/>
       </w:pPr>
       <w:r>
-        <w:t>Mapa Rapido dos Arquivos</w:t>
+        <w:t>Mapa Rapido dos Itens da Pasta core</w:t>
       </w:r>
     </w:p>
     <w:tbl>
       <w:tblPr>
         <w:tblStyle w:val="TableGrid"/>
         <w:tblW w:type="auto" w:w="0"/>
-        <w:tblLayout w:type="autofit"/>
         <w:tblLook w:firstColumn="1" w:firstRow="1" w:lastColumn="0" w:lastRow="0" w:noHBand="0" w:noVBand="1" w:val="04A0"/>
       </w:tblPr>
       <w:tblGrid>
-        <w:gridCol w:w="3216"/>
-        <w:gridCol w:w="3216"/>
-        <w:gridCol w:w="3216"/>
+        <w:gridCol w:w="2412"/>
+        <w:gridCol w:w="2412"/>
+        <w:gridCol w:w="2412"/>
+        <w:gridCol w:w="2412"/>
       </w:tblGrid>
       <w:tr>
         <w:tc>
           <w:tcPr>
-            <w:tcW w:type="dxa" w:w="3216"/>
+            <w:tcW w:type="dxa" w:w="2412"/>
             <w:shd w:fill="D9EAF7"/>
           </w:tcPr>
           <w:p>
             <w:r>
-              <w:t>Arquivo</w:t>
+              <w:t>Item</w:t>
             </w:r>
           </w:p>
         </w:tc>
         <w:tc>
           <w:tcPr>
-            <w:tcW w:type="dxa" w:w="3216"/>
+            <w:tcW w:type="dxa" w:w="2412"/>
+            <w:shd w:fill="D9EAF7"/>
+          </w:tcPr>
+          <w:p>
+            <w:r>
+              <w:t>Tipo</w:t>
+            </w:r>
+          </w:p>
+        </w:tc>
+        <w:tc>
+          <w:tcPr>
+            <w:tcW w:type="dxa" w:w="2412"/>
             <w:shd w:fill="D9EAF7"/>
           </w:tcPr>
           <w:p>
@@ -117,7 +149,7 @@
         </w:tc>
         <w:tc>
           <w:tcPr>
-            <w:tcW w:type="dxa" w:w="3216"/>
+            <w:tcW w:type="dxa" w:w="2412"/>
             <w:shd w:fill="D9EAF7"/>
           </w:tcPr>
           <w:p>
@@ -130,7 +162,7 @@
       <w:tr>
         <w:tc>
           <w:tcPr>
-            <w:tcW w:type="dxa" w:w="3216"/>
+            <w:tcW w:type="dxa" w:w="2412"/>
           </w:tcPr>
           <w:p>
             <w:r>
@@ -140,17 +172,27 @@
         </w:tc>
         <w:tc>
           <w:tcPr>
-            <w:tcW w:type="dxa" w:w="3216"/>
+            <w:tcW w:type="dxa" w:w="2412"/>
           </w:tcPr>
           <w:p>
             <w:r>
-              <w:t>Marca a pasta core como pacote Python.</w:t>
+              <w:t>Arquivo</w:t>
             </w:r>
           </w:p>
         </w:tc>
         <w:tc>
           <w:tcPr>
-            <w:tcW w:type="dxa" w:w="3216"/>
+            <w:tcW w:type="dxa" w:w="2412"/>
+          </w:tcPr>
+          <w:p>
+            <w:r>
+              <w:t>Marca a pasta core como pacote Python e habilita os imports internos do sistema.</w:t>
+            </w:r>
+          </w:p>
+        </w:tc>
+        <w:tc>
+          <w:tcPr>
+            <w:tcW w:type="dxa" w:w="2412"/>
           </w:tcPr>
           <w:p>
             <w:r>
@@ -162,7 +204,49 @@
       <w:tr>
         <w:tc>
           <w:tcPr>
-            <w:tcW w:type="dxa" w:w="3216"/>
+            <w:tcW w:type="dxa" w:w="2412"/>
+          </w:tcPr>
+          <w:p>
+            <w:r>
+              <w:t>ae_priorizado.py</w:t>
+            </w:r>
+          </w:p>
+        </w:tc>
+        <w:tc>
+          <w:tcPr>
+            <w:tcW w:type="dxa" w:w="2412"/>
+          </w:tcPr>
+          <w:p>
+            <w:r>
+              <w:t>Arquivo</w:t>
+            </w:r>
+          </w:p>
+        </w:tc>
+        <w:tc>
+          <w:tcPr>
+            <w:tcW w:type="dxa" w:w="2412"/>
+          </w:tcPr>
+          <w:p>
+            <w:r>
+              <w:t>Aplica o modo AE priorizado para Portugues, lendo a base em assets/ae_priorizado e trocando a aprendizagem pelo AE correspondente.</w:t>
+            </w:r>
+          </w:p>
+        </w:tc>
+        <w:tc>
+          <w:tcPr>
+            <w:tcW w:type="dxa" w:w="2412"/>
+          </w:tcPr>
+          <w:p>
+            <w:r>
+              <w:t>Integracao piloto</w:t>
+            </w:r>
+          </w:p>
+        </w:tc>
+      </w:tr>
+      <w:tr>
+        <w:tc>
+          <w:tcPr>
+            <w:tcW w:type="dxa" w:w="2412"/>
           </w:tcPr>
           <w:p>
             <w:r>
@@ -172,17 +256,27 @@
         </w:tc>
         <w:tc>
           <w:tcPr>
-            <w:tcW w:type="dxa" w:w="3216"/>
+            <w:tcW w:type="dxa" w:w="2412"/>
           </w:tcPr>
           <w:p>
             <w:r>
-              <w:t>Gera os textos de acompanhamento da aprendizagem e acessibilidade para cada aula.</w:t>
+              <w:t>Arquivo</w:t>
             </w:r>
           </w:p>
         </w:tc>
         <w:tc>
           <w:tcPr>
-            <w:tcW w:type="dxa" w:w="3216"/>
+            <w:tcW w:type="dxa" w:w="2412"/>
+          </w:tcPr>
+          <w:p>
+            <w:r>
+              <w:t>Gera frases de acompanhamento da aprendizagem e acessibilidade de forma dinamica.</w:t>
+            </w:r>
+          </w:p>
+        </w:tc>
+        <w:tc>
+          <w:tcPr>
+            <w:tcW w:type="dxa" w:w="2412"/>
           </w:tcPr>
           <w:p>
             <w:r>
@@ -194,7 +288,7 @@
       <w:tr>
         <w:tc>
           <w:tcPr>
-            <w:tcW w:type="dxa" w:w="3216"/>
+            <w:tcW w:type="dxa" w:w="2412"/>
           </w:tcPr>
           <w:p>
             <w:r>
@@ -204,17 +298,27 @@
         </w:tc>
         <w:tc>
           <w:tcPr>
-            <w:tcW w:type="dxa" w:w="3216"/>
+            <w:tcW w:type="dxa" w:w="2412"/>
           </w:tcPr>
           <w:p>
             <w:r>
-              <w:t>Guarda padroes disciplinares, tecnicas esperadas e estruturas base de aula.</w:t>
+              <w:t>Arquivo</w:t>
             </w:r>
           </w:p>
         </w:tc>
         <w:tc>
           <w:tcPr>
-            <w:tcW w:type="dxa" w:w="3216"/>
+            <w:tcW w:type="dxa" w:w="2412"/>
+          </w:tcPr>
+          <w:p>
+            <w:r>
+              <w:t>Guarda padroes disciplinares e repertorios que ajudam a inteligencia local a montar aulas coerentes.</w:t>
+            </w:r>
+          </w:p>
+        </w:tc>
+        <w:tc>
+          <w:tcPr>
+            <w:tcW w:type="dxa" w:w="2412"/>
           </w:tcPr>
           <w:p>
             <w:r>
@@ -226,7 +330,7 @@
       <w:tr>
         <w:tc>
           <w:tcPr>
-            <w:tcW w:type="dxa" w:w="3216"/>
+            <w:tcW w:type="dxa" w:w="2412"/>
           </w:tcPr>
           <w:p>
             <w:r>
@@ -236,17 +340,27 @@
         </w:tc>
         <w:tc>
           <w:tcPr>
-            <w:tcW w:type="dxa" w:w="3216"/>
+            <w:tcW w:type="dxa" w:w="2412"/>
           </w:tcPr>
           <w:p>
             <w:r>
-              <w:t>Calcula datas importantes do calendario escolar, como Pascoa, feriados nacionais e exclusao de dias sem aula.</w:t>
+              <w:t>Arquivo</w:t>
             </w:r>
           </w:p>
         </w:tc>
         <w:tc>
           <w:tcPr>
-            <w:tcW w:type="dxa" w:w="3216"/>
+            <w:tcW w:type="dxa" w:w="2412"/>
+          </w:tcPr>
+          <w:p>
+            <w:r>
+              <w:t>Calcula feriados nacionais, datas sem aula, extensao do mes e filtros de agenda.</w:t>
+            </w:r>
+          </w:p>
+        </w:tc>
+        <w:tc>
+          <w:tcPr>
+            <w:tcW w:type="dxa" w:w="2412"/>
           </w:tcPr>
           <w:p>
             <w:r>
@@ -258,31 +372,41 @@
       <w:tr>
         <w:tc>
           <w:tcPr>
-            <w:tcW w:type="dxa" w:w="3216"/>
+            <w:tcW w:type="dxa" w:w="2412"/>
           </w:tcPr>
           <w:p>
             <w:r>
-              <w:t>cdp.py</w:t>
+              <w:t>cdp/</w:t>
             </w:r>
           </w:p>
         </w:tc>
         <w:tc>
           <w:tcPr>
-            <w:tcW w:type="dxa" w:w="3216"/>
+            <w:tcW w:type="dxa" w:w="2412"/>
           </w:tcPr>
           <w:p>
             <w:r>
-              <w:t>Lê e organiza os dados do modo CDP a partir de planilhas e documentos locais.</w:t>
+              <w:t>Pacote</w:t>
             </w:r>
           </w:p>
         </w:tc>
         <w:tc>
           <w:tcPr>
-            <w:tcW w:type="dxa" w:w="3216"/>
+            <w:tcW w:type="dxa" w:w="2412"/>
           </w:tcPr>
           <w:p>
             <w:r>
-              <w:t>Nucleo CDP</w:t>
+              <w:t>Concentra a implementacao mais nova do fluxo CDP, especialmente em gerador_cdp.py.</w:t>
+            </w:r>
+          </w:p>
+        </w:tc>
+        <w:tc>
+          <w:tcPr>
+            <w:tcW w:type="dxa" w:w="2412"/>
+          </w:tcPr>
+          <w:p>
+            <w:r>
+              <w:t>Nucleo CDP atual</w:t>
             </w:r>
           </w:p>
         </w:tc>
@@ -290,7 +414,49 @@
       <w:tr>
         <w:tc>
           <w:tcPr>
-            <w:tcW w:type="dxa" w:w="3216"/>
+            <w:tcW w:type="dxa" w:w="2412"/>
+          </w:tcPr>
+          <w:p>
+            <w:r>
+              <w:t>cdp_legacy.py</w:t>
+            </w:r>
+          </w:p>
+        </w:tc>
+        <w:tc>
+          <w:tcPr>
+            <w:tcW w:type="dxa" w:w="2412"/>
+          </w:tcPr>
+          <w:p>
+            <w:r>
+              <w:t>Arquivo</w:t>
+            </w:r>
+          </w:p>
+        </w:tc>
+        <w:tc>
+          <w:tcPr>
+            <w:tcW w:type="dxa" w:w="2412"/>
+          </w:tcPr>
+          <w:p>
+            <w:r>
+              <w:t>Mantem a logica legada do CDP que ainda serve de base para funcoes importadas pelo pacote core.cdp.</w:t>
+            </w:r>
+          </w:p>
+        </w:tc>
+        <w:tc>
+          <w:tcPr>
+            <w:tcW w:type="dxa" w:w="2412"/>
+          </w:tcPr>
+          <w:p>
+            <w:r>
+              <w:t>Compatibilidade</w:t>
+            </w:r>
+          </w:p>
+        </w:tc>
+      </w:tr>
+      <w:tr>
+        <w:tc>
+          <w:tcPr>
+            <w:tcW w:type="dxa" w:w="2412"/>
           </w:tcPr>
           <w:p>
             <w:r>
@@ -300,17 +466,27 @@
         </w:tc>
         <w:tc>
           <w:tcPr>
-            <w:tcW w:type="dxa" w:w="3216"/>
+            <w:tcW w:type="dxa" w:w="2412"/>
           </w:tcPr>
           <w:p>
             <w:r>
-              <w:t>Reescreve planos CDP prontos em DOCX, especialmente no fluxo contextual de Matematica e Ensino Medio.</w:t>
+              <w:t>Arquivo</w:t>
             </w:r>
           </w:p>
         </w:tc>
         <w:tc>
           <w:tcPr>
-            <w:tcW w:type="dxa" w:w="3216"/>
+            <w:tcW w:type="dxa" w:w="2412"/>
+          </w:tcPr>
+          <w:p>
+            <w:r>
+              <w:t>Reescreve e ajusta documentos DOCX do fluxo CDP, com foco em cenarios como Matematica contextual e Ensino Medio.</w:t>
+            </w:r>
+          </w:p>
+        </w:tc>
+        <w:tc>
+          <w:tcPr>
+            <w:tcW w:type="dxa" w:w="2412"/>
           </w:tcPr>
           <w:p>
             <w:r>
@@ -322,7 +498,7 @@
       <w:tr>
         <w:tc>
           <w:tcPr>
-            <w:tcW w:type="dxa" w:w="3216"/>
+            <w:tcW w:type="dxa" w:w="2412"/>
           </w:tcPr>
           <w:p>
             <w:r>
@@ -332,17 +508,27 @@
         </w:tc>
         <w:tc>
           <w:tcPr>
-            <w:tcW w:type="dxa" w:w="3216"/>
+            <w:tcW w:type="dxa" w:w="2412"/>
           </w:tcPr>
           <w:p>
             <w:r>
-              <w:t>Controla o banco SQLite do sistema.</w:t>
+              <w:t>Arquivo</w:t>
             </w:r>
           </w:p>
         </w:tc>
         <w:tc>
           <w:tcPr>
-            <w:tcW w:type="dxa" w:w="3216"/>
+            <w:tcW w:type="dxa" w:w="2412"/>
+          </w:tcPr>
+          <w:p>
+            <w:r>
+              <w:t>Controla o banco SQLite do sistema, incluindo professores, turmas, vinculos, template_id, componente curricular e historico dos planos.</w:t>
+            </w:r>
+          </w:p>
+        </w:tc>
+        <w:tc>
+          <w:tcPr>
+            <w:tcW w:type="dxa" w:w="2412"/>
           </w:tcPr>
           <w:p>
             <w:r>
@@ -354,7 +540,7 @@
       <w:tr>
         <w:tc>
           <w:tcPr>
-            <w:tcW w:type="dxa" w:w="3216"/>
+            <w:tcW w:type="dxa" w:w="2412"/>
           </w:tcPr>
           <w:p>
             <w:r>
@@ -364,17 +550,27 @@
         </w:tc>
         <w:tc>
           <w:tcPr>
-            <w:tcW w:type="dxa" w:w="3216"/>
+            <w:tcW w:type="dxa" w:w="2412"/>
           </w:tcPr>
           <w:p>
             <w:r>
-              <w:t>Define a lista oficial de disciplinas, bimestres e configuracoes de modo.</w:t>
+              <w:t>Arquivo</w:t>
             </w:r>
           </w:p>
         </w:tc>
         <w:tc>
           <w:tcPr>
-            <w:tcW w:type="dxa" w:w="3216"/>
+            <w:tcW w:type="dxa" w:w="2412"/>
+          </w:tcPr>
+          <w:p>
+            <w:r>
+              <w:t>Define disciplinas, bimestres e modos de funcionamento como PDF, CDP e CDP Fundamental.</w:t>
+            </w:r>
+          </w:p>
+        </w:tc>
+        <w:tc>
+          <w:tcPr>
+            <w:tcW w:type="dxa" w:w="2412"/>
           </w:tcPr>
           <w:p>
             <w:r>
@@ -386,7 +582,49 @@
       <w:tr>
         <w:tc>
           <w:tcPr>
-            <w:tcW w:type="dxa" w:w="3216"/>
+            <w:tcW w:type="dxa" w:w="2412"/>
+          </w:tcPr>
+          <w:p>
+            <w:r>
+              <w:t>eja/</w:t>
+            </w:r>
+          </w:p>
+        </w:tc>
+        <w:tc>
+          <w:tcPr>
+            <w:tcW w:type="dxa" w:w="2412"/>
+          </w:tcPr>
+          <w:p>
+            <w:r>
+              <w:t>Pacote</w:t>
+            </w:r>
+          </w:p>
+        </w:tc>
+        <w:tc>
+          <w:tcPr>
+            <w:tcW w:type="dxa" w:w="2412"/>
+          </w:tcPr>
+          <w:p>
+            <w:r>
+              <w:t>Agrupa adaptacoes para EJA, como consolidacao de blocos e tecnicas com linguagem adequada a jovens e adultos.</w:t>
+            </w:r>
+          </w:p>
+        </w:tc>
+        <w:tc>
+          <w:tcPr>
+            <w:tcW w:type="dxa" w:w="2412"/>
+          </w:tcPr>
+          <w:p>
+            <w:r>
+              <w:t>Especializacao</w:t>
+            </w:r>
+          </w:p>
+        </w:tc>
+      </w:tr>
+      <w:tr>
+        <w:tc>
+          <w:tcPr>
+            <w:tcW w:type="dxa" w:w="2412"/>
           </w:tcPr>
           <w:p>
             <w:r>
@@ -396,17 +634,27 @@
         </w:tc>
         <w:tc>
           <w:tcPr>
-            <w:tcW w:type="dxa" w:w="3216"/>
+            <w:tcW w:type="dxa" w:w="2412"/>
           </w:tcPr>
           <w:p>
             <w:r>
-              <w:t>Reune utilitarios pequenos usados em varias partes do sistema.</w:t>
+              <w:t>Arquivo</w:t>
             </w:r>
           </w:p>
         </w:tc>
         <w:tc>
           <w:tcPr>
-            <w:tcW w:type="dxa" w:w="3216"/>
+            <w:tcW w:type="dxa" w:w="2412"/>
+          </w:tcPr>
+          <w:p>
+            <w:r>
+              <w:t>Reune funcoes pequenas de formatacao e apoio, como horario_para_plano, texto_lista, relatorio simples e preservacao da ordem de envio dos arquivos.</w:t>
+            </w:r>
+          </w:p>
+        </w:tc>
+        <w:tc>
+          <w:tcPr>
+            <w:tcW w:type="dxa" w:w="2412"/>
           </w:tcPr>
           <w:p>
             <w:r>
@@ -418,7 +666,7 @@
       <w:tr>
         <w:tc>
           <w:tcPr>
-            <w:tcW w:type="dxa" w:w="3216"/>
+            <w:tcW w:type="dxa" w:w="2412"/>
           </w:tcPr>
           <w:p>
             <w:r>
@@ -428,21 +676,31 @@
         </w:tc>
         <w:tc>
           <w:tcPr>
-            <w:tcW w:type="dxa" w:w="3216"/>
+            <w:tcW w:type="dxa" w:w="2412"/>
           </w:tcPr>
           <w:p>
             <w:r>
-              <w:t>Integra o sistema com modelos de IA, como OpenAI e Gemini.</w:t>
+              <w:t>Arquivo</w:t>
             </w:r>
           </w:p>
         </w:tc>
         <w:tc>
           <w:tcPr>
-            <w:tcW w:type="dxa" w:w="3216"/>
+            <w:tcW w:type="dxa" w:w="2412"/>
           </w:tcPr>
           <w:p>
             <w:r>
-              <w:t>Motor</w:t>
+              <w:t>Integra o sistema com OpenAI e Gemini para extrair e montar tema, aprendizagem e metodologia.</w:t>
+            </w:r>
+          </w:p>
+        </w:tc>
+        <w:tc>
+          <w:tcPr>
+            <w:tcW w:type="dxa" w:w="2412"/>
+          </w:tcPr>
+          <w:p>
+            <w:r>
+              <w:t>Motor externo</w:t>
             </w:r>
           </w:p>
         </w:tc>
@@ -450,7 +708,7 @@
       <w:tr>
         <w:tc>
           <w:tcPr>
-            <w:tcW w:type="dxa" w:w="3216"/>
+            <w:tcW w:type="dxa" w:w="2412"/>
           </w:tcPr>
           <w:p>
             <w:r>
@@ -460,21 +718,31 @@
         </w:tc>
         <w:tc>
           <w:tcPr>
-            <w:tcW w:type="dxa" w:w="3216"/>
+            <w:tcW w:type="dxa" w:w="2412"/>
           </w:tcPr>
           <w:p>
             <w:r>
-              <w:t>Executa analise e geracao local sem depender de IA externa.</w:t>
+              <w:t>Arquivo</w:t>
             </w:r>
           </w:p>
         </w:tc>
         <w:tc>
           <w:tcPr>
-            <w:tcW w:type="dxa" w:w="3216"/>
+            <w:tcW w:type="dxa" w:w="2412"/>
           </w:tcPr>
           <w:p>
             <w:r>
-              <w:t>Motor</w:t>
+              <w:t>Executa heuristicas e geracao local sem depender de IA externa.</w:t>
+            </w:r>
+          </w:p>
+        </w:tc>
+        <w:tc>
+          <w:tcPr>
+            <w:tcW w:type="dxa" w:w="2412"/>
+          </w:tcPr>
+          <w:p>
+            <w:r>
+              <w:t>Motor local</w:t>
             </w:r>
           </w:p>
         </w:tc>
@@ -482,7 +750,49 @@
       <w:tr>
         <w:tc>
           <w:tcPr>
-            <w:tcW w:type="dxa" w:w="3216"/>
+            <w:tcW w:type="dxa" w:w="2412"/>
+          </w:tcPr>
+          <w:p>
+            <w:r>
+              <w:t>lib/</w:t>
+            </w:r>
+          </w:p>
+        </w:tc>
+        <w:tc>
+          <w:tcPr>
+            <w:tcW w:type="dxa" w:w="2412"/>
+          </w:tcPr>
+          <w:p>
+            <w:r>
+              <w:t>Pacote</w:t>
+            </w:r>
+          </w:p>
+        </w:tc>
+        <w:tc>
+          <w:tcPr>
+            <w:tcW w:type="dxa" w:w="2412"/>
+          </w:tcPr>
+          <w:p>
+            <w:r>
+              <w:t>Agrupa extratores, classificadores, perfis de acompanhamento e acessibilidade, geradores de colunas pedagogicas, progressao, tecnicas e modalidades.</w:t>
+            </w:r>
+          </w:p>
+        </w:tc>
+        <w:tc>
+          <w:tcPr>
+            <w:tcW w:type="dxa" w:w="2412"/>
+          </w:tcPr>
+          <w:p>
+            <w:r>
+              <w:t>Base modular</w:t>
+            </w:r>
+          </w:p>
+        </w:tc>
+      </w:tr>
+      <w:tr>
+        <w:tc>
+          <w:tcPr>
+            <w:tcW w:type="dxa" w:w="2412"/>
           </w:tcPr>
           <w:p>
             <w:r>
@@ -492,17 +802,27 @@
         </w:tc>
         <w:tc>
           <w:tcPr>
-            <w:tcW w:type="dxa" w:w="3216"/>
+            <w:tcW w:type="dxa" w:w="2412"/>
           </w:tcPr>
           <w:p>
             <w:r>
-              <w:t>E o coracao da geracao de aulas a partir dos PDFs.</w:t>
+              <w:t>Arquivo</w:t>
             </w:r>
           </w:p>
         </w:tc>
         <w:tc>
           <w:tcPr>
-            <w:tcW w:type="dxa" w:w="3216"/>
+            <w:tcW w:type="dxa" w:w="2412"/>
+          </w:tcPr>
+          <w:p>
+            <w:r>
+              <w:t>Transforma PDFs comuns em aulas estruturadas com tema, material, aprendizagem, metodologia, acompanhamento e acessibilidade.</w:t>
+            </w:r>
+          </w:p>
+        </w:tc>
+        <w:tc>
+          <w:tcPr>
+            <w:tcW w:type="dxa" w:w="2412"/>
           </w:tcPr>
           <w:p>
             <w:r>
@@ -514,7 +834,7 @@
       <w:tr>
         <w:tc>
           <w:tcPr>
-            <w:tcW w:type="dxa" w:w="3216"/>
+            <w:tcW w:type="dxa" w:w="2412"/>
           </w:tcPr>
           <w:p>
             <w:r>
@@ -524,21 +844,31 @@
         </w:tc>
         <w:tc>
           <w:tcPr>
-            <w:tcW w:type="dxa" w:w="3216"/>
+            <w:tcW w:type="dxa" w:w="2412"/>
           </w:tcPr>
           <w:p>
             <w:r>
-              <w:t>Faz ajustes linguísticos em textos metodologicos.</w:t>
+              <w:t>Arquivo</w:t>
             </w:r>
           </w:p>
         </w:tc>
         <w:tc>
           <w:tcPr>
-            <w:tcW w:type="dxa" w:w="3216"/>
+            <w:tcW w:type="dxa" w:w="2412"/>
           </w:tcPr>
           <w:p>
             <w:r>
-              <w:t>Apoio</w:t>
+              <w:t>Faz ajustes linguisticos finos na metodologia, como regularizacao de verbos e polimento de frase.</w:t>
+            </w:r>
+          </w:p>
+        </w:tc>
+        <w:tc>
+          <w:tcPr>
+            <w:tcW w:type="dxa" w:w="2412"/>
+          </w:tcPr>
+          <w:p>
+            <w:r>
+              <w:t>Apoio textual</w:t>
             </w:r>
           </w:p>
         </w:tc>
@@ -546,7 +876,7 @@
       <w:tr>
         <w:tc>
           <w:tcPr>
-            <w:tcW w:type="dxa" w:w="3216"/>
+            <w:tcW w:type="dxa" w:w="2412"/>
           </w:tcPr>
           <w:p>
             <w:r>
@@ -556,17 +886,27 @@
         </w:tc>
         <w:tc>
           <w:tcPr>
-            <w:tcW w:type="dxa" w:w="3216"/>
+            <w:tcW w:type="dxa" w:w="2412"/>
           </w:tcPr>
           <w:p>
             <w:r>
-              <w:t>Escolhe qual template DOCX central deve ser usado.</w:t>
+              <w:t>Arquivo</w:t>
             </w:r>
           </w:p>
         </w:tc>
         <w:tc>
           <w:tcPr>
-            <w:tcW w:type="dxa" w:w="3216"/>
+            <w:tcW w:type="dxa" w:w="2412"/>
+          </w:tcPr>
+          <w:p>
+            <w:r>
+              <w:t>Resolve o template central correto por contexto, template_id, escola, disciplina e componente curricular.</w:t>
+            </w:r>
+          </w:p>
+        </w:tc>
+        <w:tc>
+          <w:tcPr>
+            <w:tcW w:type="dxa" w:w="2412"/>
           </w:tcPr>
           <w:p>
             <w:r>
@@ -578,7 +918,133 @@
       <w:tr>
         <w:tc>
           <w:tcPr>
-            <w:tcW w:type="dxa" w:w="3216"/>
+            <w:tcW w:type="dxa" w:w="2412"/>
+          </w:tcPr>
+          <w:p>
+            <w:r>
+              <w:t>orientacao_estudos_metodologia.py</w:t>
+            </w:r>
+          </w:p>
+        </w:tc>
+        <w:tc>
+          <w:tcPr>
+            <w:tcW w:type="dxa" w:w="2412"/>
+          </w:tcPr>
+          <w:p>
+            <w:r>
+              <w:t>Arquivo</w:t>
+            </w:r>
+          </w:p>
+        </w:tc>
+        <w:tc>
+          <w:tcPr>
+            <w:tcW w:type="dxa" w:w="2412"/>
+          </w:tcPr>
+          <w:p>
+            <w:r>
+              <w:t>Gera metodologia altamente especifica para Orientacao de Estudos, com perfis por missao, trilha ou jornada.</w:t>
+            </w:r>
+          </w:p>
+        </w:tc>
+        <w:tc>
+          <w:tcPr>
+            <w:tcW w:type="dxa" w:w="2412"/>
+          </w:tcPr>
+          <w:p>
+            <w:r>
+              <w:t>Especializado</w:t>
+            </w:r>
+          </w:p>
+        </w:tc>
+      </w:tr>
+      <w:tr>
+        <w:tc>
+          <w:tcPr>
+            <w:tcW w:type="dxa" w:w="2412"/>
+          </w:tcPr>
+          <w:p>
+            <w:r>
+              <w:t>orientacao_estudos_objetivos.py</w:t>
+            </w:r>
+          </w:p>
+        </w:tc>
+        <w:tc>
+          <w:tcPr>
+            <w:tcW w:type="dxa" w:w="2412"/>
+          </w:tcPr>
+          <w:p>
+            <w:r>
+              <w:t>Arquivo</w:t>
+            </w:r>
+          </w:p>
+        </w:tc>
+        <w:tc>
+          <w:tcPr>
+            <w:tcW w:type="dxa" w:w="2412"/>
+          </w:tcPr>
+          <w:p>
+            <w:r>
+              <w:t>Centraliza objetivos e apoio textual para o fluxo de Orientacao de Estudos.</w:t>
+            </w:r>
+          </w:p>
+        </w:tc>
+        <w:tc>
+          <w:tcPr>
+            <w:tcW w:type="dxa" w:w="2412"/>
+          </w:tcPr>
+          <w:p>
+            <w:r>
+              <w:t>Especializado</w:t>
+            </w:r>
+          </w:p>
+        </w:tc>
+      </w:tr>
+      <w:tr>
+        <w:tc>
+          <w:tcPr>
+            <w:tcW w:type="dxa" w:w="2412"/>
+          </w:tcPr>
+          <w:p>
+            <w:r>
+              <w:t>planos_luan.db</w:t>
+            </w:r>
+          </w:p>
+        </w:tc>
+        <w:tc>
+          <w:tcPr>
+            <w:tcW w:type="dxa" w:w="2412"/>
+          </w:tcPr>
+          <w:p>
+            <w:r>
+              <w:t>Arquivo tecnico</w:t>
+            </w:r>
+          </w:p>
+        </w:tc>
+        <w:tc>
+          <w:tcPr>
+            <w:tcW w:type="dxa" w:w="2412"/>
+          </w:tcPr>
+          <w:p>
+            <w:r>
+              <w:t>Arquivo presente dentro da pasta core, mas que nao representa hoje o banco principal de operacao do sistema.</w:t>
+            </w:r>
+          </w:p>
+        </w:tc>
+        <w:tc>
+          <w:tcPr>
+            <w:tcW w:type="dxa" w:w="2412"/>
+          </w:tcPr>
+          <w:p>
+            <w:r>
+              <w:t>Artefato local</w:t>
+            </w:r>
+          </w:p>
+        </w:tc>
+      </w:tr>
+      <w:tr>
+        <w:tc>
+          <w:tcPr>
+            <w:tcW w:type="dxa" w:w="2412"/>
           </w:tcPr>
           <w:p>
             <w:r>
@@ -588,17 +1054,27 @@
         </w:tc>
         <w:tc>
           <w:tcPr>
-            <w:tcW w:type="dxa" w:w="3216"/>
+            <w:tcW w:type="dxa" w:w="2412"/>
           </w:tcPr>
           <w:p>
             <w:r>
-              <w:t>Lê, diagnostica, cria e atualiza planos-modelo dentro das pastas dos professores.</w:t>
+              <w:t>Arquivo</w:t>
             </w:r>
           </w:p>
         </w:tc>
         <w:tc>
           <w:tcPr>
-            <w:tcW w:type="dxa" w:w="3216"/>
+            <w:tcW w:type="dxa" w:w="2412"/>
+          </w:tcPr>
+          <w:p>
+            <w:r>
+              <w:t>Le, diagnostica, cria e atualiza modelos DOCX encontrados nas pastas dos professores.</w:t>
+            </w:r>
+          </w:p>
+        </w:tc>
+        <w:tc>
+          <w:tcPr>
+            <w:tcW w:type="dxa" w:w="2412"/>
           </w:tcPr>
           <w:p>
             <w:r>
@@ -610,7 +1086,7 @@
       <w:tr>
         <w:tc>
           <w:tcPr>
-            <w:tcW w:type="dxa" w:w="3216"/>
+            <w:tcW w:type="dxa" w:w="2412"/>
           </w:tcPr>
           <w:p>
             <w:r>
@@ -620,17 +1096,27 @@
         </w:tc>
         <w:tc>
           <w:tcPr>
-            <w:tcW w:type="dxa" w:w="3216"/>
+            <w:tcW w:type="dxa" w:w="2412"/>
           </w:tcPr>
           <w:p>
             <w:r>
-              <w:t>Lê e interpreta o escopo de Projeto de Vida.</w:t>
+              <w:t>Arquivo</w:t>
             </w:r>
           </w:p>
         </w:tc>
         <w:tc>
           <w:tcPr>
-            <w:tcW w:type="dxa" w:w="3216"/>
+            <w:tcW w:type="dxa" w:w="2412"/>
+          </w:tcPr>
+          <w:p>
+            <w:r>
+              <w:t>Le e interpreta o escopo-sequencia de Projeto de Vida para localizar o item certo por turma, bimestre e aula.</w:t>
+            </w:r>
+          </w:p>
+        </w:tc>
+        <w:tc>
+          <w:tcPr>
+            <w:tcW w:type="dxa" w:w="2412"/>
           </w:tcPr>
           <w:p>
             <w:r>
@@ -642,7 +1128,7 @@
       <w:tr>
         <w:tc>
           <w:tcPr>
-            <w:tcW w:type="dxa" w:w="3216"/>
+            <w:tcW w:type="dxa" w:w="2412"/>
           </w:tcPr>
           <w:p>
             <w:r>
@@ -652,17 +1138,153 @@
         </w:tc>
         <w:tc>
           <w:tcPr>
-            <w:tcW w:type="dxa" w:w="3216"/>
+            <w:tcW w:type="dxa" w:w="2412"/>
           </w:tcPr>
           <w:p>
             <w:r>
-              <w:t>Guarda orientacoes de prompt e instrucoes especificas por disciplina.</w:t>
+              <w:t>Arquivo</w:t>
             </w:r>
           </w:p>
         </w:tc>
         <w:tc>
           <w:tcPr>
-            <w:tcW w:type="dxa" w:w="3216"/>
+            <w:tcW w:type="dxa" w:w="2412"/>
+          </w:tcPr>
+          <w:p>
+            <w:r>
+              <w:t>Guarda orientacoes por disciplina usadas pelo modulo de IA.</w:t>
+            </w:r>
+          </w:p>
+        </w:tc>
+        <w:tc>
+          <w:tcPr>
+            <w:tcW w:type="dxa" w:w="2412"/>
+          </w:tcPr>
+          <w:p>
+            <w:r>
+              <w:t>Referencia IA</w:t>
+            </w:r>
+          </w:p>
+        </w:tc>
+      </w:tr>
+      <w:tr>
+        <w:tc>
+          <w:tcPr>
+            <w:tcW w:type="dxa" w:w="2412"/>
+          </w:tcPr>
+          <w:p>
+            <w:r>
+              <w:t>qualidade_metodologica.py</w:t>
+            </w:r>
+          </w:p>
+        </w:tc>
+        <w:tc>
+          <w:tcPr>
+            <w:tcW w:type="dxa" w:w="2412"/>
+          </w:tcPr>
+          <w:p>
+            <w:r>
+              <w:t>Arquivo</w:t>
+            </w:r>
+          </w:p>
+        </w:tc>
+        <w:tc>
+          <w:tcPr>
+            <w:tcW w:type="dxa" w:w="2412"/>
+          </w:tcPr>
+          <w:p>
+            <w:r>
+              <w:t>Revisa metodologia, corrige ortografia, detecta contexto pedagogico, naturaliza texto e combate mojibake.</w:t>
+            </w:r>
+          </w:p>
+        </w:tc>
+        <w:tc>
+          <w:tcPr>
+            <w:tcW w:type="dxa" w:w="2412"/>
+          </w:tcPr>
+          <w:p>
+            <w:r>
+              <w:t>Controle de qualidade</w:t>
+            </w:r>
+          </w:p>
+        </w:tc>
+      </w:tr>
+      <w:tr>
+        <w:tc>
+          <w:tcPr>
+            <w:tcW w:type="dxa" w:w="2412"/>
+          </w:tcPr>
+          <w:p>
+            <w:r>
+              <w:t>redacao_leitura_metodologia.py</w:t>
+            </w:r>
+          </w:p>
+        </w:tc>
+        <w:tc>
+          <w:tcPr>
+            <w:tcW w:type="dxa" w:w="2412"/>
+          </w:tcPr>
+          <w:p>
+            <w:r>
+              <w:t>Arquivo</w:t>
+            </w:r>
+          </w:p>
+        </w:tc>
+        <w:tc>
+          <w:tcPr>
+            <w:tcW w:type="dxa" w:w="2412"/>
+          </w:tcPr>
+          <w:p>
+            <w:r>
+              <w:t>Gera a estrutura metodologica de Redacao e Leitura com etapas fixas e criterios mais autorais.</w:t>
+            </w:r>
+          </w:p>
+        </w:tc>
+        <w:tc>
+          <w:tcPr>
+            <w:tcW w:type="dxa" w:w="2412"/>
+          </w:tcPr>
+          <w:p>
+            <w:r>
+              <w:t>Especializado</w:t>
+            </w:r>
+          </w:p>
+        </w:tc>
+      </w:tr>
+      <w:tr>
+        <w:tc>
+          <w:tcPr>
+            <w:tcW w:type="dxa" w:w="2412"/>
+          </w:tcPr>
+          <w:p>
+            <w:r>
+              <w:t>referencias_metodologia.py</w:t>
+            </w:r>
+          </w:p>
+        </w:tc>
+        <w:tc>
+          <w:tcPr>
+            <w:tcW w:type="dxa" w:w="2412"/>
+          </w:tcPr>
+          <w:p>
+            <w:r>
+              <w:t>Arquivo</w:t>
+            </w:r>
+          </w:p>
+        </w:tc>
+        <w:tc>
+          <w:tcPr>
+            <w:tcW w:type="dxa" w:w="2412"/>
+          </w:tcPr>
+          <w:p>
+            <w:r>
+              <w:t>Carrega textos de referencia metodologica salvos no projeto.</w:t>
+            </w:r>
+          </w:p>
+        </w:tc>
+        <w:tc>
+          <w:tcPr>
+            <w:tcW w:type="dxa" w:w="2412"/>
           </w:tcPr>
           <w:p>
             <w:r>
@@ -674,71 +1296,7 @@
       <w:tr>
         <w:tc>
           <w:tcPr>
-            <w:tcW w:type="dxa" w:w="3216"/>
-          </w:tcPr>
-          <w:p>
-            <w:r>
-              <w:t>qualidade_metodologica.py</w:t>
-            </w:r>
-          </w:p>
-        </w:tc>
-        <w:tc>
-          <w:tcPr>
-            <w:tcW w:type="dxa" w:w="3216"/>
-          </w:tcPr>
-          <w:p>
-            <w:r>
-              <w:t>Revisa, sanitiza e melhora a qualidade pedagogica e textual da metodologia.</w:t>
-            </w:r>
-          </w:p>
-        </w:tc>
-        <w:tc>
-          <w:tcPr>
-            <w:tcW w:type="dxa" w:w="3216"/>
-          </w:tcPr>
-          <w:p>
-            <w:r>
-              <w:t>Pedagogico</w:t>
-            </w:r>
-          </w:p>
-        </w:tc>
-      </w:tr>
-      <w:tr>
-        <w:tc>
-          <w:tcPr>
-            <w:tcW w:type="dxa" w:w="3216"/>
-          </w:tcPr>
-          <w:p>
-            <w:r>
-              <w:t>referencias_metodologia.py</w:t>
-            </w:r>
-          </w:p>
-        </w:tc>
-        <w:tc>
-          <w:tcPr>
-            <w:tcW w:type="dxa" w:w="3216"/>
-          </w:tcPr>
-          <w:p>
-            <w:r>
-              <w:t>Carrega referencias metodologicas salvas em arquivos do projeto.</w:t>
-            </w:r>
-          </w:p>
-        </w:tc>
-        <w:tc>
-          <w:tcPr>
-            <w:tcW w:type="dxa" w:w="3216"/>
-          </w:tcPr>
-          <w:p>
-            <w:r>
-              <w:t>Referencia</w:t>
-            </w:r>
-          </w:p>
-        </w:tc>
-      </w:tr>
-      <w:tr>
-        <w:tc>
-          <w:tcPr>
-            <w:tcW w:type="dxa" w:w="3216"/>
+            <w:tcW w:type="dxa" w:w="2412"/>
           </w:tcPr>
           <w:p>
             <w:r>
@@ -748,21 +1306,31 @@
         </w:tc>
         <w:tc>
           <w:tcPr>
-            <w:tcW w:type="dxa" w:w="3216"/>
+            <w:tcW w:type="dxa" w:w="2412"/>
           </w:tcPr>
           <w:p>
             <w:r>
-              <w:t>Valida a qualidade minima das aulas geradas.</w:t>
+              <w:t>Arquivo</w:t>
             </w:r>
           </w:p>
         </w:tc>
         <w:tc>
           <w:tcPr>
-            <w:tcW w:type="dxa" w:w="3216"/>
+            <w:tcW w:type="dxa" w:w="2412"/>
           </w:tcPr>
           <w:p>
             <w:r>
-              <w:t>Pedagogico</w:t>
+              <w:t>Valida aulas geradas e detecta problemas como tema repetido, metodologia pobre, aprendizagem curta e campos vazios.</w:t>
+            </w:r>
+          </w:p>
+        </w:tc>
+        <w:tc>
+          <w:tcPr>
+            <w:tcW w:type="dxa" w:w="2412"/>
+          </w:tcPr>
+          <w:p>
+            <w:r>
+              <w:t>Controle de qualidade</w:t>
             </w:r>
           </w:p>
         </w:tc>
@@ -774,7 +1342,7 @@
         <w:pStyle w:val="Heading1"/>
       </w:pPr>
       <w:r>
-        <w:t>Explicacao Detalhada Arquivo por Arquivo</w:t>
+        <w:t>Explicacao Detalhada dos Itens</w:t>
       </w:r>
     </w:p>
     <w:p>
@@ -783,6 +1351,20 @@
       </w:pPr>
       <w:r>
         <w:t>__init__.py</w:t>
+      </w:r>
+    </w:p>
+    <w:p>
+      <w:pPr>
+        <w:spacing w:after="80"/>
+      </w:pPr>
+      <w:r>
+        <w:rPr>
+          <w:b/>
+        </w:rPr>
+        <w:t xml:space="preserve">Tipo: </w:t>
+      </w:r>
+      <w:r>
+        <w:t>Arquivo</w:t>
       </w:r>
     </w:p>
     <w:p>
@@ -796,7 +1378,7 @@
         <w:t xml:space="preserve">Funcao principal: </w:t>
       </w:r>
       <w:r>
-        <w:t>Marca a pasta core como pacote Python.</w:t>
+        <w:t>Marca a pasta core como pacote Python e habilita os imports internos do sistema.</w:t>
       </w:r>
     </w:p>
     <w:p>
@@ -810,7 +1392,7 @@
         <w:t xml:space="preserve">Quando entra no fluxo: </w:t>
       </w:r>
       <w:r>
-        <w:t>Permite que os outros modulos sejam importados pelo aplicativo principal e pelos testes.</w:t>
+        <w:t>Aparece em todas as execucoes, porque sem ele o aplicativo, os testes e os scripts perderiam a referencia do pacote core.</w:t>
       </w:r>
     </w:p>
     <w:p>
@@ -824,7 +1406,7 @@
         <w:t xml:space="preserve">Observacoes: </w:t>
       </w:r>
       <w:r>
-        <w:t>Hoje ele nao concentra regra de negocio; funciona mais como ponto tecnico de organizacao do pacote.</w:t>
+        <w:t>Nao concentra regra de negocio; seu papel hoje e organizacional.</w:t>
       </w:r>
     </w:p>
     <w:p>
@@ -832,7 +1414,21 @@
         <w:pStyle w:val="Heading2"/>
       </w:pPr>
       <w:r>
-        <w:t>avaliacao.py</w:t>
+        <w:t>ae_priorizado.py</w:t>
+      </w:r>
+    </w:p>
+    <w:p>
+      <w:pPr>
+        <w:spacing w:after="80"/>
+      </w:pPr>
+      <w:r>
+        <w:rPr>
+          <w:b/>
+        </w:rPr>
+        <w:t xml:space="preserve">Tipo: </w:t>
+      </w:r>
+      <w:r>
+        <w:t>Arquivo</w:t>
       </w:r>
     </w:p>
     <w:p>
@@ -846,7 +1442,7 @@
         <w:t xml:space="preserve">Funcao principal: </w:t>
       </w:r>
       <w:r>
-        <w:t>Gera os textos de acompanhamento da aprendizagem e acessibilidade para cada aula.</w:t>
+        <w:t>Aplica o modo AE priorizado para Portugues, lendo a base em assets/ae_priorizado e trocando a aprendizagem pelo AE correspondente.</w:t>
       </w:r>
     </w:p>
     <w:p>
@@ -860,7 +1456,7 @@
         <w:t xml:space="preserve">Quando entra no fluxo: </w:t>
       </w:r>
       <w:r>
-        <w:t>Entra quando o sistema precisa completar o plano com orientacoes pedagogicas coerentes com a disciplina, tema e tipo de aula.</w:t>
+        <w:t>Entra depois da extracao das aulas dos PDFs. Quando a opcao de AE esta ativa, ele identifica a aula, procura a chave do guia, substitui o texto e ainda reordena as aulas conforme a sequencia do guia.</w:t>
       </w:r>
     </w:p>
     <w:p>
@@ -874,7 +1470,7 @@
         <w:t xml:space="preserve">Observacoes: </w:t>
       </w:r>
       <w:r>
-        <w:t>Hoje atua como uma camada de roteamento para modulos mais especializados em core/lib, ajudando a manter o texto final mais contextualizado.</w:t>
+        <w:t>Hoje esta em modo de teste para Portugues do Ensino Medio no 2o bimestre, mas ja funciona como uma ponte real entre o sistema e o guia priorizado.</w:t>
       </w:r>
     </w:p>
     <w:p>
@@ -882,7 +1478,21 @@
         <w:pStyle w:val="Heading2"/>
       </w:pPr>
       <w:r>
-        <w:t>base_conhecimento.py</w:t>
+        <w:t>avaliacao.py</w:t>
+      </w:r>
+    </w:p>
+    <w:p>
+      <w:pPr>
+        <w:spacing w:after="80"/>
+      </w:pPr>
+      <w:r>
+        <w:rPr>
+          <w:b/>
+        </w:rPr>
+        <w:t xml:space="preserve">Tipo: </w:t>
+      </w:r>
+      <w:r>
+        <w:t>Arquivo</w:t>
       </w:r>
     </w:p>
     <w:p>
@@ -896,7 +1506,7 @@
         <w:t xml:space="preserve">Funcao principal: </w:t>
       </w:r>
       <w:r>
-        <w:t>Guarda padroes disciplinares, tecnicas esperadas e estruturas base de aula.</w:t>
+        <w:t>Gera frases de acompanhamento da aprendizagem e acessibilidade de forma dinamica.</w:t>
       </w:r>
     </w:p>
     <w:p>
@@ -910,7 +1520,7 @@
         <w:t xml:space="preserve">Quando entra no fluxo: </w:t>
       </w:r>
       <w:r>
-        <w:t>Serve de base para a inteligencia local interpretar a disciplina e escolher tom, comandos e organizacao metodologica.</w:t>
+        <w:t>E usado quando o sistema precisa transformar tema, aprendizagem e desenvolvimento em criterios de observacao e apoio ao estudante.</w:t>
       </w:r>
     </w:p>
     <w:p>
@@ -924,7 +1534,7 @@
         <w:t xml:space="preserve">Observacoes: </w:t>
       </w:r>
       <w:r>
-        <w:t>E um arquivo de referencia do sistema: concentra conhecimento pedagogico reutilizado em varios pontos.</w:t>
+        <w:t>Hoje convive com a camada mais modular de core/lib, funcionando como apoio e compatibilidade pedagogica.</w:t>
       </w:r>
     </w:p>
     <w:p>
@@ -932,7 +1542,21 @@
         <w:pStyle w:val="Heading2"/>
       </w:pPr>
       <w:r>
-        <w:t>calendario.py</w:t>
+        <w:t>base_conhecimento.py</w:t>
+      </w:r>
+    </w:p>
+    <w:p>
+      <w:pPr>
+        <w:spacing w:after="80"/>
+      </w:pPr>
+      <w:r>
+        <w:rPr>
+          <w:b/>
+        </w:rPr>
+        <w:t xml:space="preserve">Tipo: </w:t>
+      </w:r>
+      <w:r>
+        <w:t>Arquivo</w:t>
       </w:r>
     </w:p>
     <w:p>
@@ -946,7 +1570,7 @@
         <w:t xml:space="preserve">Funcao principal: </w:t>
       </w:r>
       <w:r>
-        <w:t>Calcula datas importantes do calendario escolar, como Pascoa, feriados nacionais e exclusao de dias sem aula.</w:t>
+        <w:t>Guarda padroes disciplinares e repertorios que ajudam a inteligencia local a montar aulas coerentes.</w:t>
       </w:r>
     </w:p>
     <w:p>
@@ -960,7 +1584,7 @@
         <w:t xml:space="preserve">Quando entra no fluxo: </w:t>
       </w:r>
       <w:r>
-        <w:t>Apoia a montagem das datas do mes antes da geracao do plano, inclusive filtrando feriados e pontos facultativos marcados pelo usuario.</w:t>
+        <w:t>E consultado por modulos que precisam saber quais tecnicas, focos e estruturas costumam combinar com cada disciplina.</w:t>
       </w:r>
     </w:p>
     <w:p>
@@ -974,7 +1598,7 @@
         <w:t xml:space="preserve">Observacoes: </w:t>
       </w:r>
       <w:r>
-        <w:t>Foi criado para reduzir erros de agenda e evitar que o plano preencha automaticamente dias em que a escola nao vai funcionar.</w:t>
+        <w:t>Serve como memoria pedagogica reutilizavel do projeto.</w:t>
       </w:r>
     </w:p>
     <w:p>
@@ -982,7 +1606,21 @@
         <w:pStyle w:val="Heading2"/>
       </w:pPr>
       <w:r>
-        <w:t>cdp.py</w:t>
+        <w:t>calendario.py</w:t>
+      </w:r>
+    </w:p>
+    <w:p>
+      <w:pPr>
+        <w:spacing w:after="80"/>
+      </w:pPr>
+      <w:r>
+        <w:rPr>
+          <w:b/>
+        </w:rPr>
+        <w:t xml:space="preserve">Tipo: </w:t>
+      </w:r>
+      <w:r>
+        <w:t>Arquivo</w:t>
       </w:r>
     </w:p>
     <w:p>
@@ -996,7 +1634,7 @@
         <w:t xml:space="preserve">Funcao principal: </w:t>
       </w:r>
       <w:r>
-        <w:t>Lê e organiza os dados do modo CDP a partir de planilhas e documentos locais.</w:t>
+        <w:t>Calcula feriados nacionais, datas sem aula, extensao do mes e filtros de agenda.</w:t>
       </w:r>
     </w:p>
     <w:p>
@@ -1010,7 +1648,7 @@
         <w:t xml:space="preserve">Quando entra no fluxo: </w:t>
       </w:r>
       <w:r>
-        <w:t>Seleciona habilidades, titulos, objetos de conhecimento e textos-base para montar planos CDP sem depender dos PDFs comuns.</w:t>
+        <w:t>E chamado na montagem das datas do plano antes do upload dos PDFs, ajudando o app a excluir feriados e pontos facultativos e a completar a ultima semana do mes quando necessario.</w:t>
       </w:r>
     </w:p>
     <w:p>
@@ -1024,7 +1662,7 @@
         <w:t xml:space="preserve">Observacoes: </w:t>
       </w:r>
       <w:r>
-        <w:t>E um dos nucleos do modo CDP. Tambem monta metodologia, acompanhamento e acessibilidade especificos para esse fluxo.</w:t>
+        <w:t>Hoje e uma das pecas mais importantes para evitar erro de contagem de aulas e preenchimento indevido em dias sem aula.</w:t>
       </w:r>
     </w:p>
     <w:p>
@@ -1032,7 +1670,21 @@
         <w:pStyle w:val="Heading2"/>
       </w:pPr>
       <w:r>
-        <w:t>cdp_em_docx.py</w:t>
+        <w:t>cdp/</w:t>
+      </w:r>
+    </w:p>
+    <w:p>
+      <w:pPr>
+        <w:spacing w:after="80"/>
+      </w:pPr>
+      <w:r>
+        <w:rPr>
+          <w:b/>
+        </w:rPr>
+        <w:t xml:space="preserve">Tipo: </w:t>
+      </w:r>
+      <w:r>
+        <w:t>Pacote</w:t>
       </w:r>
     </w:p>
     <w:p>
@@ -1046,7 +1698,7 @@
         <w:t xml:space="preserve">Funcao principal: </w:t>
       </w:r>
       <w:r>
-        <w:t>Reescreve planos CDP prontos em DOCX, especialmente no fluxo contextual de Matematica e Ensino Medio.</w:t>
+        <w:t>Concentra a implementacao mais nova do fluxo CDP, especialmente em gerador_cdp.py.</w:t>
       </w:r>
     </w:p>
     <w:p>
@@ -1060,7 +1712,7 @@
         <w:t xml:space="preserve">Quando entra no fluxo: </w:t>
       </w:r>
       <w:r>
-        <w:t>Entra quando o sistema precisa corrigir ou reformatar um documento final ja existente, em vez de gerar tudo do zero.</w:t>
+        <w:t>Atende os planos CDP contextual, Ensino Medio, Fundamental e multisseriada, montando tema, aprendizagem, metodologia, acompanhamento e acessibilidade a partir das planilhas e documentos locais.</w:t>
       </w:r>
     </w:p>
     <w:p>
@@ -1074,7 +1726,7 @@
         <w:t xml:space="preserve">Observacoes: </w:t>
       </w:r>
       <w:r>
-        <w:t>Aproveita partes do preenchimento DOCX e da logica de lote para ajustar tema, material e celulas do plano.</w:t>
+        <w:t>O __init__.py do pacote reexporta tambem o conteudo legado, mantendo compatibilidade com imports antigos.</w:t>
       </w:r>
     </w:p>
     <w:p>
@@ -1082,7 +1734,21 @@
         <w:pStyle w:val="Heading2"/>
       </w:pPr>
       <w:r>
-        <w:t>database.py</w:t>
+        <w:t>cdp_legacy.py</w:t>
+      </w:r>
+    </w:p>
+    <w:p>
+      <w:pPr>
+        <w:spacing w:after="80"/>
+      </w:pPr>
+      <w:r>
+        <w:rPr>
+          <w:b/>
+        </w:rPr>
+        <w:t xml:space="preserve">Tipo: </w:t>
+      </w:r>
+      <w:r>
+        <w:t>Arquivo</w:t>
       </w:r>
     </w:p>
     <w:p>
@@ -1096,7 +1762,7 @@
         <w:t xml:space="preserve">Funcao principal: </w:t>
       </w:r>
       <w:r>
-        <w:t>Controla o banco SQLite do sistema.</w:t>
+        <w:t>Mantem a logica legada do CDP que ainda serve de base para funcoes importadas pelo pacote core.cdp.</w:t>
       </w:r>
     </w:p>
     <w:p>
@@ -1110,7 +1776,7 @@
         <w:t xml:space="preserve">Quando entra no fluxo: </w:t>
       </w:r>
       <w:r>
-        <w:t>Salva e consulta professores, turmas, disciplinas, modelos vinculados e historico dos planos gerados.</w:t>
+        <w:t>Ainda participa do modo CDP por meio da camada de compatibilidade do pacote core/cdp.</w:t>
       </w:r>
     </w:p>
     <w:p>
@@ -1124,7 +1790,7 @@
         <w:t xml:space="preserve">Observacoes: </w:t>
       </w:r>
       <w:r>
-        <w:t>E a base administrativa do PLANOS_LUAN. Sem ele, o sistema perderia persistencia de cadastro e historico.</w:t>
+        <w:t>Mostra que o sistema esta em transicao: ja existe uma arquitetura mais nova, mas parte da base antiga continua viva.</w:t>
       </w:r>
     </w:p>
     <w:p>
@@ -1132,7 +1798,21 @@
         <w:pStyle w:val="Heading2"/>
       </w:pPr>
       <w:r>
-        <w:t>disciplinas.py</w:t>
+        <w:t>cdp_em_docx.py</w:t>
+      </w:r>
+    </w:p>
+    <w:p>
+      <w:pPr>
+        <w:spacing w:after="80"/>
+      </w:pPr>
+      <w:r>
+        <w:rPr>
+          <w:b/>
+        </w:rPr>
+        <w:t xml:space="preserve">Tipo: </w:t>
+      </w:r>
+      <w:r>
+        <w:t>Arquivo</w:t>
       </w:r>
     </w:p>
     <w:p>
@@ -1146,7 +1826,7 @@
         <w:t xml:space="preserve">Funcao principal: </w:t>
       </w:r>
       <w:r>
-        <w:t>Define a lista oficial de disciplinas, bimestres e configuracoes de modo.</w:t>
+        <w:t>Reescreve e ajusta documentos DOCX do fluxo CDP, com foco em cenarios como Matematica contextual e Ensino Medio.</w:t>
       </w:r>
     </w:p>
     <w:p>
@@ -1160,7 +1840,7 @@
         <w:t xml:space="preserve">Quando entra no fluxo: </w:t>
       </w:r>
       <w:r>
-        <w:t>Ajuda a interface e a logica interna a saber se uma disciplina usa PDF, CDP, CDP Fundamental ou outro comportamento especial.</w:t>
+        <w:t>Entra quando o plano CDP precisa ser corrigido ou reorganizado diretamente no Word, sem passar por um PDF comum.</w:t>
       </w:r>
     </w:p>
     <w:p>
@@ -1174,7 +1854,7 @@
         <w:t xml:space="preserve">Observacoes: </w:t>
       </w:r>
       <w:r>
-        <w:t>Tambem centraliza regras simples como 'esta disciplina exige PDF?' e 'esta disciplina pertence ao universo CDP?'.</w:t>
+        <w:t>E a ponte entre o motor CDP e o acabamento final no documento.</w:t>
       </w:r>
     </w:p>
     <w:p>
@@ -1182,7 +1862,21 @@
         <w:pStyle w:val="Heading2"/>
       </w:pPr>
       <w:r>
-        <w:t>helpers.py</w:t>
+        <w:t>database.py</w:t>
+      </w:r>
+    </w:p>
+    <w:p>
+      <w:pPr>
+        <w:spacing w:after="80"/>
+      </w:pPr>
+      <w:r>
+        <w:rPr>
+          <w:b/>
+        </w:rPr>
+        <w:t xml:space="preserve">Tipo: </w:t>
+      </w:r>
+      <w:r>
+        <w:t>Arquivo</w:t>
       </w:r>
     </w:p>
     <w:p>
@@ -1196,7 +1890,7 @@
         <w:t xml:space="preserve">Funcao principal: </w:t>
       </w:r>
       <w:r>
-        <w:t>Reune utilitarios pequenos usados em varias partes do sistema.</w:t>
+        <w:t>Controla o banco SQLite do sistema, incluindo professores, turmas, vinculos, template_id, componente curricular e historico dos planos.</w:t>
       </w:r>
     </w:p>
     <w:p>
@@ -1210,7 +1904,7 @@
         <w:t xml:space="preserve">Quando entra no fluxo: </w:t>
       </w:r>
       <w:r>
-        <w:t>Converte horarios para o formato do plano, transforma listas em texto e gera relatorios simples de conferencia.</w:t>
+        <w:t>E usado desde a abertura do app para carregar cadastros e volta a ser usado no final para gravar historico e recuperar arquivos gerados.</w:t>
       </w:r>
     </w:p>
     <w:p>
@@ -1224,7 +1918,7 @@
         <w:t xml:space="preserve">Observacoes: </w:t>
       </w:r>
       <w:r>
-        <w:t>Nao e um modulo de regra central, mas evita repeticao de pequenas rotinas espalhadas pelo projeto.</w:t>
+        <w:t>Hoje o banco principal usado pelo sistema fica na raiz do projeto e e manipulado por este modulo.</w:t>
       </w:r>
     </w:p>
     <w:p>
@@ -1232,7 +1926,21 @@
         <w:pStyle w:val="Heading2"/>
       </w:pPr>
       <w:r>
-        <w:t>ia.py</w:t>
+        <w:t>disciplinas.py</w:t>
+      </w:r>
+    </w:p>
+    <w:p>
+      <w:pPr>
+        <w:spacing w:after="80"/>
+      </w:pPr>
+      <w:r>
+        <w:rPr>
+          <w:b/>
+        </w:rPr>
+        <w:t xml:space="preserve">Tipo: </w:t>
+      </w:r>
+      <w:r>
+        <w:t>Arquivo</w:t>
       </w:r>
     </w:p>
     <w:p>
@@ -1246,7 +1954,7 @@
         <w:t xml:space="preserve">Funcao principal: </w:t>
       </w:r>
       <w:r>
-        <w:t>Integra o sistema com modelos de IA, como OpenAI e Gemini.</w:t>
+        <w:t>Define disciplinas, bimestres e modos de funcionamento como PDF, CDP e CDP Fundamental.</w:t>
       </w:r>
     </w:p>
     <w:p>
@@ -1260,7 +1968,7 @@
         <w:t xml:space="preserve">Quando entra no fluxo: </w:t>
       </w:r>
       <w:r>
-        <w:t>Monta o prompt, envia o texto do PDF para o provedor escolhido e normaliza a resposta em tema, aprendizagem e metodologia.</w:t>
+        <w:t>Ajuda a interface e os validadores a entenderem se a disciplina exige PDF, se usa modo contextual ou se ativa algum comportamento especial.</w:t>
       </w:r>
     </w:p>
     <w:p>
@@ -1274,7 +1982,7 @@
         <w:t xml:space="preserve">Observacoes: </w:t>
       </w:r>
       <w:r>
-        <w:t>Tambem aplica filtros de qualidade na saida da IA para evitar tema truncado, metodologia quebrada ou texto generico demais.</w:t>
+        <w:t>Funciona como catalogo central das modalidades oficiais do app.</w:t>
       </w:r>
     </w:p>
     <w:p>
@@ -1282,7 +1990,21 @@
         <w:pStyle w:val="Heading2"/>
       </w:pPr>
       <w:r>
-        <w:t>inteligencia_local.py</w:t>
+        <w:t>eja/</w:t>
+      </w:r>
+    </w:p>
+    <w:p>
+      <w:pPr>
+        <w:spacing w:after="80"/>
+      </w:pPr>
+      <w:r>
+        <w:rPr>
+          <w:b/>
+        </w:rPr>
+        <w:t xml:space="preserve">Tipo: </w:t>
+      </w:r>
+      <w:r>
+        <w:t>Pacote</w:t>
       </w:r>
     </w:p>
     <w:p>
@@ -1296,7 +2018,7 @@
         <w:t xml:space="preserve">Funcao principal: </w:t>
       </w:r>
       <w:r>
-        <w:t>Executa analise e geracao local sem depender de IA externa.</w:t>
+        <w:t>Agrupa adaptacoes para EJA, como consolidacao de blocos e tecnicas com linguagem adequada a jovens e adultos.</w:t>
       </w:r>
     </w:p>
     <w:p>
@@ -1310,7 +2032,7 @@
         <w:t xml:space="preserve">Quando entra no fluxo: </w:t>
       </w:r>
       <w:r>
-        <w:t>Classifica conteudo, extrai partes relevantes do PDF e sugere metodologia com base em heuristicas e na base de conhecimento interna.</w:t>
+        <w:t>Entra em disciplinas que suportam modalidade EJA, hoje com destaque para Biologia e Ingles.</w:t>
       </w:r>
     </w:p>
     <w:p>
@@ -1324,7 +2046,7 @@
         <w:t xml:space="preserve">Observacoes: </w:t>
       </w:r>
       <w:r>
-        <w:t>Funciona como um motor alternativo ou complementar a IA online, ajudando quando se quer reduzir dependencia externa.</w:t>
+        <w:t>Evita que a aula de EJA seja tratada como copia simplificada de uma aula regular.</w:t>
       </w:r>
     </w:p>
     <w:p>
@@ -1332,7 +2054,21 @@
         <w:pStyle w:val="Heading2"/>
       </w:pPr>
       <w:r>
-        <w:t>lote.py</w:t>
+        <w:t>helpers.py</w:t>
+      </w:r>
+    </w:p>
+    <w:p>
+      <w:pPr>
+        <w:spacing w:after="80"/>
+      </w:pPr>
+      <w:r>
+        <w:rPr>
+          <w:b/>
+        </w:rPr>
+        <w:t xml:space="preserve">Tipo: </w:t>
+      </w:r>
+      <w:r>
+        <w:t>Arquivo</w:t>
       </w:r>
     </w:p>
     <w:p>
@@ -1346,7 +2082,7 @@
         <w:t xml:space="preserve">Funcao principal: </w:t>
       </w:r>
       <w:r>
-        <w:t>E o coracao da geracao de aulas a partir dos PDFs.</w:t>
+        <w:t>Reune funcoes pequenas de formatacao e apoio, como horario_para_plano, texto_lista, relatorio simples e preservacao da ordem de envio dos arquivos.</w:t>
       </w:r>
     </w:p>
     <w:p>
@@ -1360,7 +2096,7 @@
         <w:t xml:space="preserve">Quando entra no fluxo: </w:t>
       </w:r>
       <w:r>
-        <w:t>Extrai texto dos materiais, limpa titulos, detecta perfil da disciplina, monta tema, metodologia, aprendizagem, acompanhamento e acessibilidade para cada aula.</w:t>
+        <w:t>Aparece em varias partes do sistema, principalmente na montagem de horarios, relatorios e tratamento dos PDFs enviados pelo usuario.</w:t>
       </w:r>
     </w:p>
     <w:p>
@@ -1374,7 +2110,7 @@
         <w:t xml:space="preserve">Observacoes: </w:t>
       </w:r>
       <w:r>
-        <w:t>E o maior e mais importante modulo pedagogico do projeto hoje. Reune boa parte das regras finas de interpretacao dos materiais digitais.</w:t>
+        <w:t>Embora pequeno, foi importante nas correcoes recentes da ordem dos PDFs e no polimento do fluxo.</w:t>
       </w:r>
     </w:p>
     <w:p>
@@ -1382,7 +2118,21 @@
         <w:pStyle w:val="Heading2"/>
       </w:pPr>
       <w:r>
-        <w:t>metodologia_texto.py</w:t>
+        <w:t>ia.py</w:t>
+      </w:r>
+    </w:p>
+    <w:p>
+      <w:pPr>
+        <w:spacing w:after="80"/>
+      </w:pPr>
+      <w:r>
+        <w:rPr>
+          <w:b/>
+        </w:rPr>
+        <w:t xml:space="preserve">Tipo: </w:t>
+      </w:r>
+      <w:r>
+        <w:t>Arquivo</w:t>
       </w:r>
     </w:p>
     <w:p>
@@ -1396,7 +2146,7 @@
         <w:t xml:space="preserve">Funcao principal: </w:t>
       </w:r>
       <w:r>
-        <w:t>Faz ajustes linguísticos em textos metodologicos.</w:t>
+        <w:t>Integra o sistema com OpenAI e Gemini para extrair e montar tema, aprendizagem e metodologia.</w:t>
       </w:r>
     </w:p>
     <w:p>
@@ -1410,7 +2160,7 @@
         <w:t xml:space="preserve">Quando entra no fluxo: </w:t>
       </w:r>
       <w:r>
-        <w:t>Aparece no pos-processamento para deixar a redacao mais natural e coerente, como ajuste de verbos para infinitivo.</w:t>
+        <w:t>E acionado quando o usuario escolhe usar IA. Ele prepara prompt, aplica orientacoes por disciplina, traz referencias metodologicas e normaliza a resposta estruturada.</w:t>
       </w:r>
     </w:p>
     <w:p>
@@ -1424,7 +2174,7 @@
         <w:t xml:space="preserve">Observacoes: </w:t>
       </w:r>
       <w:r>
-        <w:t>Embora pequeno, ajuda no polimento do texto final que vai para o Word.</w:t>
+        <w:t>Hoje trabalha junto com validacoes e revisoes textuais para reduzir respostas fracas ou artificiais.</w:t>
       </w:r>
     </w:p>
     <w:p>
@@ -1432,7 +2182,21 @@
         <w:pStyle w:val="Heading2"/>
       </w:pPr>
       <w:r>
-        <w:t>modelos_docx.py</w:t>
+        <w:t>inteligencia_local.py</w:t>
+      </w:r>
+    </w:p>
+    <w:p>
+      <w:pPr>
+        <w:spacing w:after="80"/>
+      </w:pPr>
+      <w:r>
+        <w:rPr>
+          <w:b/>
+        </w:rPr>
+        <w:t xml:space="preserve">Tipo: </w:t>
+      </w:r>
+      <w:r>
+        <w:t>Arquivo</w:t>
       </w:r>
     </w:p>
     <w:p>
@@ -1446,7 +2210,7 @@
         <w:t xml:space="preserve">Funcao principal: </w:t>
       </w:r>
       <w:r>
-        <w:t>Escolhe qual template DOCX central deve ser usado.</w:t>
+        <w:t>Executa heuristicas e geracao local sem depender de IA externa.</w:t>
       </w:r>
     </w:p>
     <w:p>
@@ -1460,7 +2224,7 @@
         <w:t xml:space="preserve">Quando entra no fluxo: </w:t>
       </w:r>
       <w:r>
-        <w:t>Decide entre modelos como Egle, Padre ou CDP com base na disciplina, escola, componente curricular e contexto.</w:t>
+        <w:t>Serve como alternativa ou apoio ao fluxo com IA, especialmente quando se quer trabalhar so com regras internas do sistema.</w:t>
       </w:r>
     </w:p>
     <w:p>
@@ -1474,7 +2238,7 @@
         <w:t xml:space="preserve">Observacoes: </w:t>
       </w:r>
       <w:r>
-        <w:t>Ajuda o sistema a manter padrao visual correto sem obrigar o usuario a escolher manualmente toda vez.</w:t>
+        <w:t>Continua importante como reserva de autonomia do projeto.</w:t>
       </w:r>
     </w:p>
     <w:p>
@@ -1482,7 +2246,21 @@
         <w:pStyle w:val="Heading2"/>
       </w:pPr>
       <w:r>
-        <w:t>professores_planos.py</w:t>
+        <w:t>lib/</w:t>
+      </w:r>
+    </w:p>
+    <w:p>
+      <w:pPr>
+        <w:spacing w:after="80"/>
+      </w:pPr>
+      <w:r>
+        <w:rPr>
+          <w:b/>
+        </w:rPr>
+        <w:t xml:space="preserve">Tipo: </w:t>
+      </w:r>
+      <w:r>
+        <w:t>Pacote</w:t>
       </w:r>
     </w:p>
     <w:p>
@@ -1496,7 +2274,7 @@
         <w:t xml:space="preserve">Funcao principal: </w:t>
       </w:r>
       <w:r>
-        <w:t>Lê, diagnostica, cria e atualiza planos-modelo dentro das pastas dos professores.</w:t>
+        <w:t>Agrupa extratores, classificadores, perfis de acompanhamento e acessibilidade, geradores de colunas pedagogicas, progressao, tecnicas e modalidades.</w:t>
       </w:r>
     </w:p>
     <w:p>
@@ -1510,7 +2288,7 @@
         <w:t xml:space="preserve">Quando entra no fluxo: </w:t>
       </w:r>
       <w:r>
-        <w:t>Extrai cabecalho, datas e horarios dos DOCX existentes e cruza isso com o cadastro salvo no banco.</w:t>
+        <w:t>E a camada modular mais reaproveitada pelo lote.py, pela IA e pelos adaptadores pedagogicos.</w:t>
       </w:r>
     </w:p>
     <w:p>
@@ -1524,7 +2302,7 @@
         <w:t xml:space="preserve">Observacoes: </w:t>
       </w:r>
       <w:r>
-        <w:t>E a ponte entre os arquivos reais dos professores e a estrutura interna do sistema. Tambem ajuda na padronizacao dos modelos.</w:t>
+        <w:t>Hoje a inteligencia pedagogica do sistema esta muito mais espalhada aqui do que estava na versao mais antiga da documentacao.</w:t>
       </w:r>
     </w:p>
     <w:p>
@@ -1532,7 +2310,21 @@
         <w:pStyle w:val="Heading2"/>
       </w:pPr>
       <w:r>
-        <w:t>projeto_vida_escopo.py</w:t>
+        <w:t>lote.py</w:t>
+      </w:r>
+    </w:p>
+    <w:p>
+      <w:pPr>
+        <w:spacing w:after="80"/>
+      </w:pPr>
+      <w:r>
+        <w:rPr>
+          <w:b/>
+        </w:rPr>
+        <w:t xml:space="preserve">Tipo: </w:t>
+      </w:r>
+      <w:r>
+        <w:t>Arquivo</w:t>
       </w:r>
     </w:p>
     <w:p>
@@ -1546,7 +2338,7 @@
         <w:t xml:space="preserve">Funcao principal: </w:t>
       </w:r>
       <w:r>
-        <w:t>Lê e interpreta o escopo de Projeto de Vida.</w:t>
+        <w:t>Transforma PDFs comuns em aulas estruturadas com tema, material, aprendizagem, metodologia, acompanhamento e acessibilidade.</w:t>
       </w:r>
     </w:p>
     <w:p>
@@ -1560,7 +2352,7 @@
         <w:t xml:space="preserve">Quando entra no fluxo: </w:t>
       </w:r>
       <w:r>
-        <w:t>Busca o item correto por turma, bimestre e numero da aula para enriquecer tema e aprendizagem desse componente.</w:t>
+        <w:t>E o motor principal do fluxo PDF: extrai texto, identifica titulo e numero da aula, classifica o perfil e monta as colunas pedagogicas.</w:t>
       </w:r>
     </w:p>
     <w:p>
@@ -1574,7 +2366,7 @@
         <w:t xml:space="preserve">Observacoes: </w:t>
       </w:r>
       <w:r>
-        <w:t>Existe porque Projeto de Vida tem uma logica propria e nao pode ser tratado como uma disciplina comum em todos os casos.</w:t>
+        <w:t>Continua sendo o coracao da geracao das aulas comuns, mesmo com o crescimento dos subpacotes auxiliares.</w:t>
       </w:r>
     </w:p>
     <w:p>
@@ -1582,7 +2374,21 @@
         <w:pStyle w:val="Heading2"/>
       </w:pPr>
       <w:r>
-        <w:t>prompts_por_disciplina.py</w:t>
+        <w:t>metodologia_texto.py</w:t>
+      </w:r>
+    </w:p>
+    <w:p>
+      <w:pPr>
+        <w:spacing w:after="80"/>
+      </w:pPr>
+      <w:r>
+        <w:rPr>
+          <w:b/>
+        </w:rPr>
+        <w:t xml:space="preserve">Tipo: </w:t>
+      </w:r>
+      <w:r>
+        <w:t>Arquivo</w:t>
       </w:r>
     </w:p>
     <w:p>
@@ -1596,7 +2402,7 @@
         <w:t xml:space="preserve">Funcao principal: </w:t>
       </w:r>
       <w:r>
-        <w:t>Guarda orientacoes de prompt e instrucoes especificas por disciplina.</w:t>
+        <w:t>Faz ajustes linguisticos finos na metodologia, como regularizacao de verbos e polimento de frase.</w:t>
       </w:r>
     </w:p>
     <w:p>
@@ -1610,7 +2416,7 @@
         <w:t xml:space="preserve">Quando entra no fluxo: </w:t>
       </w:r>
       <w:r>
-        <w:t>Alimenta o modulo de IA com direcionamentos diferentes para Portugues, Matematica, Projeto de Vida e outras areas.</w:t>
+        <w:t>Entra no pos-processamento do texto antes de a aula seguir para validacao e DOCX.</w:t>
       </w:r>
     </w:p>
     <w:p>
@@ -1624,7 +2430,7 @@
         <w:t xml:space="preserve">Observacoes: </w:t>
       </w:r>
       <w:r>
-        <w:t>Serve para personalizar o comportamento da IA sem misturar essas regras diretamente no restante do codigo.</w:t>
+        <w:t>Ajuda a evitar metodologia truncada ou com tom mecanico.</w:t>
       </w:r>
     </w:p>
     <w:p>
@@ -1632,7 +2438,21 @@
         <w:pStyle w:val="Heading2"/>
       </w:pPr>
       <w:r>
-        <w:t>qualidade_metodologica.py</w:t>
+        <w:t>modelos_docx.py</w:t>
+      </w:r>
+    </w:p>
+    <w:p>
+      <w:pPr>
+        <w:spacing w:after="80"/>
+      </w:pPr>
+      <w:r>
+        <w:rPr>
+          <w:b/>
+        </w:rPr>
+        <w:t xml:space="preserve">Tipo: </w:t>
+      </w:r>
+      <w:r>
+        <w:t>Arquivo</w:t>
       </w:r>
     </w:p>
     <w:p>
@@ -1646,7 +2466,7 @@
         <w:t xml:space="preserve">Funcao principal: </w:t>
       </w:r>
       <w:r>
-        <w:t>Revisa, sanitiza e melhora a qualidade pedagogica e textual da metodologia.</w:t>
+        <w:t>Resolve o template central correto por contexto, template_id, escola, disciplina e componente curricular.</w:t>
       </w:r>
     </w:p>
     <w:p>
@@ -1660,7 +2480,7 @@
         <w:t xml:space="preserve">Quando entra no fluxo: </w:t>
       </w:r>
       <w:r>
-        <w:t>Corrige problemas de linguagem, identifica contexto metodologico, extrai conceito central e ajuda a naturalizar o texto final.</w:t>
+        <w:t>E usado quando o sistema precisa escolher entre MODELOEGLE, MODELOPADRE e MODELOCDP sem depender apenas do arquivo legado do professor.</w:t>
       </w:r>
     </w:p>
     <w:p>
@@ -1674,7 +2494,7 @@
         <w:t xml:space="preserve">Observacoes: </w:t>
       </w:r>
       <w:r>
-        <w:t>Funciona como uma camada de controle de qualidade antes da aula seguir para o documento final.</w:t>
+        <w:t>Foi uma evolucao importante para deixar o fluxo mais previsivel.</w:t>
       </w:r>
     </w:p>
     <w:p>
@@ -1682,7 +2502,21 @@
         <w:pStyle w:val="Heading2"/>
       </w:pPr>
       <w:r>
-        <w:t>referencias_metodologia.py</w:t>
+        <w:t>orientacao_estudos_metodologia.py</w:t>
+      </w:r>
+    </w:p>
+    <w:p>
+      <w:pPr>
+        <w:spacing w:after="80"/>
+      </w:pPr>
+      <w:r>
+        <w:rPr>
+          <w:b/>
+        </w:rPr>
+        <w:t xml:space="preserve">Tipo: </w:t>
+      </w:r>
+      <w:r>
+        <w:t>Arquivo</w:t>
       </w:r>
     </w:p>
     <w:p>
@@ -1696,7 +2530,7 @@
         <w:t xml:space="preserve">Funcao principal: </w:t>
       </w:r>
       <w:r>
-        <w:t>Carrega referencias metodologicas salvas em arquivos do projeto.</w:t>
+        <w:t>Gera metodologia altamente especifica para Orientacao de Estudos, com perfis por missao, trilha ou jornada.</w:t>
       </w:r>
     </w:p>
     <w:p>
@@ -1710,7 +2544,7 @@
         <w:t xml:space="preserve">Quando entra no fluxo: </w:t>
       </w:r>
       <w:r>
-        <w:t>Seleciona materiais de apoio por disciplina e turma para reforcar a geracao das metodologias, especialmente no uso da IA.</w:t>
+        <w:t>E usado quando a disciplina exige uma abordagem propria, baseada em objetos, focos e referencias textuais dessa area.</w:t>
       </w:r>
     </w:p>
     <w:p>
@@ -1724,7 +2558,7 @@
         <w:t xml:space="preserve">Observacoes: </w:t>
       </w:r>
       <w:r>
-        <w:t>E uma fonte de memoria pedagogica do sistema, trazendo consistencia entre planos da mesma area.</w:t>
+        <w:t>Hoje e um dos modulos especializados mais extensos do projeto.</w:t>
       </w:r>
     </w:p>
     <w:p>
@@ -1732,7 +2566,21 @@
         <w:pStyle w:val="Heading2"/>
       </w:pPr>
       <w:r>
-        <w:t>validador_plano.py</w:t>
+        <w:t>orientacao_estudos_objetivos.py</w:t>
+      </w:r>
+    </w:p>
+    <w:p>
+      <w:pPr>
+        <w:spacing w:after="80"/>
+      </w:pPr>
+      <w:r>
+        <w:rPr>
+          <w:b/>
+        </w:rPr>
+        <w:t xml:space="preserve">Tipo: </w:t>
+      </w:r>
+      <w:r>
+        <w:t>Arquivo</w:t>
       </w:r>
     </w:p>
     <w:p>
@@ -1746,7 +2594,7 @@
         <w:t xml:space="preserve">Funcao principal: </w:t>
       </w:r>
       <w:r>
-        <w:t>Valida a qualidade minima das aulas geradas.</w:t>
+        <w:t>Centraliza objetivos e apoio textual para o fluxo de Orientacao de Estudos.</w:t>
       </w:r>
     </w:p>
     <w:p>
@@ -1760,7 +2608,7 @@
         <w:t xml:space="preserve">Quando entra no fluxo: </w:t>
       </w:r>
       <w:r>
-        <w:t>Confere se ha tema, metodologia suficiente, aprendizagem, acompanhamento e acessibilidade antes de considerar o plano aceitavel.</w:t>
+        <w:t>Complementa a montagem da aula nessa disciplina, ajudando na coerencia entre titulo, foco e expectativa de aprendizagem.</w:t>
       </w:r>
     </w:p>
     <w:p>
@@ -1774,79 +2622,587 @@
         <w:t xml:space="preserve">Observacoes: </w:t>
       </w:r>
       <w:r>
-        <w:t>Ajuda a bloquear saidas fracas ou incompletas, evitando que um plano ruim avance sem revisao.</w:t>
+        <w:t>Mantem a disciplina menos dependente de regras genericas.</w:t>
+      </w:r>
+    </w:p>
+    <w:p>
+      <w:pPr>
+        <w:pStyle w:val="Heading2"/>
+      </w:pPr>
+      <w:r>
+        <w:t>planos_luan.db</w:t>
+      </w:r>
+    </w:p>
+    <w:p>
+      <w:pPr>
+        <w:spacing w:after="80"/>
+      </w:pPr>
+      <w:r>
+        <w:rPr>
+          <w:b/>
+        </w:rPr>
+        <w:t xml:space="preserve">Tipo: </w:t>
+      </w:r>
+      <w:r>
+        <w:t>Arquivo tecnico</w:t>
+      </w:r>
+    </w:p>
+    <w:p>
+      <w:pPr>
+        <w:spacing w:after="80"/>
+      </w:pPr>
+      <w:r>
+        <w:rPr>
+          <w:b/>
+        </w:rPr>
+        <w:t xml:space="preserve">Funcao principal: </w:t>
+      </w:r>
+      <w:r>
+        <w:t>Arquivo presente dentro da pasta core, mas que nao representa hoje o banco principal de operacao do sistema.</w:t>
+      </w:r>
+    </w:p>
+    <w:p>
+      <w:pPr>
+        <w:spacing w:after="80"/>
+      </w:pPr>
+      <w:r>
+        <w:rPr>
+          <w:b/>
+        </w:rPr>
+        <w:t xml:space="preserve">Quando entra no fluxo: </w:t>
+      </w:r>
+      <w:r>
+        <w:t>Nao deve ser lido como modulo de negocio. O fluxo principal usa o banco gerenciado por core/database.py na raiz do projeto.</w:t>
+      </w:r>
+    </w:p>
+    <w:p>
+      <w:pPr>
+        <w:spacing w:after="80"/>
+      </w:pPr>
+      <w:r>
+        <w:rPr>
+          <w:b/>
+        </w:rPr>
+        <w:t xml:space="preserve">Observacoes: </w:t>
+      </w:r>
+      <w:r>
+        <w:t>Vale documentar sua existencia para evitar confusao futuras.</w:t>
+      </w:r>
+    </w:p>
+    <w:p>
+      <w:pPr>
+        <w:pStyle w:val="Heading2"/>
+      </w:pPr>
+      <w:r>
+        <w:t>professores_planos.py</w:t>
+      </w:r>
+    </w:p>
+    <w:p>
+      <w:pPr>
+        <w:spacing w:after="80"/>
+      </w:pPr>
+      <w:r>
+        <w:rPr>
+          <w:b/>
+        </w:rPr>
+        <w:t xml:space="preserve">Tipo: </w:t>
+      </w:r>
+      <w:r>
+        <w:t>Arquivo</w:t>
+      </w:r>
+    </w:p>
+    <w:p>
+      <w:pPr>
+        <w:spacing w:after="80"/>
+      </w:pPr>
+      <w:r>
+        <w:rPr>
+          <w:b/>
+        </w:rPr>
+        <w:t xml:space="preserve">Funcao principal: </w:t>
+      </w:r>
+      <w:r>
+        <w:t>Le, diagnostica, cria e atualiza modelos DOCX encontrados nas pastas dos professores.</w:t>
+      </w:r>
+    </w:p>
+    <w:p>
+      <w:pPr>
+        <w:spacing w:after="80"/>
+      </w:pPr>
+      <w:r>
+        <w:rPr>
+          <w:b/>
+        </w:rPr>
+        <w:t xml:space="preserve">Quando entra no fluxo: </w:t>
+      </w:r>
+      <w:r>
+        <w:t>Extrai cabecalho, datas, horarios e grade semanal dos planos-modelo e ajuda a converter isso em cadastro reutilizavel no app.</w:t>
+      </w:r>
+    </w:p>
+    <w:p>
+      <w:pPr>
+        <w:spacing w:after="80"/>
+      </w:pPr>
+      <w:r>
+        <w:rPr>
+          <w:b/>
+        </w:rPr>
+        <w:t xml:space="preserve">Observacoes: </w:t>
+      </w:r>
+      <w:r>
+        <w:t>E a ponte entre os arquivos reais do trabalho escolar e a base interna do sistema.</w:t>
+      </w:r>
+    </w:p>
+    <w:p>
+      <w:pPr>
+        <w:pStyle w:val="Heading2"/>
+      </w:pPr>
+      <w:r>
+        <w:t>projeto_vida_escopo.py</w:t>
+      </w:r>
+    </w:p>
+    <w:p>
+      <w:pPr>
+        <w:spacing w:after="80"/>
+      </w:pPr>
+      <w:r>
+        <w:rPr>
+          <w:b/>
+        </w:rPr>
+        <w:t xml:space="preserve">Tipo: </w:t>
+      </w:r>
+      <w:r>
+        <w:t>Arquivo</w:t>
+      </w:r>
+    </w:p>
+    <w:p>
+      <w:pPr>
+        <w:spacing w:after="80"/>
+      </w:pPr>
+      <w:r>
+        <w:rPr>
+          <w:b/>
+        </w:rPr>
+        <w:t xml:space="preserve">Funcao principal: </w:t>
+      </w:r>
+      <w:r>
+        <w:t>Le e interpreta o escopo-sequencia de Projeto de Vida para localizar o item certo por turma, bimestre e aula.</w:t>
+      </w:r>
+    </w:p>
+    <w:p>
+      <w:pPr>
+        <w:spacing w:after="80"/>
+      </w:pPr>
+      <w:r>
+        <w:rPr>
+          <w:b/>
+        </w:rPr>
+        <w:t xml:space="preserve">Quando entra no fluxo: </w:t>
+      </w:r>
+      <w:r>
+        <w:t>Entra quando Projeto de Vida precisa de um tratamento proprio, sem cair no comportamento generico das outras disciplinas.</w:t>
+      </w:r>
+    </w:p>
+    <w:p>
+      <w:pPr>
+        <w:spacing w:after="80"/>
+      </w:pPr>
+      <w:r>
+        <w:rPr>
+          <w:b/>
+        </w:rPr>
+        <w:t xml:space="preserve">Observacoes: </w:t>
+      </w:r>
+      <w:r>
+        <w:t>Ajuda o sistema a respeitar a logica pedagogica especifica desse componente.</w:t>
+      </w:r>
+    </w:p>
+    <w:p>
+      <w:pPr>
+        <w:pStyle w:val="Heading2"/>
+      </w:pPr>
+      <w:r>
+        <w:t>prompts_por_disciplina.py</w:t>
+      </w:r>
+    </w:p>
+    <w:p>
+      <w:pPr>
+        <w:spacing w:after="80"/>
+      </w:pPr>
+      <w:r>
+        <w:rPr>
+          <w:b/>
+        </w:rPr>
+        <w:t xml:space="preserve">Tipo: </w:t>
+      </w:r>
+      <w:r>
+        <w:t>Arquivo</w:t>
+      </w:r>
+    </w:p>
+    <w:p>
+      <w:pPr>
+        <w:spacing w:after="80"/>
+      </w:pPr>
+      <w:r>
+        <w:rPr>
+          <w:b/>
+        </w:rPr>
+        <w:t xml:space="preserve">Funcao principal: </w:t>
+      </w:r>
+      <w:r>
+        <w:t>Guarda orientacoes por disciplina usadas pelo modulo de IA.</w:t>
+      </w:r>
+    </w:p>
+    <w:p>
+      <w:pPr>
+        <w:spacing w:after="80"/>
+      </w:pPr>
+      <w:r>
+        <w:rPr>
+          <w:b/>
+        </w:rPr>
+        <w:t xml:space="preserve">Quando entra no fluxo: </w:t>
+      </w:r>
+      <w:r>
+        <w:t>Ajuda a montar instrucoes diferentes para Portugues, Matematica, Projeto de Vida, Redacao e outras areas.</w:t>
+      </w:r>
+    </w:p>
+    <w:p>
+      <w:pPr>
+        <w:spacing w:after="80"/>
+      </w:pPr>
+      <w:r>
+        <w:rPr>
+          <w:b/>
+        </w:rPr>
+        <w:t xml:space="preserve">Observacoes: </w:t>
+      </w:r>
+      <w:r>
+        <w:t>Evita que o comportamento da IA fique uniforme demais entre disciplinas muito diferentes.</w:t>
+      </w:r>
+    </w:p>
+    <w:p>
+      <w:pPr>
+        <w:pStyle w:val="Heading2"/>
+      </w:pPr>
+      <w:r>
+        <w:t>qualidade_metodologica.py</w:t>
+      </w:r>
+    </w:p>
+    <w:p>
+      <w:pPr>
+        <w:spacing w:after="80"/>
+      </w:pPr>
+      <w:r>
+        <w:rPr>
+          <w:b/>
+        </w:rPr>
+        <w:t xml:space="preserve">Tipo: </w:t>
+      </w:r>
+      <w:r>
+        <w:t>Arquivo</w:t>
+      </w:r>
+    </w:p>
+    <w:p>
+      <w:pPr>
+        <w:spacing w:after="80"/>
+      </w:pPr>
+      <w:r>
+        <w:rPr>
+          <w:b/>
+        </w:rPr>
+        <w:t xml:space="preserve">Funcao principal: </w:t>
+      </w:r>
+      <w:r>
+        <w:t>Revisa metodologia, corrige ortografia, detecta contexto pedagogico, naturaliza texto e combate mojibake.</w:t>
+      </w:r>
+    </w:p>
+    <w:p>
+      <w:pPr>
+        <w:spacing w:after="80"/>
+      </w:pPr>
+      <w:r>
+        <w:rPr>
+          <w:b/>
+        </w:rPr>
+        <w:t xml:space="preserve">Quando entra no fluxo: </w:t>
+      </w:r>
+      <w:r>
+        <w:t>Entra entre a geracao da aula e a validacao final, funcionando como camada de saneamento textual e pedagogico.</w:t>
+      </w:r>
+    </w:p>
+    <w:p>
+      <w:pPr>
+        <w:spacing w:after="80"/>
+      </w:pPr>
+      <w:r>
+        <w:rPr>
+          <w:b/>
+        </w:rPr>
+        <w:t xml:space="preserve">Observacoes: </w:t>
+      </w:r>
+      <w:r>
+        <w:t>E um dos modulos que mais contribuem para o plano final ficar profissional.</w:t>
+      </w:r>
+    </w:p>
+    <w:p>
+      <w:pPr>
+        <w:pStyle w:val="Heading2"/>
+      </w:pPr>
+      <w:r>
+        <w:t>redacao_leitura_metodologia.py</w:t>
+      </w:r>
+    </w:p>
+    <w:p>
+      <w:pPr>
+        <w:spacing w:after="80"/>
+      </w:pPr>
+      <w:r>
+        <w:rPr>
+          <w:b/>
+        </w:rPr>
+        <w:t xml:space="preserve">Tipo: </w:t>
+      </w:r>
+      <w:r>
+        <w:t>Arquivo</w:t>
+      </w:r>
+    </w:p>
+    <w:p>
+      <w:pPr>
+        <w:spacing w:after="80"/>
+      </w:pPr>
+      <w:r>
+        <w:rPr>
+          <w:b/>
+        </w:rPr>
+        <w:t xml:space="preserve">Funcao principal: </w:t>
+      </w:r>
+      <w:r>
+        <w:t>Gera a estrutura metodologica de Redacao e Leitura com etapas fixas e criterios mais autorais.</w:t>
+      </w:r>
+    </w:p>
+    <w:p>
+      <w:pPr>
+        <w:spacing w:after="80"/>
+      </w:pPr>
+      <w:r>
+        <w:rPr>
+          <w:b/>
+        </w:rPr>
+        <w:t xml:space="preserve">Quando entra no fluxo: </w:t>
+      </w:r>
+      <w:r>
+        <w:t>Atua quando o sistema identifica perfis como leitura literaria, planejamento de producao, devolutiva e producao final.</w:t>
+      </w:r>
+    </w:p>
+    <w:p>
+      <w:pPr>
+        <w:spacing w:after="80"/>
+      </w:pPr>
+      <w:r>
+        <w:rPr>
+          <w:b/>
+        </w:rPr>
+        <w:t xml:space="preserve">Observacoes: </w:t>
+      </w:r>
+      <w:r>
+        <w:t>Foi uma ampliacao importante do repertorio especializado do projeto.</w:t>
+      </w:r>
+    </w:p>
+    <w:p>
+      <w:pPr>
+        <w:pStyle w:val="Heading2"/>
+      </w:pPr>
+      <w:r>
+        <w:t>referencias_metodologia.py</w:t>
+      </w:r>
+    </w:p>
+    <w:p>
+      <w:pPr>
+        <w:spacing w:after="80"/>
+      </w:pPr>
+      <w:r>
+        <w:rPr>
+          <w:b/>
+        </w:rPr>
+        <w:t xml:space="preserve">Tipo: </w:t>
+      </w:r>
+      <w:r>
+        <w:t>Arquivo</w:t>
+      </w:r>
+    </w:p>
+    <w:p>
+      <w:pPr>
+        <w:spacing w:after="80"/>
+      </w:pPr>
+      <w:r>
+        <w:rPr>
+          <w:b/>
+        </w:rPr>
+        <w:t xml:space="preserve">Funcao principal: </w:t>
+      </w:r>
+      <w:r>
+        <w:t>Carrega textos de referencia metodologica salvos no projeto.</w:t>
+      </w:r>
+    </w:p>
+    <w:p>
+      <w:pPr>
+        <w:spacing w:after="80"/>
+      </w:pPr>
+      <w:r>
+        <w:rPr>
+          <w:b/>
+        </w:rPr>
+        <w:t xml:space="preserve">Quando entra no fluxo: </w:t>
+      </w:r>
+      <w:r>
+        <w:t>Entrega material de apoio por disciplina e turma para a IA e para modulos que precisam reforcar o tom pedagogico esperado.</w:t>
+      </w:r>
+    </w:p>
+    <w:p>
+      <w:pPr>
+        <w:spacing w:after="80"/>
+      </w:pPr>
+      <w:r>
+        <w:rPr>
+          <w:b/>
+        </w:rPr>
+        <w:t xml:space="preserve">Observacoes: </w:t>
+      </w:r>
+      <w:r>
+        <w:t>Funciona como uma biblioteca interna de memoria metodologica.</w:t>
+      </w:r>
+    </w:p>
+    <w:p>
+      <w:pPr>
+        <w:pStyle w:val="Heading2"/>
+      </w:pPr>
+      <w:r>
+        <w:t>validador_plano.py</w:t>
+      </w:r>
+    </w:p>
+    <w:p>
+      <w:pPr>
+        <w:spacing w:after="80"/>
+      </w:pPr>
+      <w:r>
+        <w:rPr>
+          <w:b/>
+        </w:rPr>
+        <w:t xml:space="preserve">Tipo: </w:t>
+      </w:r>
+      <w:r>
+        <w:t>Arquivo</w:t>
+      </w:r>
+    </w:p>
+    <w:p>
+      <w:pPr>
+        <w:spacing w:after="80"/>
+      </w:pPr>
+      <w:r>
+        <w:rPr>
+          <w:b/>
+        </w:rPr>
+        <w:t xml:space="preserve">Funcao principal: </w:t>
+      </w:r>
+      <w:r>
+        <w:t>Valida aulas geradas e detecta problemas como tema repetido, metodologia pobre, aprendizagem curta e campos vazios.</w:t>
+      </w:r>
+    </w:p>
+    <w:p>
+      <w:pPr>
+        <w:spacing w:after="80"/>
+      </w:pPr>
+      <w:r>
+        <w:rPr>
+          <w:b/>
+        </w:rPr>
+        <w:t xml:space="preserve">Quando entra no fluxo: </w:t>
+      </w:r>
+      <w:r>
+        <w:t>E uma das ultimas barreiras antes da revisao do usuario e da geracao do DOCX.</w:t>
+      </w:r>
+    </w:p>
+    <w:p>
+      <w:pPr>
+        <w:spacing w:after="80"/>
+      </w:pPr>
+      <w:r>
+        <w:rPr>
+          <w:b/>
+        </w:rPr>
+        <w:t xml:space="preserve">Observacoes: </w:t>
+      </w:r>
+      <w:r>
+        <w:t>Hoje tambem protege o sistema de contaminacao semantica entre disciplinas.</w:t>
+      </w:r>
+    </w:p>
+    <w:p>
+      <w:pPr>
+        <w:pStyle w:val="Heading1"/>
+      </w:pPr>
+      <w:r>
+        <w:t>Leitura Final da Arquitetura Atual</w:t>
+      </w:r>
+    </w:p>
+    <w:p>
+      <w:pPr>
+        <w:pStyle w:val="ListBullet"/>
+        <w:spacing w:after="80"/>
+      </w:pPr>
+      <w:r>
+        <w:t>Se a pergunta for "onde nascem as aulas comuns a partir dos PDFs?", a resposta principal continua sendo lote.py, apoiado hoje por uma base modular mais forte em core/lib.</w:t>
+      </w:r>
+    </w:p>
+    <w:p>
+      <w:pPr>
+        <w:pStyle w:val="ListBullet"/>
+        <w:spacing w:after="80"/>
+      </w:pPr>
+      <w:r>
+        <w:t>Se a pergunta for "onde esta o cadastro e o historico?", a resposta continua sendo core/database.py, mas com mais responsabilidade do que antes por causa de template_id e componente curricular.</w:t>
+      </w:r>
+    </w:p>
+    <w:p>
+      <w:pPr>
+        <w:pStyle w:val="ListBullet"/>
+        <w:spacing w:after="80"/>
+      </w:pPr>
+      <w:r>
+        <w:t>Se a pergunta for "onde o sistema entende o CDP?", a resposta agora precisa citar dois niveis: o pacote core/cdp como camada atual e cdp_legacy.py como camada de compatibilidade ainda em uso.</w:t>
+      </w:r>
+    </w:p>
+    <w:p>
+      <w:pPr>
+        <w:pStyle w:val="ListBullet"/>
+        <w:spacing w:after="80"/>
+      </w:pPr>
+      <w:r>
+        <w:t>Se a pergunta for "onde entram as novidades do guia priorizado?", a resposta e ae_priorizado.py junto da base em assets/ae_priorizado.</w:t>
+      </w:r>
+    </w:p>
+    <w:p>
+      <w:pPr>
+        <w:pStyle w:val="ListBullet"/>
+        <w:spacing w:after="80"/>
+      </w:pPr>
+      <w:r>
+        <w:t>Se a pergunta for "onde o texto final e saneado?", os destaques continuam sendo qualidade_metodologica.py, metodologia_texto.py e validador_plano.py.</w:t>
       </w:r>
     </w:p>
     <w:p/>
     <w:p>
       <w:pPr>
-        <w:pStyle w:val="Heading1"/>
+        <w:spacing w:after="80"/>
       </w:pPr>
       <w:r>
-        <w:t>Leitura Final da Arquitetura</w:t>
+        <w:rPr>
+          <w:b/>
+        </w:rPr>
+        <w:t xml:space="preserve">Observacao importante: </w:t>
       </w:r>
-    </w:p>
-    <w:p>
-      <w:pPr>
-        <w:pStyle w:val="ListBullet"/>
-      </w:pPr>
       <w:r>
-        <w:t>Se a pergunta for 'onde o plano realmente nasce?', a resposta principal hoje e lote.py.</w:t>
-      </w:r>
-    </w:p>
-    <w:p>
-      <w:pPr>
-        <w:pStyle w:val="ListBullet"/>
-      </w:pPr>
-      <w:r>
-        <w:t>Se a pergunta for 'onde ficam cadastros, vinculos e historico?', a resposta principal e database.py.</w:t>
-      </w:r>
-    </w:p>
-    <w:p>
-      <w:pPr>
-        <w:pStyle w:val="ListBullet"/>
-      </w:pPr>
-      <w:r>
-        <w:t>Se a pergunta for 'onde o sistema entende o modo CDP?', a resposta principal e cdp.py.</w:t>
-      </w:r>
-    </w:p>
-    <w:p>
-      <w:pPr>
-        <w:pStyle w:val="ListBullet"/>
-      </w:pPr>
-      <w:r>
-        <w:t>Se a pergunta for 'onde a IA e preparada e revisada?', os destaques sao ia.py, prompts_por_disciplina.py e qualidade_metodologica.py.</w:t>
-      </w:r>
-    </w:p>
-    <w:p>
-      <w:pPr>
-        <w:pStyle w:val="ListBullet"/>
-      </w:pPr>
-      <w:r>
-        <w:t>Se a pergunta for 'onde os modelos DOCX dos professores conversam com o sistema?', o ponto-chave e professores_planos.py.</w:t>
-      </w:r>
-    </w:p>
-    <w:p>
-      <w:pPr>
-        <w:sectPr>
-          <w:pgSz w:w="12240" w:h="15840"/>
-          <w:pgMar w:top="1152" w:right="1296" w:bottom="1080" w:left="1296" w:header="720" w:footer="720" w:gutter="0"/>
-          <w:cols w:space="720"/>
-          <w:docGrid w:linePitch="360"/>
-        </w:sectPr>
-      </w:pPr>
-    </w:p>
-    <w:p>
-      <w:pPr>
-        <w:pStyle w:val="Heading1"/>
-      </w:pPr>
-      <w:r>
-        <w:t>Observacao Importante</w:t>
-      </w:r>
-    </w:p>
-    <w:p>
-      <w:r>
-        <w:t>Esta documentacao descreve a estrutura atual observada no codigo no momento da analise. Se algum arquivo ganhar novas responsabilidades no futuro, o texto deve ser revisado para continuar fiel ao sistema.</w:t>
+        <w:t>Esta documentacao descreve o estado atual observado em 05/06/2026. Como o projeto ainda tem camadas novas e legadas convivendo, o texto deve ser revisado sempre que a estrutura de core mudar de forma relevante.</w:t>
       </w:r>
     </w:p>
     <w:sectPr>

</xml_diff>

<commit_message>
refact: melhoria da qualidade pedagogica, padronizacao de nomes de PDFs e resolucao de bugs de LP Ensino Medio
</commit_message>
<xml_diff>
--- a/DOCUMENTACAO_ESTRUTURA_CORE_PLANOS_LUAN.docx
+++ b/DOCUMENTACAO_ESTRUTURA_CORE_PLANOS_LUAN.docx
@@ -8,36 +8,20 @@
         <w:jc w:val="center"/>
       </w:pPr>
       <w:r>
+        <w:rPr>
+          <w:b/>
+        </w:rPr>
         <w:t>Estrutura Atual da Pasta core do PLANOS_LUAN</w:t>
       </w:r>
     </w:p>
     <w:p>
-      <w:pPr>
-        <w:spacing w:after="280"/>
-        <w:jc w:val="center"/>
-      </w:pPr>
       <w:r>
-        <w:rPr>
-          <w:i/>
-        </w:rPr>
-        <w:t>Documento atualizado em 05/06/2026, em linguagem simples, com foco na estrutura real do codigo.</w:t>
+        <w:t>Documento atualizado automaticamente em 17/06/2026 às 00:42, em linguagem simples, com foco na estrutura real observada no codigo.</w:t>
       </w:r>
     </w:p>
     <w:p>
-      <w:pPr>
-        <w:spacing w:after="200"/>
-      </w:pPr>
       <w:r>
-        <w:t xml:space="preserve">Objetivo: registrar como a pasta </w:t>
-      </w:r>
-      <w:r>
-        <w:rPr>
-          <w:b/>
-        </w:rPr>
-        <w:t>core</w:t>
-      </w:r>
-      <w:r>
-        <w:t xml:space="preserve"> esta organizada hoje, o papel de cada modulo ou subpacote e em que parte do fluxo ele entra.</w:t>
+        <w:t>Objetivo: registrar como a pasta core esta organizada hoje, quais modulos ficaram mais importantes depois das evolucoes recentes e onde entram as camadas de IA, auditoria, higienizacao e CDP.</w:t>
       </w:r>
     </w:p>
     <w:p>
@@ -45,52 +29,17 @@
         <w:pStyle w:val="Heading1"/>
       </w:pPr>
       <w:r>
-        <w:t>Visao Geral</w:t>
+        <w:t>Visao geral</w:t>
       </w:r>
     </w:p>
     <w:p>
-      <w:pPr>
-        <w:pStyle w:val="ListBullet"/>
-        <w:spacing w:after="80"/>
-      </w:pPr>
       <w:r>
-        <w:t>A pasta core continua sendo o centro da inteligencia de negocio do PLANOS_LUAN, mas hoje ela esta mais distribuida do que estava na versao anterior da documentacao.</w:t>
+        <w:t>A pasta core continua sendo o centro da regra de negocio do PLANOS_LUAN, mas hoje ela esta mais distribuida e mais protegida por camadas de revisao do que estava no inicio do projeto. O fluxo PDF ainda nasce em core/lote.py, mas agora passa por classificacao modular em core/lib, higienizacao pedagogica, auditoria final e cache sidecar por PDF.</w:t>
       </w:r>
     </w:p>
     <w:p>
-      <w:pPr>
-        <w:pStyle w:val="ListBullet"/>
-        <w:spacing w:after="80"/>
-      </w:pPr>
       <w:r>
-        <w:t>Ela combina arquivos de infraestrutura, motores pedagogicos, camadas especializadas por disciplina ou modalidade e subpacotes como core/lib, core/cdp e core/eja.</w:t>
-      </w:r>
-    </w:p>
-    <w:p>
-      <w:pPr>
-        <w:pStyle w:val="ListBullet"/>
-        <w:spacing w:after="80"/>
-      </w:pPr>
-      <w:r>
-        <w:t>Para aulas comuns vindas de PDF, lote.py continua sendo o nucleo principal.</w:t>
-      </w:r>
-    </w:p>
-    <w:p>
-      <w:pPr>
-        <w:pStyle w:val="ListBullet"/>
-        <w:spacing w:after="80"/>
-      </w:pPr>
-      <w:r>
-        <w:t>Para CDP, o projeto passou a conviver com uma camada nova em pacote e uma camada legada de compatibilidade.</w:t>
-      </w:r>
-    </w:p>
-    <w:p>
-      <w:pPr>
-        <w:pStyle w:val="ListBullet"/>
-        <w:spacing w:after="80"/>
-      </w:pPr>
-      <w:r>
-        <w:t>Tambem surgiu uma integracao nova com o guia priorizado por meio de ae_priorizado.py.</w:t>
+        <w:t>A camada de IA tambem mudou de papel: em vez de agir sozinha, ela pode trabalhar em modo hibrido, recebendo um rascunho local do proprio sistema como base para refinamento. Em paralelo, a pasta core ganhou modulos novos como constantes.py, normalizacao.py e revisao_final.py, enquanto core/lib ficou mais forte com higienizador_pedagogico.py e regras especializadas por disciplina.</w:t>
       </w:r>
     </w:p>
     <w:p>
@@ -98,7 +47,52 @@
         <w:pStyle w:val="Heading1"/>
       </w:pPr>
       <w:r>
-        <w:t>Mapa Rapido dos Itens da Pasta core</w:t>
+        <w:t>Snapshot atual</w:t>
+      </w:r>
+    </w:p>
+    <w:p>
+      <w:pPr>
+        <w:pStyle w:val="ListBullet"/>
+      </w:pPr>
+      <w:r>
+        <w:t>Arquivos Python diretos em core: 27</w:t>
+      </w:r>
+    </w:p>
+    <w:p>
+      <w:pPr>
+        <w:pStyle w:val="ListBullet"/>
+      </w:pPr>
+      <w:r>
+        <w:t>Modulos mapeados em core/lib: 17</w:t>
+      </w:r>
+    </w:p>
+    <w:p>
+      <w:pPr>
+        <w:pStyle w:val="ListBullet"/>
+      </w:pPr>
+      <w:r>
+        <w:t>Arquivos de teste em tests/: 59</w:t>
+      </w:r>
+    </w:p>
+    <w:p>
+      <w:pPr>
+        <w:pStyle w:val="ListBullet"/>
+      </w:pPr>
+      <w:r>
+        <w:t>Bases de AE priorizado em assets/ae_priorizado: 14</w:t>
+      </w:r>
+    </w:p>
+    <w:p>
+      <w:pPr>
+        <w:pStyle w:val="ListBullet"/>
+      </w:pPr>
+      <w:r>
+        <w:t>Subpacotes principais vivos hoje: core/lib, core/cdp e core/eja.</w:t>
+      </w:r>
+    </w:p>
+    <w:p>
+      <w:r>
+        <w:t>Mapa rapido dos itens da pasta core</w:t>
       </w:r>
     </w:p>
     <w:tbl>
@@ -108,16 +102,15 @@
         <w:tblLook w:firstColumn="1" w:firstRow="1" w:lastColumn="0" w:lastRow="0" w:noHBand="0" w:noVBand="1" w:val="04A0"/>
       </w:tblPr>
       <w:tblGrid>
-        <w:gridCol w:w="2412"/>
-        <w:gridCol w:w="2412"/>
-        <w:gridCol w:w="2412"/>
-        <w:gridCol w:w="2412"/>
+        <w:gridCol w:w="2340"/>
+        <w:gridCol w:w="2340"/>
+        <w:gridCol w:w="2340"/>
+        <w:gridCol w:w="2340"/>
       </w:tblGrid>
       <w:tr>
         <w:tc>
           <w:tcPr>
-            <w:tcW w:type="dxa" w:w="2412"/>
-            <w:shd w:fill="D9EAF7"/>
+            <w:tcW w:type="dxa" w:w="2340"/>
           </w:tcPr>
           <w:p>
             <w:r>
@@ -127,8 +120,7 @@
         </w:tc>
         <w:tc>
           <w:tcPr>
-            <w:tcW w:type="dxa" w:w="2412"/>
-            <w:shd w:fill="D9EAF7"/>
+            <w:tcW w:type="dxa" w:w="2340"/>
           </w:tcPr>
           <w:p>
             <w:r>
@@ -138,8 +130,7 @@
         </w:tc>
         <w:tc>
           <w:tcPr>
-            <w:tcW w:type="dxa" w:w="2412"/>
-            <w:shd w:fill="D9EAF7"/>
+            <w:tcW w:type="dxa" w:w="2340"/>
           </w:tcPr>
           <w:p>
             <w:r>
@@ -149,8 +140,7 @@
         </w:tc>
         <w:tc>
           <w:tcPr>
-            <w:tcW w:type="dxa" w:w="2412"/>
-            <w:shd w:fill="D9EAF7"/>
+            <w:tcW w:type="dxa" w:w="2340"/>
           </w:tcPr>
           <w:p>
             <w:r>
@@ -162,7 +152,7 @@
       <w:tr>
         <w:tc>
           <w:tcPr>
-            <w:tcW w:type="dxa" w:w="2412"/>
+            <w:tcW w:type="dxa" w:w="2340"/>
           </w:tcPr>
           <w:p>
             <w:r>
@@ -172,7 +162,7 @@
         </w:tc>
         <w:tc>
           <w:tcPr>
-            <w:tcW w:type="dxa" w:w="2412"/>
+            <w:tcW w:type="dxa" w:w="2340"/>
           </w:tcPr>
           <w:p>
             <w:r>
@@ -182,17 +172,17 @@
         </w:tc>
         <w:tc>
           <w:tcPr>
-            <w:tcW w:type="dxa" w:w="2412"/>
+            <w:tcW w:type="dxa" w:w="2340"/>
           </w:tcPr>
           <w:p>
             <w:r>
-              <w:t>Marca a pasta core como pacote Python e habilita os imports internos do sistema.</w:t>
+              <w:t>Marca a pasta core como pacote Python e habilita os imports internos.</w:t>
             </w:r>
           </w:p>
         </w:tc>
         <w:tc>
           <w:tcPr>
-            <w:tcW w:type="dxa" w:w="2412"/>
+            <w:tcW w:type="dxa" w:w="2340"/>
           </w:tcPr>
           <w:p>
             <w:r>
@@ -204,7 +194,7 @@
       <w:tr>
         <w:tc>
           <w:tcPr>
-            <w:tcW w:type="dxa" w:w="2412"/>
+            <w:tcW w:type="dxa" w:w="2340"/>
           </w:tcPr>
           <w:p>
             <w:r>
@@ -214,7 +204,7 @@
         </w:tc>
         <w:tc>
           <w:tcPr>
-            <w:tcW w:type="dxa" w:w="2412"/>
+            <w:tcW w:type="dxa" w:w="2340"/>
           </w:tcPr>
           <w:p>
             <w:r>
@@ -224,21 +214,21 @@
         </w:tc>
         <w:tc>
           <w:tcPr>
-            <w:tcW w:type="dxa" w:w="2412"/>
+            <w:tcW w:type="dxa" w:w="2340"/>
           </w:tcPr>
           <w:p>
             <w:r>
-              <w:t>Aplica o modo AE priorizado para Portugues, lendo a base em assets/ae_priorizado e trocando a aprendizagem pelo AE correspondente.</w:t>
+              <w:t>Aplica AE priorizado quando o contexto da disciplina, turma e bimestre possui base estruturada em assets/ae_priorizado.</w:t>
             </w:r>
           </w:p>
         </w:tc>
         <w:tc>
           <w:tcPr>
-            <w:tcW w:type="dxa" w:w="2412"/>
+            <w:tcW w:type="dxa" w:w="2340"/>
           </w:tcPr>
           <w:p>
             <w:r>
-              <w:t>Integracao piloto</w:t>
+              <w:t>Integracao curricular</w:t>
             </w:r>
           </w:p>
         </w:tc>
@@ -246,7 +236,7 @@
       <w:tr>
         <w:tc>
           <w:tcPr>
-            <w:tcW w:type="dxa" w:w="2412"/>
+            <w:tcW w:type="dxa" w:w="2340"/>
           </w:tcPr>
           <w:p>
             <w:r>
@@ -256,7 +246,7 @@
         </w:tc>
         <w:tc>
           <w:tcPr>
-            <w:tcW w:type="dxa" w:w="2412"/>
+            <w:tcW w:type="dxa" w:w="2340"/>
           </w:tcPr>
           <w:p>
             <w:r>
@@ -266,17 +256,17 @@
         </w:tc>
         <w:tc>
           <w:tcPr>
-            <w:tcW w:type="dxa" w:w="2412"/>
+            <w:tcW w:type="dxa" w:w="2340"/>
           </w:tcPr>
           <w:p>
             <w:r>
-              <w:t>Gera frases de acompanhamento da aprendizagem e acessibilidade de forma dinamica.</w:t>
+              <w:t>Gera acompanhamento e acessibilidade dinamicos de forma compatível com o restante do sistema.</w:t>
             </w:r>
           </w:p>
         </w:tc>
         <w:tc>
           <w:tcPr>
-            <w:tcW w:type="dxa" w:w="2412"/>
+            <w:tcW w:type="dxa" w:w="2340"/>
           </w:tcPr>
           <w:p>
             <w:r>
@@ -288,7 +278,7 @@
       <w:tr>
         <w:tc>
           <w:tcPr>
-            <w:tcW w:type="dxa" w:w="2412"/>
+            <w:tcW w:type="dxa" w:w="2340"/>
           </w:tcPr>
           <w:p>
             <w:r>
@@ -298,7 +288,7 @@
         </w:tc>
         <w:tc>
           <w:tcPr>
-            <w:tcW w:type="dxa" w:w="2412"/>
+            <w:tcW w:type="dxa" w:w="2340"/>
           </w:tcPr>
           <w:p>
             <w:r>
@@ -308,17 +298,17 @@
         </w:tc>
         <w:tc>
           <w:tcPr>
-            <w:tcW w:type="dxa" w:w="2412"/>
+            <w:tcW w:type="dxa" w:w="2340"/>
           </w:tcPr>
           <w:p>
             <w:r>
-              <w:t>Guarda padroes disciplinares e repertorios que ajudam a inteligencia local a montar aulas coerentes.</w:t>
+              <w:t>Guarda repertorios e padroes disciplinares usados pelos motores locais.</w:t>
             </w:r>
           </w:p>
         </w:tc>
         <w:tc>
           <w:tcPr>
-            <w:tcW w:type="dxa" w:w="2412"/>
+            <w:tcW w:type="dxa" w:w="2340"/>
           </w:tcPr>
           <w:p>
             <w:r>
@@ -330,7 +320,7 @@
       <w:tr>
         <w:tc>
           <w:tcPr>
-            <w:tcW w:type="dxa" w:w="2412"/>
+            <w:tcW w:type="dxa" w:w="2340"/>
           </w:tcPr>
           <w:p>
             <w:r>
@@ -340,7 +330,7 @@
         </w:tc>
         <w:tc>
           <w:tcPr>
-            <w:tcW w:type="dxa" w:w="2412"/>
+            <w:tcW w:type="dxa" w:w="2340"/>
           </w:tcPr>
           <w:p>
             <w:r>
@@ -350,17 +340,17 @@
         </w:tc>
         <w:tc>
           <w:tcPr>
-            <w:tcW w:type="dxa" w:w="2412"/>
+            <w:tcW w:type="dxa" w:w="2340"/>
           </w:tcPr>
           <w:p>
             <w:r>
-              <w:t>Calcula feriados nacionais, datas sem aula, extensao do mes e filtros de agenda.</w:t>
+              <w:t>Calcula feriados, dias sem aula e apoio de agenda escolar.</w:t>
             </w:r>
           </w:p>
         </w:tc>
         <w:tc>
           <w:tcPr>
-            <w:tcW w:type="dxa" w:w="2412"/>
+            <w:tcW w:type="dxa" w:w="2340"/>
           </w:tcPr>
           <w:p>
             <w:r>
@@ -372,7 +362,7 @@
       <w:tr>
         <w:tc>
           <w:tcPr>
-            <w:tcW w:type="dxa" w:w="2412"/>
+            <w:tcW w:type="dxa" w:w="2340"/>
           </w:tcPr>
           <w:p>
             <w:r>
@@ -382,7 +372,7 @@
         </w:tc>
         <w:tc>
           <w:tcPr>
-            <w:tcW w:type="dxa" w:w="2412"/>
+            <w:tcW w:type="dxa" w:w="2340"/>
           </w:tcPr>
           <w:p>
             <w:r>
@@ -392,21 +382,21 @@
         </w:tc>
         <w:tc>
           <w:tcPr>
-            <w:tcW w:type="dxa" w:w="2412"/>
+            <w:tcW w:type="dxa" w:w="2340"/>
           </w:tcPr>
           <w:p>
             <w:r>
-              <w:t>Concentra a implementacao mais nova do fluxo CDP, especialmente em gerador_cdp.py.</w:t>
+              <w:t>Concentra a camada atual do fluxo CDP, hoje com destaque para gerador_cdp.py.</w:t>
             </w:r>
           </w:p>
         </w:tc>
         <w:tc>
           <w:tcPr>
-            <w:tcW w:type="dxa" w:w="2412"/>
+            <w:tcW w:type="dxa" w:w="2340"/>
           </w:tcPr>
           <w:p>
             <w:r>
-              <w:t>Nucleo CDP atual</w:t>
+              <w:t>Nucleo CDP</w:t>
             </w:r>
           </w:p>
         </w:tc>
@@ -414,7 +404,49 @@
       <w:tr>
         <w:tc>
           <w:tcPr>
-            <w:tcW w:type="dxa" w:w="2412"/>
+            <w:tcW w:type="dxa" w:w="2340"/>
+          </w:tcPr>
+          <w:p>
+            <w:r>
+              <w:t>cdp_em_docx.py</w:t>
+            </w:r>
+          </w:p>
+        </w:tc>
+        <w:tc>
+          <w:tcPr>
+            <w:tcW w:type="dxa" w:w="2340"/>
+          </w:tcPr>
+          <w:p>
+            <w:r>
+              <w:t>Arquivo</w:t>
+            </w:r>
+          </w:p>
+        </w:tc>
+        <w:tc>
+          <w:tcPr>
+            <w:tcW w:type="dxa" w:w="2340"/>
+          </w:tcPr>
+          <w:p>
+            <w:r>
+              <w:t>Ajusta documentos Word no fluxo CDP e faz acabamento final em cenarios especificos.</w:t>
+            </w:r>
+          </w:p>
+        </w:tc>
+        <w:tc>
+          <w:tcPr>
+            <w:tcW w:type="dxa" w:w="2340"/>
+          </w:tcPr>
+          <w:p>
+            <w:r>
+              <w:t>Ajuste final</w:t>
+            </w:r>
+          </w:p>
+        </w:tc>
+      </w:tr>
+      <w:tr>
+        <w:tc>
+          <w:tcPr>
+            <w:tcW w:type="dxa" w:w="2340"/>
           </w:tcPr>
           <w:p>
             <w:r>
@@ -424,7 +456,7 @@
         </w:tc>
         <w:tc>
           <w:tcPr>
-            <w:tcW w:type="dxa" w:w="2412"/>
+            <w:tcW w:type="dxa" w:w="2340"/>
           </w:tcPr>
           <w:p>
             <w:r>
@@ -434,17 +466,17 @@
         </w:tc>
         <w:tc>
           <w:tcPr>
-            <w:tcW w:type="dxa" w:w="2412"/>
+            <w:tcW w:type="dxa" w:w="2340"/>
           </w:tcPr>
           <w:p>
             <w:r>
-              <w:t>Mantem a logica legada do CDP que ainda serve de base para funcoes importadas pelo pacote core.cdp.</w:t>
+              <w:t>Mantem a base legada ainda reutilizada por imports e compatibilidade do CDP.</w:t>
             </w:r>
           </w:p>
         </w:tc>
         <w:tc>
           <w:tcPr>
-            <w:tcW w:type="dxa" w:w="2412"/>
+            <w:tcW w:type="dxa" w:w="2340"/>
           </w:tcPr>
           <w:p>
             <w:r>
@@ -456,17 +488,17 @@
       <w:tr>
         <w:tc>
           <w:tcPr>
-            <w:tcW w:type="dxa" w:w="2412"/>
+            <w:tcW w:type="dxa" w:w="2340"/>
           </w:tcPr>
           <w:p>
             <w:r>
-              <w:t>cdp_em_docx.py</w:t>
+              <w:t>constantes.py</w:t>
             </w:r>
           </w:p>
         </w:tc>
         <w:tc>
           <w:tcPr>
-            <w:tcW w:type="dxa" w:w="2412"/>
+            <w:tcW w:type="dxa" w:w="2340"/>
           </w:tcPr>
           <w:p>
             <w:r>
@@ -476,21 +508,21 @@
         </w:tc>
         <w:tc>
           <w:tcPr>
-            <w:tcW w:type="dxa" w:w="2412"/>
+            <w:tcW w:type="dxa" w:w="2340"/>
           </w:tcPr>
           <w:p>
             <w:r>
-              <w:t>Reescreve e ajusta documentos DOCX do fluxo CDP, com foco em cenarios como Matematica contextual e Ensino Medio.</w:t>
+              <w:t>Centraliza constantes de apoio compartilhadas entre modulos.</w:t>
             </w:r>
           </w:p>
         </w:tc>
         <w:tc>
           <w:tcPr>
-            <w:tcW w:type="dxa" w:w="2412"/>
+            <w:tcW w:type="dxa" w:w="2340"/>
           </w:tcPr>
           <w:p>
             <w:r>
-              <w:t>Ajuste final</w:t>
+              <w:t>Infraestrutura</w:t>
             </w:r>
           </w:p>
         </w:tc>
@@ -498,7 +530,7 @@
       <w:tr>
         <w:tc>
           <w:tcPr>
-            <w:tcW w:type="dxa" w:w="2412"/>
+            <w:tcW w:type="dxa" w:w="2340"/>
           </w:tcPr>
           <w:p>
             <w:r>
@@ -508,7 +540,7 @@
         </w:tc>
         <w:tc>
           <w:tcPr>
-            <w:tcW w:type="dxa" w:w="2412"/>
+            <w:tcW w:type="dxa" w:w="2340"/>
           </w:tcPr>
           <w:p>
             <w:r>
@@ -518,17 +550,59 @@
         </w:tc>
         <w:tc>
           <w:tcPr>
-            <w:tcW w:type="dxa" w:w="2412"/>
+            <w:tcW w:type="dxa" w:w="2340"/>
           </w:tcPr>
           <w:p>
             <w:r>
-              <w:t>Controla o banco SQLite do sistema, incluindo professores, turmas, vinculos, template_id, componente curricular e historico dos planos.</w:t>
+              <w:t>Controla SQLite, cadastro de professores, historico e memoria de geracao.</w:t>
             </w:r>
           </w:p>
         </w:tc>
         <w:tc>
           <w:tcPr>
-            <w:tcW w:type="dxa" w:w="2412"/>
+            <w:tcW w:type="dxa" w:w="2340"/>
+          </w:tcPr>
+          <w:p>
+            <w:r>
+              <w:t>Banco de dados</w:t>
+            </w:r>
+          </w:p>
+        </w:tc>
+      </w:tr>
+      <w:tr>
+        <w:tc>
+          <w:tcPr>
+            <w:tcW w:type="dxa" w:w="2340"/>
+          </w:tcPr>
+          <w:p>
+            <w:r>
+              <w:t>disciplinas.py</w:t>
+            </w:r>
+          </w:p>
+        </w:tc>
+        <w:tc>
+          <w:tcPr>
+            <w:tcW w:type="dxa" w:w="2340"/>
+          </w:tcPr>
+          <w:p>
+            <w:r>
+              <w:t>Arquivo</w:t>
+            </w:r>
+          </w:p>
+        </w:tc>
+        <w:tc>
+          <w:tcPr>
+            <w:tcW w:type="dxa" w:w="2340"/>
+          </w:tcPr>
+          <w:p>
+            <w:r>
+              <w:t>Define disciplinas, modalidades e regras de comportamento por contexto.</w:t>
+            </w:r>
+          </w:p>
+        </w:tc>
+        <w:tc>
+          <w:tcPr>
+            <w:tcW w:type="dxa" w:w="2340"/>
           </w:tcPr>
           <w:p>
             <w:r>
@@ -540,49 +614,7 @@
       <w:tr>
         <w:tc>
           <w:tcPr>
-            <w:tcW w:type="dxa" w:w="2412"/>
-          </w:tcPr>
-          <w:p>
-            <w:r>
-              <w:t>disciplinas.py</w:t>
-            </w:r>
-          </w:p>
-        </w:tc>
-        <w:tc>
-          <w:tcPr>
-            <w:tcW w:type="dxa" w:w="2412"/>
-          </w:tcPr>
-          <w:p>
-            <w:r>
-              <w:t>Arquivo</w:t>
-            </w:r>
-          </w:p>
-        </w:tc>
-        <w:tc>
-          <w:tcPr>
-            <w:tcW w:type="dxa" w:w="2412"/>
-          </w:tcPr>
-          <w:p>
-            <w:r>
-              <w:t>Define disciplinas, bimestres e modos de funcionamento como PDF, CDP e CDP Fundamental.</w:t>
-            </w:r>
-          </w:p>
-        </w:tc>
-        <w:tc>
-          <w:tcPr>
-            <w:tcW w:type="dxa" w:w="2412"/>
-          </w:tcPr>
-          <w:p>
-            <w:r>
-              <w:t>Estrutural</w:t>
-            </w:r>
-          </w:p>
-        </w:tc>
-      </w:tr>
-      <w:tr>
-        <w:tc>
-          <w:tcPr>
-            <w:tcW w:type="dxa" w:w="2412"/>
+            <w:tcW w:type="dxa" w:w="2340"/>
           </w:tcPr>
           <w:p>
             <w:r>
@@ -592,7 +624,7 @@
         </w:tc>
         <w:tc>
           <w:tcPr>
-            <w:tcW w:type="dxa" w:w="2412"/>
+            <w:tcW w:type="dxa" w:w="2340"/>
           </w:tcPr>
           <w:p>
             <w:r>
@@ -602,17 +634,17 @@
         </w:tc>
         <w:tc>
           <w:tcPr>
-            <w:tcW w:type="dxa" w:w="2412"/>
+            <w:tcW w:type="dxa" w:w="2340"/>
           </w:tcPr>
           <w:p>
             <w:r>
-              <w:t>Agrupa adaptacoes para EJA, como consolidacao de blocos e tecnicas com linguagem adequada a jovens e adultos.</w:t>
+              <w:t>Agrupa adaptacoes especificas da modalidade EJA.</w:t>
             </w:r>
           </w:p>
         </w:tc>
         <w:tc>
           <w:tcPr>
-            <w:tcW w:type="dxa" w:w="2412"/>
+            <w:tcW w:type="dxa" w:w="2340"/>
           </w:tcPr>
           <w:p>
             <w:r>
@@ -624,7 +656,7 @@
       <w:tr>
         <w:tc>
           <w:tcPr>
-            <w:tcW w:type="dxa" w:w="2412"/>
+            <w:tcW w:type="dxa" w:w="2340"/>
           </w:tcPr>
           <w:p>
             <w:r>
@@ -634,7 +666,7 @@
         </w:tc>
         <w:tc>
           <w:tcPr>
-            <w:tcW w:type="dxa" w:w="2412"/>
+            <w:tcW w:type="dxa" w:w="2340"/>
           </w:tcPr>
           <w:p>
             <w:r>
@@ -644,17 +676,17 @@
         </w:tc>
         <w:tc>
           <w:tcPr>
-            <w:tcW w:type="dxa" w:w="2412"/>
+            <w:tcW w:type="dxa" w:w="2340"/>
           </w:tcPr>
           <w:p>
             <w:r>
-              <w:t>Reune funcoes pequenas de formatacao e apoio, como horario_para_plano, texto_lista, relatorio simples e preservacao da ordem de envio dos arquivos.</w:t>
+              <w:t>Reune utilitarios de horarios, ordenacao de uploads, relatorios e apoio geral ao app.</w:t>
             </w:r>
           </w:p>
         </w:tc>
         <w:tc>
           <w:tcPr>
-            <w:tcW w:type="dxa" w:w="2412"/>
+            <w:tcW w:type="dxa" w:w="2340"/>
           </w:tcPr>
           <w:p>
             <w:r>
@@ -666,7 +698,7 @@
       <w:tr>
         <w:tc>
           <w:tcPr>
-            <w:tcW w:type="dxa" w:w="2412"/>
+            <w:tcW w:type="dxa" w:w="2340"/>
           </w:tcPr>
           <w:p>
             <w:r>
@@ -676,7 +708,7 @@
         </w:tc>
         <w:tc>
           <w:tcPr>
-            <w:tcW w:type="dxa" w:w="2412"/>
+            <w:tcW w:type="dxa" w:w="2340"/>
           </w:tcPr>
           <w:p>
             <w:r>
@@ -686,21 +718,21 @@
         </w:tc>
         <w:tc>
           <w:tcPr>
-            <w:tcW w:type="dxa" w:w="2412"/>
+            <w:tcW w:type="dxa" w:w="2340"/>
           </w:tcPr>
           <w:p>
             <w:r>
-              <w:t>Integra o sistema com OpenAI e Gemini para extrair e montar tema, aprendizagem e metodologia.</w:t>
+              <w:t>Integra OpenAI e Gemini em modo hibrido, usando rascunho local do sistema como base para refinamento por IA.</w:t>
             </w:r>
           </w:p>
         </w:tc>
         <w:tc>
           <w:tcPr>
-            <w:tcW w:type="dxa" w:w="2412"/>
+            <w:tcW w:type="dxa" w:w="2340"/>
           </w:tcPr>
           <w:p>
             <w:r>
-              <w:t>Motor externo</w:t>
+              <w:t>Motor IA</w:t>
             </w:r>
           </w:p>
         </w:tc>
@@ -708,7 +740,7 @@
       <w:tr>
         <w:tc>
           <w:tcPr>
-            <w:tcW w:type="dxa" w:w="2412"/>
+            <w:tcW w:type="dxa" w:w="2340"/>
           </w:tcPr>
           <w:p>
             <w:r>
@@ -718,7 +750,7 @@
         </w:tc>
         <w:tc>
           <w:tcPr>
-            <w:tcW w:type="dxa" w:w="2412"/>
+            <w:tcW w:type="dxa" w:w="2340"/>
           </w:tcPr>
           <w:p>
             <w:r>
@@ -728,17 +760,17 @@
         </w:tc>
         <w:tc>
           <w:tcPr>
-            <w:tcW w:type="dxa" w:w="2412"/>
+            <w:tcW w:type="dxa" w:w="2340"/>
           </w:tcPr>
           <w:p>
             <w:r>
-              <w:t>Executa heuristicas e geracao local sem depender de IA externa.</w:t>
+              <w:t>Mantem heuristicas e geracao local sem dependencia de IA externa.</w:t>
             </w:r>
           </w:p>
         </w:tc>
         <w:tc>
           <w:tcPr>
-            <w:tcW w:type="dxa" w:w="2412"/>
+            <w:tcW w:type="dxa" w:w="2340"/>
           </w:tcPr>
           <w:p>
             <w:r>
@@ -750,7 +782,7 @@
       <w:tr>
         <w:tc>
           <w:tcPr>
-            <w:tcW w:type="dxa" w:w="2412"/>
+            <w:tcW w:type="dxa" w:w="2340"/>
           </w:tcPr>
           <w:p>
             <w:r>
@@ -760,7 +792,7 @@
         </w:tc>
         <w:tc>
           <w:tcPr>
-            <w:tcW w:type="dxa" w:w="2412"/>
+            <w:tcW w:type="dxa" w:w="2340"/>
           </w:tcPr>
           <w:p>
             <w:r>
@@ -770,17 +802,17 @@
         </w:tc>
         <w:tc>
           <w:tcPr>
-            <w:tcW w:type="dxa" w:w="2412"/>
+            <w:tcW w:type="dxa" w:w="2340"/>
           </w:tcPr>
           <w:p>
             <w:r>
-              <w:t>Agrupa extratores, classificadores, perfis de acompanhamento e acessibilidade, geradores de colunas pedagogicas, progressao, tecnicas e modalidades.</w:t>
+              <w:t>Agrupa extratores, classificadores, motores metodologicos, higienizacao e perfis pedagogicos.</w:t>
             </w:r>
           </w:p>
         </w:tc>
         <w:tc>
           <w:tcPr>
-            <w:tcW w:type="dxa" w:w="2412"/>
+            <w:tcW w:type="dxa" w:w="2340"/>
           </w:tcPr>
           <w:p>
             <w:r>
@@ -792,7 +824,7 @@
       <w:tr>
         <w:tc>
           <w:tcPr>
-            <w:tcW w:type="dxa" w:w="2412"/>
+            <w:tcW w:type="dxa" w:w="2340"/>
           </w:tcPr>
           <w:p>
             <w:r>
@@ -802,7 +834,7 @@
         </w:tc>
         <w:tc>
           <w:tcPr>
-            <w:tcW w:type="dxa" w:w="2412"/>
+            <w:tcW w:type="dxa" w:w="2340"/>
           </w:tcPr>
           <w:p>
             <w:r>
@@ -812,17 +844,17 @@
         </w:tc>
         <w:tc>
           <w:tcPr>
-            <w:tcW w:type="dxa" w:w="2412"/>
+            <w:tcW w:type="dxa" w:w="2340"/>
           </w:tcPr>
           <w:p>
             <w:r>
-              <w:t>Transforma PDFs comuns em aulas estruturadas com tema, material, aprendizagem, metodologia, acompanhamento e acessibilidade.</w:t>
+              <w:t>Motor central do fluxo PDF, com extracao, cache sidecar JSON, auditoria final, IA opcional e fallback local.</w:t>
             </w:r>
           </w:p>
         </w:tc>
         <w:tc>
           <w:tcPr>
-            <w:tcW w:type="dxa" w:w="2412"/>
+            <w:tcW w:type="dxa" w:w="2340"/>
           </w:tcPr>
           <w:p>
             <w:r>
@@ -834,7 +866,7 @@
       <w:tr>
         <w:tc>
           <w:tcPr>
-            <w:tcW w:type="dxa" w:w="2412"/>
+            <w:tcW w:type="dxa" w:w="2340"/>
           </w:tcPr>
           <w:p>
             <w:r>
@@ -844,7 +876,7 @@
         </w:tc>
         <w:tc>
           <w:tcPr>
-            <w:tcW w:type="dxa" w:w="2412"/>
+            <w:tcW w:type="dxa" w:w="2340"/>
           </w:tcPr>
           <w:p>
             <w:r>
@@ -854,17 +886,17 @@
         </w:tc>
         <w:tc>
           <w:tcPr>
-            <w:tcW w:type="dxa" w:w="2412"/>
+            <w:tcW w:type="dxa" w:w="2340"/>
           </w:tcPr>
           <w:p>
             <w:r>
-              <w:t>Faz ajustes linguisticos finos na metodologia, como regularizacao de verbos e polimento de frase.</w:t>
+              <w:t>Faz polimento linguistico fino de metodologias ja montadas.</w:t>
             </w:r>
           </w:p>
         </w:tc>
         <w:tc>
           <w:tcPr>
-            <w:tcW w:type="dxa" w:w="2412"/>
+            <w:tcW w:type="dxa" w:w="2340"/>
           </w:tcPr>
           <w:p>
             <w:r>
@@ -876,7 +908,7 @@
       <w:tr>
         <w:tc>
           <w:tcPr>
-            <w:tcW w:type="dxa" w:w="2412"/>
+            <w:tcW w:type="dxa" w:w="2340"/>
           </w:tcPr>
           <w:p>
             <w:r>
@@ -886,7 +918,7 @@
         </w:tc>
         <w:tc>
           <w:tcPr>
-            <w:tcW w:type="dxa" w:w="2412"/>
+            <w:tcW w:type="dxa" w:w="2340"/>
           </w:tcPr>
           <w:p>
             <w:r>
@@ -896,21 +928,21 @@
         </w:tc>
         <w:tc>
           <w:tcPr>
-            <w:tcW w:type="dxa" w:w="2412"/>
+            <w:tcW w:type="dxa" w:w="2340"/>
           </w:tcPr>
           <w:p>
             <w:r>
-              <w:t>Resolve o template central correto por contexto, template_id, escola, disciplina e componente curricular.</w:t>
+              <w:t>Escolhe template central por contexto, template_id, escola e disciplina.</w:t>
             </w:r>
           </w:p>
         </w:tc>
         <w:tc>
           <w:tcPr>
-            <w:tcW w:type="dxa" w:w="2412"/>
+            <w:tcW w:type="dxa" w:w="2340"/>
           </w:tcPr>
           <w:p>
             <w:r>
-              <w:t>Estrutural</w:t>
+              <w:t>Modelos centrais</w:t>
             </w:r>
           </w:p>
         </w:tc>
@@ -918,7 +950,49 @@
       <w:tr>
         <w:tc>
           <w:tcPr>
-            <w:tcW w:type="dxa" w:w="2412"/>
+            <w:tcW w:type="dxa" w:w="2340"/>
+          </w:tcPr>
+          <w:p>
+            <w:r>
+              <w:t>normalizacao.py</w:t>
+            </w:r>
+          </w:p>
+        </w:tc>
+        <w:tc>
+          <w:tcPr>
+            <w:tcW w:type="dxa" w:w="2340"/>
+          </w:tcPr>
+          <w:p>
+            <w:r>
+              <w:t>Arquivo</w:t>
+            </w:r>
+          </w:p>
+        </w:tc>
+        <w:tc>
+          <w:tcPr>
+            <w:tcW w:type="dxa" w:w="2340"/>
+          </w:tcPr>
+          <w:p>
+            <w:r>
+              <w:t>Concentra normalizacoes textuais reutilizadas por modulos diferentes.</w:t>
+            </w:r>
+          </w:p>
+        </w:tc>
+        <w:tc>
+          <w:tcPr>
+            <w:tcW w:type="dxa" w:w="2340"/>
+          </w:tcPr>
+          <w:p>
+            <w:r>
+              <w:t>Apoio</w:t>
+            </w:r>
+          </w:p>
+        </w:tc>
+      </w:tr>
+      <w:tr>
+        <w:tc>
+          <w:tcPr>
+            <w:tcW w:type="dxa" w:w="2340"/>
           </w:tcPr>
           <w:p>
             <w:r>
@@ -928,7 +1002,7 @@
         </w:tc>
         <w:tc>
           <w:tcPr>
-            <w:tcW w:type="dxa" w:w="2412"/>
+            <w:tcW w:type="dxa" w:w="2340"/>
           </w:tcPr>
           <w:p>
             <w:r>
@@ -938,17 +1012,17 @@
         </w:tc>
         <w:tc>
           <w:tcPr>
-            <w:tcW w:type="dxa" w:w="2412"/>
+            <w:tcW w:type="dxa" w:w="2340"/>
           </w:tcPr>
           <w:p>
             <w:r>
-              <w:t>Gera metodologia altamente especifica para Orientacao de Estudos, com perfis por missao, trilha ou jornada.</w:t>
+              <w:t>Gera metodologia especializada para Orientacao de Estudos.</w:t>
             </w:r>
           </w:p>
         </w:tc>
         <w:tc>
           <w:tcPr>
-            <w:tcW w:type="dxa" w:w="2412"/>
+            <w:tcW w:type="dxa" w:w="2340"/>
           </w:tcPr>
           <w:p>
             <w:r>
@@ -960,7 +1034,7 @@
       <w:tr>
         <w:tc>
           <w:tcPr>
-            <w:tcW w:type="dxa" w:w="2412"/>
+            <w:tcW w:type="dxa" w:w="2340"/>
           </w:tcPr>
           <w:p>
             <w:r>
@@ -970,7 +1044,7 @@
         </w:tc>
         <w:tc>
           <w:tcPr>
-            <w:tcW w:type="dxa" w:w="2412"/>
+            <w:tcW w:type="dxa" w:w="2340"/>
           </w:tcPr>
           <w:p>
             <w:r>
@@ -980,17 +1054,17 @@
         </w:tc>
         <w:tc>
           <w:tcPr>
-            <w:tcW w:type="dxa" w:w="2412"/>
+            <w:tcW w:type="dxa" w:w="2340"/>
           </w:tcPr>
           <w:p>
             <w:r>
-              <w:t>Centraliza objetivos e apoio textual para o fluxo de Orientacao de Estudos.</w:t>
+              <w:t>Centraliza objetivos e textos de apoio da Orientacao de Estudos.</w:t>
             </w:r>
           </w:p>
         </w:tc>
         <w:tc>
           <w:tcPr>
-            <w:tcW w:type="dxa" w:w="2412"/>
+            <w:tcW w:type="dxa" w:w="2340"/>
           </w:tcPr>
           <w:p>
             <w:r>
@@ -1002,7 +1076,7 @@
       <w:tr>
         <w:tc>
           <w:tcPr>
-            <w:tcW w:type="dxa" w:w="2412"/>
+            <w:tcW w:type="dxa" w:w="2340"/>
           </w:tcPr>
           <w:p>
             <w:r>
@@ -1012,31 +1086,31 @@
         </w:tc>
         <w:tc>
           <w:tcPr>
-            <w:tcW w:type="dxa" w:w="2412"/>
+            <w:tcW w:type="dxa" w:w="2340"/>
           </w:tcPr>
           <w:p>
             <w:r>
-              <w:t>Arquivo tecnico</w:t>
+              <w:t>Artefato tecnico</w:t>
             </w:r>
           </w:p>
         </w:tc>
         <w:tc>
           <w:tcPr>
-            <w:tcW w:type="dxa" w:w="2412"/>
+            <w:tcW w:type="dxa" w:w="2340"/>
           </w:tcPr>
           <w:p>
             <w:r>
-              <w:t>Arquivo presente dentro da pasta core, mas que nao representa hoje o banco principal de operacao do sistema.</w:t>
+              <w:t>Arquivo interno presente em core, sem ser o banco principal utilizado em producao.</w:t>
             </w:r>
           </w:p>
         </w:tc>
         <w:tc>
           <w:tcPr>
-            <w:tcW w:type="dxa" w:w="2412"/>
+            <w:tcW w:type="dxa" w:w="2340"/>
           </w:tcPr>
           <w:p>
             <w:r>
-              <w:t>Artefato local</w:t>
+              <w:t>Tecnico</w:t>
             </w:r>
           </w:p>
         </w:tc>
@@ -1044,7 +1118,7 @@
       <w:tr>
         <w:tc>
           <w:tcPr>
-            <w:tcW w:type="dxa" w:w="2412"/>
+            <w:tcW w:type="dxa" w:w="2340"/>
           </w:tcPr>
           <w:p>
             <w:r>
@@ -1054,7 +1128,7 @@
         </w:tc>
         <w:tc>
           <w:tcPr>
-            <w:tcW w:type="dxa" w:w="2412"/>
+            <w:tcW w:type="dxa" w:w="2340"/>
           </w:tcPr>
           <w:p>
             <w:r>
@@ -1064,21 +1138,21 @@
         </w:tc>
         <w:tc>
           <w:tcPr>
-            <w:tcW w:type="dxa" w:w="2412"/>
+            <w:tcW w:type="dxa" w:w="2340"/>
           </w:tcPr>
           <w:p>
             <w:r>
-              <w:t>Le, diagnostica, cria e atualiza modelos DOCX encontrados nas pastas dos professores.</w:t>
+              <w:t>Le e padroniza modelos DOCX dos professores para reaproveitamento no sistema.</w:t>
             </w:r>
           </w:p>
         </w:tc>
         <w:tc>
           <w:tcPr>
-            <w:tcW w:type="dxa" w:w="2412"/>
+            <w:tcW w:type="dxa" w:w="2340"/>
           </w:tcPr>
           <w:p>
             <w:r>
-              <w:t>Estrutural</w:t>
+              <w:t>Modelos locais</w:t>
             </w:r>
           </w:p>
         </w:tc>
@@ -1086,7 +1160,7 @@
       <w:tr>
         <w:tc>
           <w:tcPr>
-            <w:tcW w:type="dxa" w:w="2412"/>
+            <w:tcW w:type="dxa" w:w="2340"/>
           </w:tcPr>
           <w:p>
             <w:r>
@@ -1096,7 +1170,7 @@
         </w:tc>
         <w:tc>
           <w:tcPr>
-            <w:tcW w:type="dxa" w:w="2412"/>
+            <w:tcW w:type="dxa" w:w="2340"/>
           </w:tcPr>
           <w:p>
             <w:r>
@@ -1106,17 +1180,17 @@
         </w:tc>
         <w:tc>
           <w:tcPr>
-            <w:tcW w:type="dxa" w:w="2412"/>
+            <w:tcW w:type="dxa" w:w="2340"/>
           </w:tcPr>
           <w:p>
             <w:r>
-              <w:t>Le e interpreta o escopo-sequencia de Projeto de Vida para localizar o item certo por turma, bimestre e aula.</w:t>
+              <w:t>Interpreta o escopo-sequencia de Projeto de Vida por turma, bimestre e aula.</w:t>
             </w:r>
           </w:p>
         </w:tc>
         <w:tc>
           <w:tcPr>
-            <w:tcW w:type="dxa" w:w="2412"/>
+            <w:tcW w:type="dxa" w:w="2340"/>
           </w:tcPr>
           <w:p>
             <w:r>
@@ -1128,7 +1202,7 @@
       <w:tr>
         <w:tc>
           <w:tcPr>
-            <w:tcW w:type="dxa" w:w="2412"/>
+            <w:tcW w:type="dxa" w:w="2340"/>
           </w:tcPr>
           <w:p>
             <w:r>
@@ -1138,7 +1212,7 @@
         </w:tc>
         <w:tc>
           <w:tcPr>
-            <w:tcW w:type="dxa" w:w="2412"/>
+            <w:tcW w:type="dxa" w:w="2340"/>
           </w:tcPr>
           <w:p>
             <w:r>
@@ -1148,17 +1222,17 @@
         </w:tc>
         <w:tc>
           <w:tcPr>
-            <w:tcW w:type="dxa" w:w="2412"/>
+            <w:tcW w:type="dxa" w:w="2340"/>
           </w:tcPr>
           <w:p>
             <w:r>
-              <w:t>Guarda orientacoes por disciplina usadas pelo modulo de IA.</w:t>
+              <w:t>Mantem instrucoes e reforcos de prompt por disciplina para a camada de IA.</w:t>
             </w:r>
           </w:p>
         </w:tc>
         <w:tc>
           <w:tcPr>
-            <w:tcW w:type="dxa" w:w="2412"/>
+            <w:tcW w:type="dxa" w:w="2340"/>
           </w:tcPr>
           <w:p>
             <w:r>
@@ -1170,7 +1244,7 @@
       <w:tr>
         <w:tc>
           <w:tcPr>
-            <w:tcW w:type="dxa" w:w="2412"/>
+            <w:tcW w:type="dxa" w:w="2340"/>
           </w:tcPr>
           <w:p>
             <w:r>
@@ -1180,7 +1254,7 @@
         </w:tc>
         <w:tc>
           <w:tcPr>
-            <w:tcW w:type="dxa" w:w="2412"/>
+            <w:tcW w:type="dxa" w:w="2340"/>
           </w:tcPr>
           <w:p>
             <w:r>
@@ -1190,17 +1264,17 @@
         </w:tc>
         <w:tc>
           <w:tcPr>
-            <w:tcW w:type="dxa" w:w="2412"/>
+            <w:tcW w:type="dxa" w:w="2340"/>
           </w:tcPr>
           <w:p>
             <w:r>
-              <w:t>Revisa metodologia, corrige ortografia, detecta contexto pedagogico, naturaliza texto e combate mojibake.</w:t>
+              <w:t>Revisa, sanitiza e naturaliza metodologia, inclusive correcoes por disciplina e combate a mojibake.</w:t>
             </w:r>
           </w:p>
         </w:tc>
         <w:tc>
           <w:tcPr>
-            <w:tcW w:type="dxa" w:w="2412"/>
+            <w:tcW w:type="dxa" w:w="2340"/>
           </w:tcPr>
           <w:p>
             <w:r>
@@ -1212,7 +1286,7 @@
       <w:tr>
         <w:tc>
           <w:tcPr>
-            <w:tcW w:type="dxa" w:w="2412"/>
+            <w:tcW w:type="dxa" w:w="2340"/>
           </w:tcPr>
           <w:p>
             <w:r>
@@ -1222,7 +1296,7 @@
         </w:tc>
         <w:tc>
           <w:tcPr>
-            <w:tcW w:type="dxa" w:w="2412"/>
+            <w:tcW w:type="dxa" w:w="2340"/>
           </w:tcPr>
           <w:p>
             <w:r>
@@ -1232,17 +1306,17 @@
         </w:tc>
         <w:tc>
           <w:tcPr>
-            <w:tcW w:type="dxa" w:w="2412"/>
+            <w:tcW w:type="dxa" w:w="2340"/>
           </w:tcPr>
           <w:p>
             <w:r>
-              <w:t>Gera a estrutura metodologica de Redacao e Leitura com etapas fixas e criterios mais autorais.</w:t>
+              <w:t>Gera estruturas metodologicas autorais para Redacao e Leitura.</w:t>
             </w:r>
           </w:p>
         </w:tc>
         <w:tc>
           <w:tcPr>
-            <w:tcW w:type="dxa" w:w="2412"/>
+            <w:tcW w:type="dxa" w:w="2340"/>
           </w:tcPr>
           <w:p>
             <w:r>
@@ -1254,7 +1328,7 @@
       <w:tr>
         <w:tc>
           <w:tcPr>
-            <w:tcW w:type="dxa" w:w="2412"/>
+            <w:tcW w:type="dxa" w:w="2340"/>
           </w:tcPr>
           <w:p>
             <w:r>
@@ -1264,7 +1338,7 @@
         </w:tc>
         <w:tc>
           <w:tcPr>
-            <w:tcW w:type="dxa" w:w="2412"/>
+            <w:tcW w:type="dxa" w:w="2340"/>
           </w:tcPr>
           <w:p>
             <w:r>
@@ -1274,21 +1348,21 @@
         </w:tc>
         <w:tc>
           <w:tcPr>
-            <w:tcW w:type="dxa" w:w="2412"/>
+            <w:tcW w:type="dxa" w:w="2340"/>
           </w:tcPr>
           <w:p>
             <w:r>
-              <w:t>Carrega textos de referencia metodologica salvos no projeto.</w:t>
+              <w:t>Carrega referencias em texto usadas como memoria pedagogica do projeto.</w:t>
             </w:r>
           </w:p>
         </w:tc>
         <w:tc>
           <w:tcPr>
-            <w:tcW w:type="dxa" w:w="2412"/>
+            <w:tcW w:type="dxa" w:w="2340"/>
           </w:tcPr>
           <w:p>
             <w:r>
-              <w:t>Referencia</w:t>
+              <w:t>Memoria pedagogica</w:t>
             </w:r>
           </w:p>
         </w:tc>
@@ -1296,7 +1370,49 @@
       <w:tr>
         <w:tc>
           <w:tcPr>
-            <w:tcW w:type="dxa" w:w="2412"/>
+            <w:tcW w:type="dxa" w:w="2340"/>
+          </w:tcPr>
+          <w:p>
+            <w:r>
+              <w:t>revisao_final.py</w:t>
+            </w:r>
+          </w:p>
+        </w:tc>
+        <w:tc>
+          <w:tcPr>
+            <w:tcW w:type="dxa" w:w="2340"/>
+          </w:tcPr>
+          <w:p>
+            <w:r>
+              <w:t>Arquivo</w:t>
+            </w:r>
+          </w:p>
+        </w:tc>
+        <w:tc>
+          <w:tcPr>
+            <w:tcW w:type="dxa" w:w="2340"/>
+          </w:tcPr>
+          <w:p>
+            <w:r>
+              <w:t>Aplica auditoria final, confidence_score, avisos_validacao e grava cache JSON por PDF.</w:t>
+            </w:r>
+          </w:p>
+        </w:tc>
+        <w:tc>
+          <w:tcPr>
+            <w:tcW w:type="dxa" w:w="2340"/>
+          </w:tcPr>
+          <w:p>
+            <w:r>
+              <w:t>Auditoria final</w:t>
+            </w:r>
+          </w:p>
+        </w:tc>
+      </w:tr>
+      <w:tr>
+        <w:tc>
+          <w:tcPr>
+            <w:tcW w:type="dxa" w:w="2340"/>
           </w:tcPr>
           <w:p>
             <w:r>
@@ -1306,7 +1422,7 @@
         </w:tc>
         <w:tc>
           <w:tcPr>
-            <w:tcW w:type="dxa" w:w="2412"/>
+            <w:tcW w:type="dxa" w:w="2340"/>
           </w:tcPr>
           <w:p>
             <w:r>
@@ -1316,17 +1432,17 @@
         </w:tc>
         <w:tc>
           <w:tcPr>
-            <w:tcW w:type="dxa" w:w="2412"/>
+            <w:tcW w:type="dxa" w:w="2340"/>
           </w:tcPr>
           <w:p>
             <w:r>
-              <w:t>Valida aulas geradas e detecta problemas como tema repetido, metodologia pobre, aprendizagem curta e campos vazios.</w:t>
+              <w:t>Valida tema, aprendizagem, metodologia, acompanhamento e acessibilidade antes da entrega.</w:t>
             </w:r>
           </w:p>
         </w:tc>
         <w:tc>
           <w:tcPr>
-            <w:tcW w:type="dxa" w:w="2412"/>
+            <w:tcW w:type="dxa" w:w="2340"/>
           </w:tcPr>
           <w:p>
             <w:r>
@@ -1336,1805 +1452,671 @@
         </w:tc>
       </w:tr>
     </w:tbl>
-    <w:p/>
     <w:p>
       <w:pPr>
         <w:pStyle w:val="Heading1"/>
       </w:pPr>
       <w:r>
-        <w:t>Explicacao Detalhada dos Itens</w:t>
+        <w:t>Novidades relevantes em relacao a 05/06/2026</w:t>
       </w:r>
     </w:p>
     <w:p>
       <w:pPr>
-        <w:pStyle w:val="Heading2"/>
+        <w:pStyle w:val="ListBullet"/>
       </w:pPr>
       <w:r>
-        <w:t>__init__.py</w:t>
+        <w:t>revisao_final.py virou a ultima auditoria da aula, adicionando confidence_score, avisos_validacao e versao do gerador.</w:t>
       </w:r>
     </w:p>
     <w:p>
       <w:pPr>
-        <w:spacing w:after="80"/>
+        <w:pStyle w:val="ListBullet"/>
       </w:pPr>
       <w:r>
-        <w:rPr>
-          <w:b/>
-        </w:rPr>
-        <w:t xml:space="preserve">Tipo: </w:t>
-      </w:r>
-      <w:r>
-        <w:t>Arquivo</w:t>
+        <w:t>lote.py passou a salvar e reler cache sidecar .json por PDF, validado por hash do arquivo e versao do gerador.</w:t>
       </w:r>
     </w:p>
     <w:p>
       <w:pPr>
-        <w:spacing w:after="80"/>
+        <w:pStyle w:val="ListBullet"/>
       </w:pPr>
       <w:r>
-        <w:rPr>
-          <w:b/>
-        </w:rPr>
-        <w:t xml:space="preserve">Funcao principal: </w:t>
-      </w:r>
-      <w:r>
-        <w:t>Marca a pasta core como pacote Python e habilita os imports internos do sistema.</w:t>
+        <w:t>ia.py hoje trabalha com rascunho_base, isto e, o sistema primeiro monta uma base local e depois pede refinamento a OpenAI ou Gemini.</w:t>
       </w:r>
     </w:p>
     <w:p>
       <w:pPr>
-        <w:spacing w:after="80"/>
+        <w:pStyle w:val="ListBullet"/>
       </w:pPr>
       <w:r>
-        <w:rPr>
-          <w:b/>
-        </w:rPr>
-        <w:t xml:space="preserve">Quando entra no fluxo: </w:t>
-      </w:r>
-      <w:r>
-        <w:t>Aparece em todas as execucoes, porque sem ele o aplicativo, os testes e os scripts perderiam a referencia do pacote core.</w:t>
+        <w:t>core/lib ganhou mais peso com higienizador_pedagogico.py e com reforcos por perfil em acompanhamento e acessibilidade.</w:t>
       </w:r>
     </w:p>
     <w:p>
       <w:pPr>
-        <w:spacing w:after="80"/>
+        <w:pStyle w:val="ListBullet"/>
       </w:pPr>
       <w:r>
-        <w:rPr>
-          <w:b/>
-        </w:rPr>
-        <w:t xml:space="preserve">Observacoes: </w:t>
-      </w:r>
-      <w:r>
-        <w:t>Nao concentra regra de negocio; seu papel hoje e organizacional.</w:t>
+        <w:t>helpers.py e planos_luan_app.py passaram a sustentar melhor a ordem real de envio dos PDFs e a memoria da ultima aula gerada.</w:t>
       </w:r>
     </w:p>
     <w:p>
       <w:pPr>
-        <w:pStyle w:val="Heading2"/>
+        <w:pStyle w:val="ListBullet"/>
       </w:pPr>
       <w:r>
-        <w:t>ae_priorizado.py</w:t>
+        <w:t>classificador.py e metodologia.py receberam classificadores e geradores especializados para Ciencias, Biologia e Historia.</w:t>
       </w:r>
     </w:p>
     <w:p>
+      <w:r>
+        <w:t>Mapa rapido do subpacote core/lib</w:t>
+      </w:r>
+    </w:p>
+    <w:tbl>
+      <w:tblPr>
+        <w:tblStyle w:val="TableGrid"/>
+        <w:tblW w:type="auto" w:w="0"/>
+        <w:tblLook w:firstColumn="1" w:firstRow="1" w:lastColumn="0" w:lastRow="0" w:noHBand="0" w:noVBand="1" w:val="04A0"/>
+      </w:tblPr>
+      <w:tblGrid>
+        <w:gridCol w:w="3120"/>
+        <w:gridCol w:w="3120"/>
+        <w:gridCol w:w="3120"/>
+      </w:tblGrid>
+      <w:tr>
+        <w:tc>
+          <w:tcPr>
+            <w:tcW w:type="dxa" w:w="3120"/>
+          </w:tcPr>
+          <w:p>
+            <w:r>
+              <w:t>Modulo</w:t>
+            </w:r>
+          </w:p>
+        </w:tc>
+        <w:tc>
+          <w:tcPr>
+            <w:tcW w:type="dxa" w:w="3120"/>
+          </w:tcPr>
+          <w:p>
+            <w:r>
+              <w:t>Papel hoje</w:t>
+            </w:r>
+          </w:p>
+        </w:tc>
+        <w:tc>
+          <w:tcPr>
+            <w:tcW w:type="dxa" w:w="3120"/>
+          </w:tcPr>
+          <w:p>
+            <w:r>
+              <w:t>Camada</w:t>
+            </w:r>
+          </w:p>
+        </w:tc>
+      </w:tr>
+      <w:tr>
+        <w:tc>
+          <w:tcPr>
+            <w:tcW w:type="dxa" w:w="3120"/>
+          </w:tcPr>
+          <w:p>
+            <w:r>
+              <w:t>acessibilidade.py</w:t>
+            </w:r>
+          </w:p>
+        </w:tc>
+        <w:tc>
+          <w:tcPr>
+            <w:tcW w:type="dxa" w:w="3120"/>
+          </w:tcPr>
+          <w:p>
+            <w:r>
+              <w:t>Compositor principal de acessibilidade por camadas.</w:t>
+            </w:r>
+          </w:p>
+        </w:tc>
+        <w:tc>
+          <w:tcPr>
+            <w:tcW w:type="dxa" w:w="3120"/>
+          </w:tcPr>
+          <w:p>
+            <w:r>
+              <w:t>core/lib</w:t>
+            </w:r>
+          </w:p>
+        </w:tc>
+      </w:tr>
+      <w:tr>
+        <w:tc>
+          <w:tcPr>
+            <w:tcW w:type="dxa" w:w="3120"/>
+          </w:tcPr>
+          <w:p>
+            <w:r>
+              <w:t>acessibilidade_perfis.py</w:t>
+            </w:r>
+          </w:p>
+        </w:tc>
+        <w:tc>
+          <w:tcPr>
+            <w:tcW w:type="dxa" w:w="3120"/>
+          </w:tcPr>
+          <w:p>
+            <w:r>
+              <w:t>Regras especificas de acessibilidade por disciplina, tipo de aula e tema.</w:t>
+            </w:r>
+          </w:p>
+        </w:tc>
+        <w:tc>
+          <w:tcPr>
+            <w:tcW w:type="dxa" w:w="3120"/>
+          </w:tcPr>
+          <w:p>
+            <w:r>
+              <w:t>core/lib</w:t>
+            </w:r>
+          </w:p>
+        </w:tc>
+      </w:tr>
+      <w:tr>
+        <w:tc>
+          <w:tcPr>
+            <w:tcW w:type="dxa" w:w="3120"/>
+          </w:tcPr>
+          <w:p>
+            <w:r>
+              <w:t>acompanhamento.py</w:t>
+            </w:r>
+          </w:p>
+        </w:tc>
+        <w:tc>
+          <w:tcPr>
+            <w:tcW w:type="dxa" w:w="3120"/>
+          </w:tcPr>
+          <w:p>
+            <w:r>
+              <w:t>Compositor principal do acompanhamento da aprendizagem.</w:t>
+            </w:r>
+          </w:p>
+        </w:tc>
+        <w:tc>
+          <w:tcPr>
+            <w:tcW w:type="dxa" w:w="3120"/>
+          </w:tcPr>
+          <w:p>
+            <w:r>
+              <w:t>core/lib</w:t>
+            </w:r>
+          </w:p>
+        </w:tc>
+      </w:tr>
+      <w:tr>
+        <w:tc>
+          <w:tcPr>
+            <w:tcW w:type="dxa" w:w="3120"/>
+          </w:tcPr>
+          <w:p>
+            <w:r>
+              <w:t>acompanhamento_perfis.py</w:t>
+            </w:r>
+          </w:p>
+        </w:tc>
+        <w:tc>
+          <w:tcPr>
+            <w:tcW w:type="dxa" w:w="3120"/>
+          </w:tcPr>
+          <w:p>
+            <w:r>
+              <w:t>Regras especificas de acompanhamento por disciplina, perfil e tema.</w:t>
+            </w:r>
+          </w:p>
+        </w:tc>
+        <w:tc>
+          <w:tcPr>
+            <w:tcW w:type="dxa" w:w="3120"/>
+          </w:tcPr>
+          <w:p>
+            <w:r>
+              <w:t>core/lib</w:t>
+            </w:r>
+          </w:p>
+        </w:tc>
+      </w:tr>
+      <w:tr>
+        <w:tc>
+          <w:tcPr>
+            <w:tcW w:type="dxa" w:w="3120"/>
+          </w:tcPr>
+          <w:p>
+            <w:r>
+              <w:t>aprofundamento.py</w:t>
+            </w:r>
+          </w:p>
+        </w:tc>
+        <w:tc>
+          <w:tcPr>
+            <w:tcW w:type="dxa" w:w="3120"/>
+          </w:tcPr>
+          <w:p>
+            <w:r>
+              <w:t>Apoia leitura de pistas de aprofundamento, continuidade ou extensao.</w:t>
+            </w:r>
+          </w:p>
+        </w:tc>
+        <w:tc>
+          <w:tcPr>
+            <w:tcW w:type="dxa" w:w="3120"/>
+          </w:tcPr>
+          <w:p>
+            <w:r>
+              <w:t>core/lib</w:t>
+            </w:r>
+          </w:p>
+        </w:tc>
+      </w:tr>
+      <w:tr>
+        <w:tc>
+          <w:tcPr>
+            <w:tcW w:type="dxa" w:w="3120"/>
+          </w:tcPr>
+          <w:p>
+            <w:r>
+              <w:t>classificador.py</w:t>
+            </w:r>
+          </w:p>
+        </w:tc>
+        <w:tc>
+          <w:tcPr>
+            <w:tcW w:type="dxa" w:w="3120"/>
+          </w:tcPr>
+          <w:p>
+            <w:r>
+              <w:t>Classifica perfil da disciplina, tipo de aula, nivel de ensino e contexto pedagogico.</w:t>
+            </w:r>
+          </w:p>
+        </w:tc>
+        <w:tc>
+          <w:tcPr>
+            <w:tcW w:type="dxa" w:w="3120"/>
+          </w:tcPr>
+          <w:p>
+            <w:r>
+              <w:t>core/lib</w:t>
+            </w:r>
+          </w:p>
+        </w:tc>
+      </w:tr>
+      <w:tr>
+        <w:tc>
+          <w:tcPr>
+            <w:tcW w:type="dxa" w:w="3120"/>
+          </w:tcPr>
+          <w:p>
+            <w:r>
+              <w:t>extrator_blocos_pedagogicos.py</w:t>
+            </w:r>
+          </w:p>
+        </w:tc>
+        <w:tc>
+          <w:tcPr>
+            <w:tcW w:type="dxa" w:w="3120"/>
+          </w:tcPr>
+          <w:p>
+            <w:r>
+              <w:t>Extrai blocos pedagogicos menores diretamente do texto do PDF.</w:t>
+            </w:r>
+          </w:p>
+        </w:tc>
+        <w:tc>
+          <w:tcPr>
+            <w:tcW w:type="dxa" w:w="3120"/>
+          </w:tcPr>
+          <w:p>
+            <w:r>
+              <w:t>core/lib</w:t>
+            </w:r>
+          </w:p>
+        </w:tc>
+      </w:tr>
+      <w:tr>
+        <w:tc>
+          <w:tcPr>
+            <w:tcW w:type="dxa" w:w="3120"/>
+          </w:tcPr>
+          <w:p>
+            <w:r>
+              <w:t>extrator_pdf.py</w:t>
+            </w:r>
+          </w:p>
+        </w:tc>
+        <w:tc>
+          <w:tcPr>
+            <w:tcW w:type="dxa" w:w="3120"/>
+          </w:tcPr>
+          <w:p>
+            <w:r>
+              <w:t>Faz leitura, limpeza e limite de texto dos PDFs.</w:t>
+            </w:r>
+          </w:p>
+        </w:tc>
+        <w:tc>
+          <w:tcPr>
+            <w:tcW w:type="dxa" w:w="3120"/>
+          </w:tcPr>
+          <w:p>
+            <w:r>
+              <w:t>core/lib</w:t>
+            </w:r>
+          </w:p>
+        </w:tc>
+      </w:tr>
+      <w:tr>
+        <w:tc>
+          <w:tcPr>
+            <w:tcW w:type="dxa" w:w="3120"/>
+          </w:tcPr>
+          <w:p>
+            <w:r>
+              <w:t>extrator_titulo.py</w:t>
+            </w:r>
+          </w:p>
+        </w:tc>
+        <w:tc>
+          <w:tcPr>
+            <w:tcW w:type="dxa" w:w="3120"/>
+          </w:tcPr>
+          <w:p>
+            <w:r>
+              <w:t>Normaliza e limpa titulos das aulas e materiais digitais.</w:t>
+            </w:r>
+          </w:p>
+        </w:tc>
+        <w:tc>
+          <w:tcPr>
+            <w:tcW w:type="dxa" w:w="3120"/>
+          </w:tcPr>
+          <w:p>
+            <w:r>
+              <w:t>core/lib</w:t>
+            </w:r>
+          </w:p>
+        </w:tc>
+      </w:tr>
+      <w:tr>
+        <w:tc>
+          <w:tcPr>
+            <w:tcW w:type="dxa" w:w="3120"/>
+          </w:tcPr>
+          <w:p>
+            <w:r>
+              <w:t>gerador_colunas_pedagogicas.py</w:t>
+            </w:r>
+          </w:p>
+        </w:tc>
+        <w:tc>
+          <w:tcPr>
+            <w:tcW w:type="dxa" w:w="3120"/>
+          </w:tcPr>
+          <w:p>
+            <w:r>
+              <w:t>Motor modular para aprendizagem, acompanhamento e acessibilidade.</w:t>
+            </w:r>
+          </w:p>
+        </w:tc>
+        <w:tc>
+          <w:tcPr>
+            <w:tcW w:type="dxa" w:w="3120"/>
+          </w:tcPr>
+          <w:p>
+            <w:r>
+              <w:t>core/lib</w:t>
+            </w:r>
+          </w:p>
+        </w:tc>
+      </w:tr>
+      <w:tr>
+        <w:tc>
+          <w:tcPr>
+            <w:tcW w:type="dxa" w:w="3120"/>
+          </w:tcPr>
+          <w:p>
+            <w:r>
+              <w:t>higienizador_pedagogico.py</w:t>
+            </w:r>
+          </w:p>
+        </w:tc>
+        <w:tc>
+          <w:tcPr>
+            <w:tcW w:type="dxa" w:w="3120"/>
+          </w:tcPr>
+          <w:p>
+            <w:r>
+              <w:t>Remove contaminacao tematica e corrige recursos incoerentes com a aula.</w:t>
+            </w:r>
+          </w:p>
+        </w:tc>
+        <w:tc>
+          <w:tcPr>
+            <w:tcW w:type="dxa" w:w="3120"/>
+          </w:tcPr>
+          <w:p>
+            <w:r>
+              <w:t>core/lib</w:t>
+            </w:r>
+          </w:p>
+        </w:tc>
+      </w:tr>
+      <w:tr>
+        <w:tc>
+          <w:tcPr>
+            <w:tcW w:type="dxa" w:w="3120"/>
+          </w:tcPr>
+          <w:p>
+            <w:r>
+              <w:t>metodologia.py</w:t>
+            </w:r>
+          </w:p>
+        </w:tc>
+        <w:tc>
+          <w:tcPr>
+            <w:tcW w:type="dxa" w:w="3120"/>
+          </w:tcPr>
+          <w:p>
+            <w:r>
+              <w:t>Grande motor das etapas metodologicas por disciplina e tipo de aula.</w:t>
+            </w:r>
+          </w:p>
+        </w:tc>
+        <w:tc>
+          <w:tcPr>
+            <w:tcW w:type="dxa" w:w="3120"/>
+          </w:tcPr>
+          <w:p>
+            <w:r>
+              <w:t>core/lib</w:t>
+            </w:r>
+          </w:p>
+        </w:tc>
+      </w:tr>
+      <w:tr>
+        <w:tc>
+          <w:tcPr>
+            <w:tcW w:type="dxa" w:w="3120"/>
+          </w:tcPr>
+          <w:p>
+            <w:r>
+              <w:t>modalidades.py</w:t>
+            </w:r>
+          </w:p>
+        </w:tc>
+        <w:tc>
+          <w:tcPr>
+            <w:tcW w:type="dxa" w:w="3120"/>
+          </w:tcPr>
+          <w:p>
+            <w:r>
+              <w:t>Apoia variacoes por modalidade, incluindo EJA e cenarios especiais.</w:t>
+            </w:r>
+          </w:p>
+        </w:tc>
+        <w:tc>
+          <w:tcPr>
+            <w:tcW w:type="dxa" w:w="3120"/>
+          </w:tcPr>
+          <w:p>
+            <w:r>
+              <w:t>core/lib</w:t>
+            </w:r>
+          </w:p>
+        </w:tc>
+      </w:tr>
+      <w:tr>
+        <w:tc>
+          <w:tcPr>
+            <w:tcW w:type="dxa" w:w="3120"/>
+          </w:tcPr>
+          <w:p>
+            <w:r>
+              <w:t>planejamento_colunas.py</w:t>
+            </w:r>
+          </w:p>
+        </w:tc>
+        <w:tc>
+          <w:tcPr>
+            <w:tcW w:type="dxa" w:w="3120"/>
+          </w:tcPr>
+          <w:p>
+            <w:r>
+              <w:t>Mantem compatibilidade e geracao auxiliar das colunas pedagogicas.</w:t>
+            </w:r>
+          </w:p>
+        </w:tc>
+        <w:tc>
+          <w:tcPr>
+            <w:tcW w:type="dxa" w:w="3120"/>
+          </w:tcPr>
+          <w:p>
+            <w:r>
+              <w:t>core/lib</w:t>
+            </w:r>
+          </w:p>
+        </w:tc>
+      </w:tr>
+      <w:tr>
+        <w:tc>
+          <w:tcPr>
+            <w:tcW w:type="dxa" w:w="3120"/>
+          </w:tcPr>
+          <w:p>
+            <w:r>
+              <w:t>progressao.py</w:t>
+            </w:r>
+          </w:p>
+        </w:tc>
+        <w:tc>
+          <w:tcPr>
+            <w:tcW w:type="dxa" w:w="3120"/>
+          </w:tcPr>
+          <w:p>
+            <w:r>
+              <w:t>Varia verbos, progressao de linguagem e nao repeticao entre aulas.</w:t>
+            </w:r>
+          </w:p>
+        </w:tc>
+        <w:tc>
+          <w:tcPr>
+            <w:tcW w:type="dxa" w:w="3120"/>
+          </w:tcPr>
+          <w:p>
+            <w:r>
+              <w:t>core/lib</w:t>
+            </w:r>
+          </w:p>
+        </w:tc>
+      </w:tr>
+      <w:tr>
+        <w:tc>
+          <w:tcPr>
+            <w:tcW w:type="dxa" w:w="3120"/>
+          </w:tcPr>
+          <w:p>
+            <w:r>
+              <w:t>tecnicas.py</w:t>
+            </w:r>
+          </w:p>
+        </w:tc>
+        <w:tc>
+          <w:tcPr>
+            <w:tcW w:type="dxa" w:w="3120"/>
+          </w:tcPr>
+          <w:p>
+            <w:r>
+              <w:t>Concentra tecnicas pedagogicas e pistas de uso contextual.</w:t>
+            </w:r>
+          </w:p>
+        </w:tc>
+        <w:tc>
+          <w:tcPr>
+            <w:tcW w:type="dxa" w:w="3120"/>
+          </w:tcPr>
+          <w:p>
+            <w:r>
+              <w:t>core/lib</w:t>
+            </w:r>
+          </w:p>
+        </w:tc>
+      </w:tr>
+      <w:tr>
+        <w:tc>
+          <w:tcPr>
+            <w:tcW w:type="dxa" w:w="3120"/>
+          </w:tcPr>
+          <w:p>
+            <w:r>
+              <w:t>extrator_pptx.py</w:t>
+            </w:r>
+          </w:p>
+        </w:tc>
+        <w:tc>
+          <w:tcPr>
+            <w:tcW w:type="dxa" w:w="3120"/>
+          </w:tcPr>
+          <w:p>
+            <w:r>
+              <w:t>Modulo de apoio ainda sem resumo especifico.</w:t>
+            </w:r>
+          </w:p>
+        </w:tc>
+        <w:tc>
+          <w:tcPr>
+            <w:tcW w:type="dxa" w:w="3120"/>
+          </w:tcPr>
+          <w:p>
+            <w:r>
+              <w:t>core/lib</w:t>
+            </w:r>
+          </w:p>
+        </w:tc>
+      </w:tr>
+    </w:tbl>
+    <w:p>
       <w:pPr>
-        <w:spacing w:after="80"/>
+        <w:pStyle w:val="Heading1"/>
       </w:pPr>
       <w:r>
-        <w:rPr>
-          <w:b/>
-        </w:rPr>
-        <w:t xml:space="preserve">Tipo: </w:t>
-      </w:r>
-      <w:r>
-        <w:t>Arquivo</w:t>
+        <w:t>Leitura final da arquitetura atual</w:t>
       </w:r>
     </w:p>
     <w:p>
-      <w:pPr>
-        <w:spacing w:after="80"/>
-      </w:pPr>
       <w:r>
-        <w:rPr>
-          <w:b/>
-        </w:rPr>
-        <w:t xml:space="preserve">Funcao principal: </w:t>
-      </w:r>
-      <w:r>
-        <w:t>Aplica o modo AE priorizado para Portugues, lendo a base em assets/ae_priorizado e trocando a aprendizagem pelo AE correspondente.</w:t>
+        <w:t>Se a pergunta for onde nascem as aulas comuns, a resposta continua sendo core/lote.py, apoiado por extracao e classificacao em core/lib. Se a pergunta for onde o texto fica mais confiavel, hoje os pontos mais importantes sao qualidade_metodologica.py, higienizador_pedagogico.py, validador_plano.py e revisao_final.py. Se a pergunta for onde a IA entra, ela ja nao substitui o motor local: ela entra para refinar um rascunho base e pode cair de volta no motor heuristico se houver erro, timeout ou indisponibilidade externa.</w:t>
       </w:r>
     </w:p>
     <w:p>
-      <w:pPr>
-        <w:spacing w:after="80"/>
-      </w:pPr>
       <w:r>
-        <w:rPr>
-          <w:b/>
-        </w:rPr>
-        <w:t xml:space="preserve">Quando entra no fluxo: </w:t>
-      </w:r>
-      <w:r>
-        <w:t>Entra depois da extracao das aulas dos PDFs. Quando a opcao de AE esta ativa, ele identifica a aula, procura a chave do guia, substitui o texto e ainda reordena as aulas conforme a sequencia do guia.</w:t>
-      </w:r>
-    </w:p>
-    <w:p>
-      <w:pPr>
-        <w:spacing w:after="80"/>
-      </w:pPr>
-      <w:r>
-        <w:rPr>
-          <w:b/>
-        </w:rPr>
-        <w:t xml:space="preserve">Observacoes: </w:t>
-      </w:r>
-      <w:r>
-        <w:t>Hoje esta em modo de teste para Portugues do Ensino Medio no 2o bimestre, mas ja funciona como uma ponte real entre o sistema e o guia priorizado.</w:t>
-      </w:r>
-    </w:p>
-    <w:p>
-      <w:pPr>
-        <w:pStyle w:val="Heading2"/>
-      </w:pPr>
-      <w:r>
-        <w:t>avaliacao.py</w:t>
-      </w:r>
-    </w:p>
-    <w:p>
-      <w:pPr>
-        <w:spacing w:after="80"/>
-      </w:pPr>
-      <w:r>
-        <w:rPr>
-          <w:b/>
-        </w:rPr>
-        <w:t xml:space="preserve">Tipo: </w:t>
-      </w:r>
-      <w:r>
-        <w:t>Arquivo</w:t>
-      </w:r>
-    </w:p>
-    <w:p>
-      <w:pPr>
-        <w:spacing w:after="80"/>
-      </w:pPr>
-      <w:r>
-        <w:rPr>
-          <w:b/>
-        </w:rPr>
-        <w:t xml:space="preserve">Funcao principal: </w:t>
-      </w:r>
-      <w:r>
-        <w:t>Gera frases de acompanhamento da aprendizagem e acessibilidade de forma dinamica.</w:t>
-      </w:r>
-    </w:p>
-    <w:p>
-      <w:pPr>
-        <w:spacing w:after="80"/>
-      </w:pPr>
-      <w:r>
-        <w:rPr>
-          <w:b/>
-        </w:rPr>
-        <w:t xml:space="preserve">Quando entra no fluxo: </w:t>
-      </w:r>
-      <w:r>
-        <w:t>E usado quando o sistema precisa transformar tema, aprendizagem e desenvolvimento em criterios de observacao e apoio ao estudante.</w:t>
-      </w:r>
-    </w:p>
-    <w:p>
-      <w:pPr>
-        <w:spacing w:after="80"/>
-      </w:pPr>
-      <w:r>
-        <w:rPr>
-          <w:b/>
-        </w:rPr>
-        <w:t xml:space="preserve">Observacoes: </w:t>
-      </w:r>
-      <w:r>
-        <w:t>Hoje convive com a camada mais modular de core/lib, funcionando como apoio e compatibilidade pedagogica.</w:t>
-      </w:r>
-    </w:p>
-    <w:p>
-      <w:pPr>
-        <w:pStyle w:val="Heading2"/>
-      </w:pPr>
-      <w:r>
-        <w:t>base_conhecimento.py</w:t>
-      </w:r>
-    </w:p>
-    <w:p>
-      <w:pPr>
-        <w:spacing w:after="80"/>
-      </w:pPr>
-      <w:r>
-        <w:rPr>
-          <w:b/>
-        </w:rPr>
-        <w:t xml:space="preserve">Tipo: </w:t>
-      </w:r>
-      <w:r>
-        <w:t>Arquivo</w:t>
-      </w:r>
-    </w:p>
-    <w:p>
-      <w:pPr>
-        <w:spacing w:after="80"/>
-      </w:pPr>
-      <w:r>
-        <w:rPr>
-          <w:b/>
-        </w:rPr>
-        <w:t xml:space="preserve">Funcao principal: </w:t>
-      </w:r>
-      <w:r>
-        <w:t>Guarda padroes disciplinares e repertorios que ajudam a inteligencia local a montar aulas coerentes.</w:t>
-      </w:r>
-    </w:p>
-    <w:p>
-      <w:pPr>
-        <w:spacing w:after="80"/>
-      </w:pPr>
-      <w:r>
-        <w:rPr>
-          <w:b/>
-        </w:rPr>
-        <w:t xml:space="preserve">Quando entra no fluxo: </w:t>
-      </w:r>
-      <w:r>
-        <w:t>E consultado por modulos que precisam saber quais tecnicas, focos e estruturas costumam combinar com cada disciplina.</w:t>
-      </w:r>
-    </w:p>
-    <w:p>
-      <w:pPr>
-        <w:spacing w:after="80"/>
-      </w:pPr>
-      <w:r>
-        <w:rPr>
-          <w:b/>
-        </w:rPr>
-        <w:t xml:space="preserve">Observacoes: </w:t>
-      </w:r>
-      <w:r>
-        <w:t>Serve como memoria pedagogica reutilizavel do projeto.</w:t>
-      </w:r>
-    </w:p>
-    <w:p>
-      <w:pPr>
-        <w:pStyle w:val="Heading2"/>
-      </w:pPr>
-      <w:r>
-        <w:t>calendario.py</w:t>
-      </w:r>
-    </w:p>
-    <w:p>
-      <w:pPr>
-        <w:spacing w:after="80"/>
-      </w:pPr>
-      <w:r>
-        <w:rPr>
-          <w:b/>
-        </w:rPr>
-        <w:t xml:space="preserve">Tipo: </w:t>
-      </w:r>
-      <w:r>
-        <w:t>Arquivo</w:t>
-      </w:r>
-    </w:p>
-    <w:p>
-      <w:pPr>
-        <w:spacing w:after="80"/>
-      </w:pPr>
-      <w:r>
-        <w:rPr>
-          <w:b/>
-        </w:rPr>
-        <w:t xml:space="preserve">Funcao principal: </w:t>
-      </w:r>
-      <w:r>
-        <w:t>Calcula feriados nacionais, datas sem aula, extensao do mes e filtros de agenda.</w:t>
-      </w:r>
-    </w:p>
-    <w:p>
-      <w:pPr>
-        <w:spacing w:after="80"/>
-      </w:pPr>
-      <w:r>
-        <w:rPr>
-          <w:b/>
-        </w:rPr>
-        <w:t xml:space="preserve">Quando entra no fluxo: </w:t>
-      </w:r>
-      <w:r>
-        <w:t>E chamado na montagem das datas do plano antes do upload dos PDFs, ajudando o app a excluir feriados e pontos facultativos e a completar a ultima semana do mes quando necessario.</w:t>
-      </w:r>
-    </w:p>
-    <w:p>
-      <w:pPr>
-        <w:spacing w:after="80"/>
-      </w:pPr>
-      <w:r>
-        <w:rPr>
-          <w:b/>
-        </w:rPr>
-        <w:t xml:space="preserve">Observacoes: </w:t>
-      </w:r>
-      <w:r>
-        <w:t>Hoje e uma das pecas mais importantes para evitar erro de contagem de aulas e preenchimento indevido em dias sem aula.</w:t>
-      </w:r>
-    </w:p>
-    <w:p>
-      <w:pPr>
-        <w:pStyle w:val="Heading2"/>
-      </w:pPr>
-      <w:r>
-        <w:t>cdp/</w:t>
-      </w:r>
-    </w:p>
-    <w:p>
-      <w:pPr>
-        <w:spacing w:after="80"/>
-      </w:pPr>
-      <w:r>
-        <w:rPr>
-          <w:b/>
-        </w:rPr>
-        <w:t xml:space="preserve">Tipo: </w:t>
-      </w:r>
-      <w:r>
-        <w:t>Pacote</w:t>
-      </w:r>
-    </w:p>
-    <w:p>
-      <w:pPr>
-        <w:spacing w:after="80"/>
-      </w:pPr>
-      <w:r>
-        <w:rPr>
-          <w:b/>
-        </w:rPr>
-        <w:t xml:space="preserve">Funcao principal: </w:t>
-      </w:r>
-      <w:r>
-        <w:t>Concentra a implementacao mais nova do fluxo CDP, especialmente em gerador_cdp.py.</w:t>
-      </w:r>
-    </w:p>
-    <w:p>
-      <w:pPr>
-        <w:spacing w:after="80"/>
-      </w:pPr>
-      <w:r>
-        <w:rPr>
-          <w:b/>
-        </w:rPr>
-        <w:t xml:space="preserve">Quando entra no fluxo: </w:t>
-      </w:r>
-      <w:r>
-        <w:t>Atende os planos CDP contextual, Ensino Medio, Fundamental e multisseriada, montando tema, aprendizagem, metodologia, acompanhamento e acessibilidade a partir das planilhas e documentos locais.</w:t>
-      </w:r>
-    </w:p>
-    <w:p>
-      <w:pPr>
-        <w:spacing w:after="80"/>
-      </w:pPr>
-      <w:r>
-        <w:rPr>
-          <w:b/>
-        </w:rPr>
-        <w:t xml:space="preserve">Observacoes: </w:t>
-      </w:r>
-      <w:r>
-        <w:t>O __init__.py do pacote reexporta tambem o conteudo legado, mantendo compatibilidade com imports antigos.</w:t>
-      </w:r>
-    </w:p>
-    <w:p>
-      <w:pPr>
-        <w:pStyle w:val="Heading2"/>
-      </w:pPr>
-      <w:r>
-        <w:t>cdp_legacy.py</w:t>
-      </w:r>
-    </w:p>
-    <w:p>
-      <w:pPr>
-        <w:spacing w:after="80"/>
-      </w:pPr>
-      <w:r>
-        <w:rPr>
-          <w:b/>
-        </w:rPr>
-        <w:t xml:space="preserve">Tipo: </w:t>
-      </w:r>
-      <w:r>
-        <w:t>Arquivo</w:t>
-      </w:r>
-    </w:p>
-    <w:p>
-      <w:pPr>
-        <w:spacing w:after="80"/>
-      </w:pPr>
-      <w:r>
-        <w:rPr>
-          <w:b/>
-        </w:rPr>
-        <w:t xml:space="preserve">Funcao principal: </w:t>
-      </w:r>
-      <w:r>
-        <w:t>Mantem a logica legada do CDP que ainda serve de base para funcoes importadas pelo pacote core.cdp.</w:t>
-      </w:r>
-    </w:p>
-    <w:p>
-      <w:pPr>
-        <w:spacing w:after="80"/>
-      </w:pPr>
-      <w:r>
-        <w:rPr>
-          <w:b/>
-        </w:rPr>
-        <w:t xml:space="preserve">Quando entra no fluxo: </w:t>
-      </w:r>
-      <w:r>
-        <w:t>Ainda participa do modo CDP por meio da camada de compatibilidade do pacote core/cdp.</w:t>
-      </w:r>
-    </w:p>
-    <w:p>
-      <w:pPr>
-        <w:spacing w:after="80"/>
-      </w:pPr>
-      <w:r>
-        <w:rPr>
-          <w:b/>
-        </w:rPr>
-        <w:t xml:space="preserve">Observacoes: </w:t>
-      </w:r>
-      <w:r>
-        <w:t>Mostra que o sistema esta em transicao: ja existe uma arquitetura mais nova, mas parte da base antiga continua viva.</w:t>
-      </w:r>
-    </w:p>
-    <w:p>
-      <w:pPr>
-        <w:pStyle w:val="Heading2"/>
-      </w:pPr>
-      <w:r>
-        <w:t>cdp_em_docx.py</w:t>
-      </w:r>
-    </w:p>
-    <w:p>
-      <w:pPr>
-        <w:spacing w:after="80"/>
-      </w:pPr>
-      <w:r>
-        <w:rPr>
-          <w:b/>
-        </w:rPr>
-        <w:t xml:space="preserve">Tipo: </w:t>
-      </w:r>
-      <w:r>
-        <w:t>Arquivo</w:t>
-      </w:r>
-    </w:p>
-    <w:p>
-      <w:pPr>
-        <w:spacing w:after="80"/>
-      </w:pPr>
-      <w:r>
-        <w:rPr>
-          <w:b/>
-        </w:rPr>
-        <w:t xml:space="preserve">Funcao principal: </w:t>
-      </w:r>
-      <w:r>
-        <w:t>Reescreve e ajusta documentos DOCX do fluxo CDP, com foco em cenarios como Matematica contextual e Ensino Medio.</w:t>
-      </w:r>
-    </w:p>
-    <w:p>
-      <w:pPr>
-        <w:spacing w:after="80"/>
-      </w:pPr>
-      <w:r>
-        <w:rPr>
-          <w:b/>
-        </w:rPr>
-        <w:t xml:space="preserve">Quando entra no fluxo: </w:t>
-      </w:r>
-      <w:r>
-        <w:t>Entra quando o plano CDP precisa ser corrigido ou reorganizado diretamente no Word, sem passar por um PDF comum.</w:t>
-      </w:r>
-    </w:p>
-    <w:p>
-      <w:pPr>
-        <w:spacing w:after="80"/>
-      </w:pPr>
-      <w:r>
-        <w:rPr>
-          <w:b/>
-        </w:rPr>
-        <w:t xml:space="preserve">Observacoes: </w:t>
-      </w:r>
-      <w:r>
-        <w:t>E a ponte entre o motor CDP e o acabamento final no documento.</w:t>
-      </w:r>
-    </w:p>
-    <w:p>
-      <w:pPr>
-        <w:pStyle w:val="Heading2"/>
-      </w:pPr>
-      <w:r>
-        <w:t>database.py</w:t>
-      </w:r>
-    </w:p>
-    <w:p>
-      <w:pPr>
-        <w:spacing w:after="80"/>
-      </w:pPr>
-      <w:r>
-        <w:rPr>
-          <w:b/>
-        </w:rPr>
-        <w:t xml:space="preserve">Tipo: </w:t>
-      </w:r>
-      <w:r>
-        <w:t>Arquivo</w:t>
-      </w:r>
-    </w:p>
-    <w:p>
-      <w:pPr>
-        <w:spacing w:after="80"/>
-      </w:pPr>
-      <w:r>
-        <w:rPr>
-          <w:b/>
-        </w:rPr>
-        <w:t xml:space="preserve">Funcao principal: </w:t>
-      </w:r>
-      <w:r>
-        <w:t>Controla o banco SQLite do sistema, incluindo professores, turmas, vinculos, template_id, componente curricular e historico dos planos.</w:t>
-      </w:r>
-    </w:p>
-    <w:p>
-      <w:pPr>
-        <w:spacing w:after="80"/>
-      </w:pPr>
-      <w:r>
-        <w:rPr>
-          <w:b/>
-        </w:rPr>
-        <w:t xml:space="preserve">Quando entra no fluxo: </w:t>
-      </w:r>
-      <w:r>
-        <w:t>E usado desde a abertura do app para carregar cadastros e volta a ser usado no final para gravar historico e recuperar arquivos gerados.</w:t>
-      </w:r>
-    </w:p>
-    <w:p>
-      <w:pPr>
-        <w:spacing w:after="80"/>
-      </w:pPr>
-      <w:r>
-        <w:rPr>
-          <w:b/>
-        </w:rPr>
-        <w:t xml:space="preserve">Observacoes: </w:t>
-      </w:r>
-      <w:r>
-        <w:t>Hoje o banco principal usado pelo sistema fica na raiz do projeto e e manipulado por este modulo.</w:t>
-      </w:r>
-    </w:p>
-    <w:p>
-      <w:pPr>
-        <w:pStyle w:val="Heading2"/>
-      </w:pPr>
-      <w:r>
-        <w:t>disciplinas.py</w:t>
-      </w:r>
-    </w:p>
-    <w:p>
-      <w:pPr>
-        <w:spacing w:after="80"/>
-      </w:pPr>
-      <w:r>
-        <w:rPr>
-          <w:b/>
-        </w:rPr>
-        <w:t xml:space="preserve">Tipo: </w:t>
-      </w:r>
-      <w:r>
-        <w:t>Arquivo</w:t>
-      </w:r>
-    </w:p>
-    <w:p>
-      <w:pPr>
-        <w:spacing w:after="80"/>
-      </w:pPr>
-      <w:r>
-        <w:rPr>
-          <w:b/>
-        </w:rPr>
-        <w:t xml:space="preserve">Funcao principal: </w:t>
-      </w:r>
-      <w:r>
-        <w:t>Define disciplinas, bimestres e modos de funcionamento como PDF, CDP e CDP Fundamental.</w:t>
-      </w:r>
-    </w:p>
-    <w:p>
-      <w:pPr>
-        <w:spacing w:after="80"/>
-      </w:pPr>
-      <w:r>
-        <w:rPr>
-          <w:b/>
-        </w:rPr>
-        <w:t xml:space="preserve">Quando entra no fluxo: </w:t>
-      </w:r>
-      <w:r>
-        <w:t>Ajuda a interface e os validadores a entenderem se a disciplina exige PDF, se usa modo contextual ou se ativa algum comportamento especial.</w:t>
-      </w:r>
-    </w:p>
-    <w:p>
-      <w:pPr>
-        <w:spacing w:after="80"/>
-      </w:pPr>
-      <w:r>
-        <w:rPr>
-          <w:b/>
-        </w:rPr>
-        <w:t xml:space="preserve">Observacoes: </w:t>
-      </w:r>
-      <w:r>
-        <w:t>Funciona como catalogo central das modalidades oficiais do app.</w:t>
-      </w:r>
-    </w:p>
-    <w:p>
-      <w:pPr>
-        <w:pStyle w:val="Heading2"/>
-      </w:pPr>
-      <w:r>
-        <w:t>eja/</w:t>
-      </w:r>
-    </w:p>
-    <w:p>
-      <w:pPr>
-        <w:spacing w:after="80"/>
-      </w:pPr>
-      <w:r>
-        <w:rPr>
-          <w:b/>
-        </w:rPr>
-        <w:t xml:space="preserve">Tipo: </w:t>
-      </w:r>
-      <w:r>
-        <w:t>Pacote</w:t>
-      </w:r>
-    </w:p>
-    <w:p>
-      <w:pPr>
-        <w:spacing w:after="80"/>
-      </w:pPr>
-      <w:r>
-        <w:rPr>
-          <w:b/>
-        </w:rPr>
-        <w:t xml:space="preserve">Funcao principal: </w:t>
-      </w:r>
-      <w:r>
-        <w:t>Agrupa adaptacoes para EJA, como consolidacao de blocos e tecnicas com linguagem adequada a jovens e adultos.</w:t>
-      </w:r>
-    </w:p>
-    <w:p>
-      <w:pPr>
-        <w:spacing w:after="80"/>
-      </w:pPr>
-      <w:r>
-        <w:rPr>
-          <w:b/>
-        </w:rPr>
-        <w:t xml:space="preserve">Quando entra no fluxo: </w:t>
-      </w:r>
-      <w:r>
-        <w:t>Entra em disciplinas que suportam modalidade EJA, hoje com destaque para Biologia e Ingles.</w:t>
-      </w:r>
-    </w:p>
-    <w:p>
-      <w:pPr>
-        <w:spacing w:after="80"/>
-      </w:pPr>
-      <w:r>
-        <w:rPr>
-          <w:b/>
-        </w:rPr>
-        <w:t xml:space="preserve">Observacoes: </w:t>
-      </w:r>
-      <w:r>
-        <w:t>Evita que a aula de EJA seja tratada como copia simplificada de uma aula regular.</w:t>
-      </w:r>
-    </w:p>
-    <w:p>
-      <w:pPr>
-        <w:pStyle w:val="Heading2"/>
-      </w:pPr>
-      <w:r>
-        <w:t>helpers.py</w:t>
-      </w:r>
-    </w:p>
-    <w:p>
-      <w:pPr>
-        <w:spacing w:after="80"/>
-      </w:pPr>
-      <w:r>
-        <w:rPr>
-          <w:b/>
-        </w:rPr>
-        <w:t xml:space="preserve">Tipo: </w:t>
-      </w:r>
-      <w:r>
-        <w:t>Arquivo</w:t>
-      </w:r>
-    </w:p>
-    <w:p>
-      <w:pPr>
-        <w:spacing w:after="80"/>
-      </w:pPr>
-      <w:r>
-        <w:rPr>
-          <w:b/>
-        </w:rPr>
-        <w:t xml:space="preserve">Funcao principal: </w:t>
-      </w:r>
-      <w:r>
-        <w:t>Reune funcoes pequenas de formatacao e apoio, como horario_para_plano, texto_lista, relatorio simples e preservacao da ordem de envio dos arquivos.</w:t>
-      </w:r>
-    </w:p>
-    <w:p>
-      <w:pPr>
-        <w:spacing w:after="80"/>
-      </w:pPr>
-      <w:r>
-        <w:rPr>
-          <w:b/>
-        </w:rPr>
-        <w:t xml:space="preserve">Quando entra no fluxo: </w:t>
-      </w:r>
-      <w:r>
-        <w:t>Aparece em varias partes do sistema, principalmente na montagem de horarios, relatorios e tratamento dos PDFs enviados pelo usuario.</w:t>
-      </w:r>
-    </w:p>
-    <w:p>
-      <w:pPr>
-        <w:spacing w:after="80"/>
-      </w:pPr>
-      <w:r>
-        <w:rPr>
-          <w:b/>
-        </w:rPr>
-        <w:t xml:space="preserve">Observacoes: </w:t>
-      </w:r>
-      <w:r>
-        <w:t>Embora pequeno, foi importante nas correcoes recentes da ordem dos PDFs e no polimento do fluxo.</w:t>
-      </w:r>
-    </w:p>
-    <w:p>
-      <w:pPr>
-        <w:pStyle w:val="Heading2"/>
-      </w:pPr>
-      <w:r>
-        <w:t>ia.py</w:t>
-      </w:r>
-    </w:p>
-    <w:p>
-      <w:pPr>
-        <w:spacing w:after="80"/>
-      </w:pPr>
-      <w:r>
-        <w:rPr>
-          <w:b/>
-        </w:rPr>
-        <w:t xml:space="preserve">Tipo: </w:t>
-      </w:r>
-      <w:r>
-        <w:t>Arquivo</w:t>
-      </w:r>
-    </w:p>
-    <w:p>
-      <w:pPr>
-        <w:spacing w:after="80"/>
-      </w:pPr>
-      <w:r>
-        <w:rPr>
-          <w:b/>
-        </w:rPr>
-        <w:t xml:space="preserve">Funcao principal: </w:t>
-      </w:r>
-      <w:r>
-        <w:t>Integra o sistema com OpenAI e Gemini para extrair e montar tema, aprendizagem e metodologia.</w:t>
-      </w:r>
-    </w:p>
-    <w:p>
-      <w:pPr>
-        <w:spacing w:after="80"/>
-      </w:pPr>
-      <w:r>
-        <w:rPr>
-          <w:b/>
-        </w:rPr>
-        <w:t xml:space="preserve">Quando entra no fluxo: </w:t>
-      </w:r>
-      <w:r>
-        <w:t>E acionado quando o usuario escolhe usar IA. Ele prepara prompt, aplica orientacoes por disciplina, traz referencias metodologicas e normaliza a resposta estruturada.</w:t>
-      </w:r>
-    </w:p>
-    <w:p>
-      <w:pPr>
-        <w:spacing w:after="80"/>
-      </w:pPr>
-      <w:r>
-        <w:rPr>
-          <w:b/>
-        </w:rPr>
-        <w:t xml:space="preserve">Observacoes: </w:t>
-      </w:r>
-      <w:r>
-        <w:t>Hoje trabalha junto com validacoes e revisoes textuais para reduzir respostas fracas ou artificiais.</w:t>
-      </w:r>
-    </w:p>
-    <w:p>
-      <w:pPr>
-        <w:pStyle w:val="Heading2"/>
-      </w:pPr>
-      <w:r>
-        <w:t>inteligencia_local.py</w:t>
-      </w:r>
-    </w:p>
-    <w:p>
-      <w:pPr>
-        <w:spacing w:after="80"/>
-      </w:pPr>
-      <w:r>
-        <w:rPr>
-          <w:b/>
-        </w:rPr>
-        <w:t xml:space="preserve">Tipo: </w:t>
-      </w:r>
-      <w:r>
-        <w:t>Arquivo</w:t>
-      </w:r>
-    </w:p>
-    <w:p>
-      <w:pPr>
-        <w:spacing w:after="80"/>
-      </w:pPr>
-      <w:r>
-        <w:rPr>
-          <w:b/>
-        </w:rPr>
-        <w:t xml:space="preserve">Funcao principal: </w:t>
-      </w:r>
-      <w:r>
-        <w:t>Executa heuristicas e geracao local sem depender de IA externa.</w:t>
-      </w:r>
-    </w:p>
-    <w:p>
-      <w:pPr>
-        <w:spacing w:after="80"/>
-      </w:pPr>
-      <w:r>
-        <w:rPr>
-          <w:b/>
-        </w:rPr>
-        <w:t xml:space="preserve">Quando entra no fluxo: </w:t>
-      </w:r>
-      <w:r>
-        <w:t>Serve como alternativa ou apoio ao fluxo com IA, especialmente quando se quer trabalhar so com regras internas do sistema.</w:t>
-      </w:r>
-    </w:p>
-    <w:p>
-      <w:pPr>
-        <w:spacing w:after="80"/>
-      </w:pPr>
-      <w:r>
-        <w:rPr>
-          <w:b/>
-        </w:rPr>
-        <w:t xml:space="preserve">Observacoes: </w:t>
-      </w:r>
-      <w:r>
-        <w:t>Continua importante como reserva de autonomia do projeto.</w:t>
-      </w:r>
-    </w:p>
-    <w:p>
-      <w:pPr>
-        <w:pStyle w:val="Heading2"/>
-      </w:pPr>
-      <w:r>
-        <w:t>lib/</w:t>
-      </w:r>
-    </w:p>
-    <w:p>
-      <w:pPr>
-        <w:spacing w:after="80"/>
-      </w:pPr>
-      <w:r>
-        <w:rPr>
-          <w:b/>
-        </w:rPr>
-        <w:t xml:space="preserve">Tipo: </w:t>
-      </w:r>
-      <w:r>
-        <w:t>Pacote</w:t>
-      </w:r>
-    </w:p>
-    <w:p>
-      <w:pPr>
-        <w:spacing w:after="80"/>
-      </w:pPr>
-      <w:r>
-        <w:rPr>
-          <w:b/>
-        </w:rPr>
-        <w:t xml:space="preserve">Funcao principal: </w:t>
-      </w:r>
-      <w:r>
-        <w:t>Agrupa extratores, classificadores, perfis de acompanhamento e acessibilidade, geradores de colunas pedagogicas, progressao, tecnicas e modalidades.</w:t>
-      </w:r>
-    </w:p>
-    <w:p>
-      <w:pPr>
-        <w:spacing w:after="80"/>
-      </w:pPr>
-      <w:r>
-        <w:rPr>
-          <w:b/>
-        </w:rPr>
-        <w:t xml:space="preserve">Quando entra no fluxo: </w:t>
-      </w:r>
-      <w:r>
-        <w:t>E a camada modular mais reaproveitada pelo lote.py, pela IA e pelos adaptadores pedagogicos.</w:t>
-      </w:r>
-    </w:p>
-    <w:p>
-      <w:pPr>
-        <w:spacing w:after="80"/>
-      </w:pPr>
-      <w:r>
-        <w:rPr>
-          <w:b/>
-        </w:rPr>
-        <w:t xml:space="preserve">Observacoes: </w:t>
-      </w:r>
-      <w:r>
-        <w:t>Hoje a inteligencia pedagogica do sistema esta muito mais espalhada aqui do que estava na versao mais antiga da documentacao.</w:t>
-      </w:r>
-    </w:p>
-    <w:p>
-      <w:pPr>
-        <w:pStyle w:val="Heading2"/>
-      </w:pPr>
-      <w:r>
-        <w:t>lote.py</w:t>
-      </w:r>
-    </w:p>
-    <w:p>
-      <w:pPr>
-        <w:spacing w:after="80"/>
-      </w:pPr>
-      <w:r>
-        <w:rPr>
-          <w:b/>
-        </w:rPr>
-        <w:t xml:space="preserve">Tipo: </w:t>
-      </w:r>
-      <w:r>
-        <w:t>Arquivo</w:t>
-      </w:r>
-    </w:p>
-    <w:p>
-      <w:pPr>
-        <w:spacing w:after="80"/>
-      </w:pPr>
-      <w:r>
-        <w:rPr>
-          <w:b/>
-        </w:rPr>
-        <w:t xml:space="preserve">Funcao principal: </w:t>
-      </w:r>
-      <w:r>
-        <w:t>Transforma PDFs comuns em aulas estruturadas com tema, material, aprendizagem, metodologia, acompanhamento e acessibilidade.</w:t>
-      </w:r>
-    </w:p>
-    <w:p>
-      <w:pPr>
-        <w:spacing w:after="80"/>
-      </w:pPr>
-      <w:r>
-        <w:rPr>
-          <w:b/>
-        </w:rPr>
-        <w:t xml:space="preserve">Quando entra no fluxo: </w:t>
-      </w:r>
-      <w:r>
-        <w:t>E o motor principal do fluxo PDF: extrai texto, identifica titulo e numero da aula, classifica o perfil e monta as colunas pedagogicas.</w:t>
-      </w:r>
-    </w:p>
-    <w:p>
-      <w:pPr>
-        <w:spacing w:after="80"/>
-      </w:pPr>
-      <w:r>
-        <w:rPr>
-          <w:b/>
-        </w:rPr>
-        <w:t xml:space="preserve">Observacoes: </w:t>
-      </w:r>
-      <w:r>
-        <w:t>Continua sendo o coracao da geracao das aulas comuns, mesmo com o crescimento dos subpacotes auxiliares.</w:t>
-      </w:r>
-    </w:p>
-    <w:p>
-      <w:pPr>
-        <w:pStyle w:val="Heading2"/>
-      </w:pPr>
-      <w:r>
-        <w:t>metodologia_texto.py</w:t>
-      </w:r>
-    </w:p>
-    <w:p>
-      <w:pPr>
-        <w:spacing w:after="80"/>
-      </w:pPr>
-      <w:r>
-        <w:rPr>
-          <w:b/>
-        </w:rPr>
-        <w:t xml:space="preserve">Tipo: </w:t>
-      </w:r>
-      <w:r>
-        <w:t>Arquivo</w:t>
-      </w:r>
-    </w:p>
-    <w:p>
-      <w:pPr>
-        <w:spacing w:after="80"/>
-      </w:pPr>
-      <w:r>
-        <w:rPr>
-          <w:b/>
-        </w:rPr>
-        <w:t xml:space="preserve">Funcao principal: </w:t>
-      </w:r>
-      <w:r>
-        <w:t>Faz ajustes linguisticos finos na metodologia, como regularizacao de verbos e polimento de frase.</w:t>
-      </w:r>
-    </w:p>
-    <w:p>
-      <w:pPr>
-        <w:spacing w:after="80"/>
-      </w:pPr>
-      <w:r>
-        <w:rPr>
-          <w:b/>
-        </w:rPr>
-        <w:t xml:space="preserve">Quando entra no fluxo: </w:t>
-      </w:r>
-      <w:r>
-        <w:t>Entra no pos-processamento do texto antes de a aula seguir para validacao e DOCX.</w:t>
-      </w:r>
-    </w:p>
-    <w:p>
-      <w:pPr>
-        <w:spacing w:after="80"/>
-      </w:pPr>
-      <w:r>
-        <w:rPr>
-          <w:b/>
-        </w:rPr>
-        <w:t xml:space="preserve">Observacoes: </w:t>
-      </w:r>
-      <w:r>
-        <w:t>Ajuda a evitar metodologia truncada ou com tom mecanico.</w:t>
-      </w:r>
-    </w:p>
-    <w:p>
-      <w:pPr>
-        <w:pStyle w:val="Heading2"/>
-      </w:pPr>
-      <w:r>
-        <w:t>modelos_docx.py</w:t>
-      </w:r>
-    </w:p>
-    <w:p>
-      <w:pPr>
-        <w:spacing w:after="80"/>
-      </w:pPr>
-      <w:r>
-        <w:rPr>
-          <w:b/>
-        </w:rPr>
-        <w:t xml:space="preserve">Tipo: </w:t>
-      </w:r>
-      <w:r>
-        <w:t>Arquivo</w:t>
-      </w:r>
-    </w:p>
-    <w:p>
-      <w:pPr>
-        <w:spacing w:after="80"/>
-      </w:pPr>
-      <w:r>
-        <w:rPr>
-          <w:b/>
-        </w:rPr>
-        <w:t xml:space="preserve">Funcao principal: </w:t>
-      </w:r>
-      <w:r>
-        <w:t>Resolve o template central correto por contexto, template_id, escola, disciplina e componente curricular.</w:t>
-      </w:r>
-    </w:p>
-    <w:p>
-      <w:pPr>
-        <w:spacing w:after="80"/>
-      </w:pPr>
-      <w:r>
-        <w:rPr>
-          <w:b/>
-        </w:rPr>
-        <w:t xml:space="preserve">Quando entra no fluxo: </w:t>
-      </w:r>
-      <w:r>
-        <w:t>E usado quando o sistema precisa escolher entre MODELOEGLE, MODELOPADRE e MODELOCDP sem depender apenas do arquivo legado do professor.</w:t>
-      </w:r>
-    </w:p>
-    <w:p>
-      <w:pPr>
-        <w:spacing w:after="80"/>
-      </w:pPr>
-      <w:r>
-        <w:rPr>
-          <w:b/>
-        </w:rPr>
-        <w:t xml:space="preserve">Observacoes: </w:t>
-      </w:r>
-      <w:r>
-        <w:t>Foi uma evolucao importante para deixar o fluxo mais previsivel.</w:t>
-      </w:r>
-    </w:p>
-    <w:p>
-      <w:pPr>
-        <w:pStyle w:val="Heading2"/>
-      </w:pPr>
-      <w:r>
-        <w:t>orientacao_estudos_metodologia.py</w:t>
-      </w:r>
-    </w:p>
-    <w:p>
-      <w:pPr>
-        <w:spacing w:after="80"/>
-      </w:pPr>
-      <w:r>
-        <w:rPr>
-          <w:b/>
-        </w:rPr>
-        <w:t xml:space="preserve">Tipo: </w:t>
-      </w:r>
-      <w:r>
-        <w:t>Arquivo</w:t>
-      </w:r>
-    </w:p>
-    <w:p>
-      <w:pPr>
-        <w:spacing w:after="80"/>
-      </w:pPr>
-      <w:r>
-        <w:rPr>
-          <w:b/>
-        </w:rPr>
-        <w:t xml:space="preserve">Funcao principal: </w:t>
-      </w:r>
-      <w:r>
-        <w:t>Gera metodologia altamente especifica para Orientacao de Estudos, com perfis por missao, trilha ou jornada.</w:t>
-      </w:r>
-    </w:p>
-    <w:p>
-      <w:pPr>
-        <w:spacing w:after="80"/>
-      </w:pPr>
-      <w:r>
-        <w:rPr>
-          <w:b/>
-        </w:rPr>
-        <w:t xml:space="preserve">Quando entra no fluxo: </w:t>
-      </w:r>
-      <w:r>
-        <w:t>E usado quando a disciplina exige uma abordagem propria, baseada em objetos, focos e referencias textuais dessa area.</w:t>
-      </w:r>
-    </w:p>
-    <w:p>
-      <w:pPr>
-        <w:spacing w:after="80"/>
-      </w:pPr>
-      <w:r>
-        <w:rPr>
-          <w:b/>
-        </w:rPr>
-        <w:t xml:space="preserve">Observacoes: </w:t>
-      </w:r>
-      <w:r>
-        <w:t>Hoje e um dos modulos especializados mais extensos do projeto.</w:t>
-      </w:r>
-    </w:p>
-    <w:p>
-      <w:pPr>
-        <w:pStyle w:val="Heading2"/>
-      </w:pPr>
-      <w:r>
-        <w:t>orientacao_estudos_objetivos.py</w:t>
-      </w:r>
-    </w:p>
-    <w:p>
-      <w:pPr>
-        <w:spacing w:after="80"/>
-      </w:pPr>
-      <w:r>
-        <w:rPr>
-          <w:b/>
-        </w:rPr>
-        <w:t xml:space="preserve">Tipo: </w:t>
-      </w:r>
-      <w:r>
-        <w:t>Arquivo</w:t>
-      </w:r>
-    </w:p>
-    <w:p>
-      <w:pPr>
-        <w:spacing w:after="80"/>
-      </w:pPr>
-      <w:r>
-        <w:rPr>
-          <w:b/>
-        </w:rPr>
-        <w:t xml:space="preserve">Funcao principal: </w:t>
-      </w:r>
-      <w:r>
-        <w:t>Centraliza objetivos e apoio textual para o fluxo de Orientacao de Estudos.</w:t>
-      </w:r>
-    </w:p>
-    <w:p>
-      <w:pPr>
-        <w:spacing w:after="80"/>
-      </w:pPr>
-      <w:r>
-        <w:rPr>
-          <w:b/>
-        </w:rPr>
-        <w:t xml:space="preserve">Quando entra no fluxo: </w:t>
-      </w:r>
-      <w:r>
-        <w:t>Complementa a montagem da aula nessa disciplina, ajudando na coerencia entre titulo, foco e expectativa de aprendizagem.</w:t>
-      </w:r>
-    </w:p>
-    <w:p>
-      <w:pPr>
-        <w:spacing w:after="80"/>
-      </w:pPr>
-      <w:r>
-        <w:rPr>
-          <w:b/>
-        </w:rPr>
-        <w:t xml:space="preserve">Observacoes: </w:t>
-      </w:r>
-      <w:r>
-        <w:t>Mantem a disciplina menos dependente de regras genericas.</w:t>
-      </w:r>
-    </w:p>
-    <w:p>
-      <w:pPr>
-        <w:pStyle w:val="Heading2"/>
-      </w:pPr>
-      <w:r>
-        <w:t>planos_luan.db</w:t>
-      </w:r>
-    </w:p>
-    <w:p>
-      <w:pPr>
-        <w:spacing w:after="80"/>
-      </w:pPr>
-      <w:r>
-        <w:rPr>
-          <w:b/>
-        </w:rPr>
-        <w:t xml:space="preserve">Tipo: </w:t>
-      </w:r>
-      <w:r>
-        <w:t>Arquivo tecnico</w:t>
-      </w:r>
-    </w:p>
-    <w:p>
-      <w:pPr>
-        <w:spacing w:after="80"/>
-      </w:pPr>
-      <w:r>
-        <w:rPr>
-          <w:b/>
-        </w:rPr>
-        <w:t xml:space="preserve">Funcao principal: </w:t>
-      </w:r>
-      <w:r>
-        <w:t>Arquivo presente dentro da pasta core, mas que nao representa hoje o banco principal de operacao do sistema.</w:t>
-      </w:r>
-    </w:p>
-    <w:p>
-      <w:pPr>
-        <w:spacing w:after="80"/>
-      </w:pPr>
-      <w:r>
-        <w:rPr>
-          <w:b/>
-        </w:rPr>
-        <w:t xml:space="preserve">Quando entra no fluxo: </w:t>
-      </w:r>
-      <w:r>
-        <w:t>Nao deve ser lido como modulo de negocio. O fluxo principal usa o banco gerenciado por core/database.py na raiz do projeto.</w:t>
-      </w:r>
-    </w:p>
-    <w:p>
-      <w:pPr>
-        <w:spacing w:after="80"/>
-      </w:pPr>
-      <w:r>
-        <w:rPr>
-          <w:b/>
-        </w:rPr>
-        <w:t xml:space="preserve">Observacoes: </w:t>
-      </w:r>
-      <w:r>
-        <w:t>Vale documentar sua existencia para evitar confusao futuras.</w:t>
-      </w:r>
-    </w:p>
-    <w:p>
-      <w:pPr>
-        <w:pStyle w:val="Heading2"/>
-      </w:pPr>
-      <w:r>
-        <w:t>professores_planos.py</w:t>
-      </w:r>
-    </w:p>
-    <w:p>
-      <w:pPr>
-        <w:spacing w:after="80"/>
-      </w:pPr>
-      <w:r>
-        <w:rPr>
-          <w:b/>
-        </w:rPr>
-        <w:t xml:space="preserve">Tipo: </w:t>
-      </w:r>
-      <w:r>
-        <w:t>Arquivo</w:t>
-      </w:r>
-    </w:p>
-    <w:p>
-      <w:pPr>
-        <w:spacing w:after="80"/>
-      </w:pPr>
-      <w:r>
-        <w:rPr>
-          <w:b/>
-        </w:rPr>
-        <w:t xml:space="preserve">Funcao principal: </w:t>
-      </w:r>
-      <w:r>
-        <w:t>Le, diagnostica, cria e atualiza modelos DOCX encontrados nas pastas dos professores.</w:t>
-      </w:r>
-    </w:p>
-    <w:p>
-      <w:pPr>
-        <w:spacing w:after="80"/>
-      </w:pPr>
-      <w:r>
-        <w:rPr>
-          <w:b/>
-        </w:rPr>
-        <w:t xml:space="preserve">Quando entra no fluxo: </w:t>
-      </w:r>
-      <w:r>
-        <w:t>Extrai cabecalho, datas, horarios e grade semanal dos planos-modelo e ajuda a converter isso em cadastro reutilizavel no app.</w:t>
-      </w:r>
-    </w:p>
-    <w:p>
-      <w:pPr>
-        <w:spacing w:after="80"/>
-      </w:pPr>
-      <w:r>
-        <w:rPr>
-          <w:b/>
-        </w:rPr>
-        <w:t xml:space="preserve">Observacoes: </w:t>
-      </w:r>
-      <w:r>
-        <w:t>E a ponte entre os arquivos reais do trabalho escolar e a base interna do sistema.</w:t>
-      </w:r>
-    </w:p>
-    <w:p>
-      <w:pPr>
-        <w:pStyle w:val="Heading2"/>
-      </w:pPr>
-      <w:r>
-        <w:t>projeto_vida_escopo.py</w:t>
-      </w:r>
-    </w:p>
-    <w:p>
-      <w:pPr>
-        <w:spacing w:after="80"/>
-      </w:pPr>
-      <w:r>
-        <w:rPr>
-          <w:b/>
-        </w:rPr>
-        <w:t xml:space="preserve">Tipo: </w:t>
-      </w:r>
-      <w:r>
-        <w:t>Arquivo</w:t>
-      </w:r>
-    </w:p>
-    <w:p>
-      <w:pPr>
-        <w:spacing w:after="80"/>
-      </w:pPr>
-      <w:r>
-        <w:rPr>
-          <w:b/>
-        </w:rPr>
-        <w:t xml:space="preserve">Funcao principal: </w:t>
-      </w:r>
-      <w:r>
-        <w:t>Le e interpreta o escopo-sequencia de Projeto de Vida para localizar o item certo por turma, bimestre e aula.</w:t>
-      </w:r>
-    </w:p>
-    <w:p>
-      <w:pPr>
-        <w:spacing w:after="80"/>
-      </w:pPr>
-      <w:r>
-        <w:rPr>
-          <w:b/>
-        </w:rPr>
-        <w:t xml:space="preserve">Quando entra no fluxo: </w:t>
-      </w:r>
-      <w:r>
-        <w:t>Entra quando Projeto de Vida precisa de um tratamento proprio, sem cair no comportamento generico das outras disciplinas.</w:t>
-      </w:r>
-    </w:p>
-    <w:p>
-      <w:pPr>
-        <w:spacing w:after="80"/>
-      </w:pPr>
-      <w:r>
-        <w:rPr>
-          <w:b/>
-        </w:rPr>
-        <w:t xml:space="preserve">Observacoes: </w:t>
-      </w:r>
-      <w:r>
-        <w:t>Ajuda o sistema a respeitar a logica pedagogica especifica desse componente.</w:t>
-      </w:r>
-    </w:p>
-    <w:p>
-      <w:pPr>
-        <w:pStyle w:val="Heading2"/>
-      </w:pPr>
-      <w:r>
-        <w:t>prompts_por_disciplina.py</w:t>
-      </w:r>
-    </w:p>
-    <w:p>
-      <w:pPr>
-        <w:spacing w:after="80"/>
-      </w:pPr>
-      <w:r>
-        <w:rPr>
-          <w:b/>
-        </w:rPr>
-        <w:t xml:space="preserve">Tipo: </w:t>
-      </w:r>
-      <w:r>
-        <w:t>Arquivo</w:t>
-      </w:r>
-    </w:p>
-    <w:p>
-      <w:pPr>
-        <w:spacing w:after="80"/>
-      </w:pPr>
-      <w:r>
-        <w:rPr>
-          <w:b/>
-        </w:rPr>
-        <w:t xml:space="preserve">Funcao principal: </w:t>
-      </w:r>
-      <w:r>
-        <w:t>Guarda orientacoes por disciplina usadas pelo modulo de IA.</w:t>
-      </w:r>
-    </w:p>
-    <w:p>
-      <w:pPr>
-        <w:spacing w:after="80"/>
-      </w:pPr>
-      <w:r>
-        <w:rPr>
-          <w:b/>
-        </w:rPr>
-        <w:t xml:space="preserve">Quando entra no fluxo: </w:t>
-      </w:r>
-      <w:r>
-        <w:t>Ajuda a montar instrucoes diferentes para Portugues, Matematica, Projeto de Vida, Redacao e outras areas.</w:t>
-      </w:r>
-    </w:p>
-    <w:p>
-      <w:pPr>
-        <w:spacing w:after="80"/>
-      </w:pPr>
-      <w:r>
-        <w:rPr>
-          <w:b/>
-        </w:rPr>
-        <w:t xml:space="preserve">Observacoes: </w:t>
-      </w:r>
-      <w:r>
-        <w:t>Evita que o comportamento da IA fique uniforme demais entre disciplinas muito diferentes.</w:t>
-      </w:r>
-    </w:p>
-    <w:p>
-      <w:pPr>
-        <w:pStyle w:val="Heading2"/>
-      </w:pPr>
-      <w:r>
-        <w:t>qualidade_metodologica.py</w:t>
-      </w:r>
-    </w:p>
-    <w:p>
-      <w:pPr>
-        <w:spacing w:after="80"/>
-      </w:pPr>
-      <w:r>
-        <w:rPr>
-          <w:b/>
-        </w:rPr>
-        <w:t xml:space="preserve">Tipo: </w:t>
-      </w:r>
-      <w:r>
-        <w:t>Arquivo</w:t>
-      </w:r>
-    </w:p>
-    <w:p>
-      <w:pPr>
-        <w:spacing w:after="80"/>
-      </w:pPr>
-      <w:r>
-        <w:rPr>
-          <w:b/>
-        </w:rPr>
-        <w:t xml:space="preserve">Funcao principal: </w:t>
-      </w:r>
-      <w:r>
-        <w:t>Revisa metodologia, corrige ortografia, detecta contexto pedagogico, naturaliza texto e combate mojibake.</w:t>
-      </w:r>
-    </w:p>
-    <w:p>
-      <w:pPr>
-        <w:spacing w:after="80"/>
-      </w:pPr>
-      <w:r>
-        <w:rPr>
-          <w:b/>
-        </w:rPr>
-        <w:t xml:space="preserve">Quando entra no fluxo: </w:t>
-      </w:r>
-      <w:r>
-        <w:t>Entra entre a geracao da aula e a validacao final, funcionando como camada de saneamento textual e pedagogico.</w:t>
-      </w:r>
-    </w:p>
-    <w:p>
-      <w:pPr>
-        <w:spacing w:after="80"/>
-      </w:pPr>
-      <w:r>
-        <w:rPr>
-          <w:b/>
-        </w:rPr>
-        <w:t xml:space="preserve">Observacoes: </w:t>
-      </w:r>
-      <w:r>
-        <w:t>E um dos modulos que mais contribuem para o plano final ficar profissional.</w:t>
-      </w:r>
-    </w:p>
-    <w:p>
-      <w:pPr>
-        <w:pStyle w:val="Heading2"/>
-      </w:pPr>
-      <w:r>
-        <w:t>redacao_leitura_metodologia.py</w:t>
-      </w:r>
-    </w:p>
-    <w:p>
-      <w:pPr>
-        <w:spacing w:after="80"/>
-      </w:pPr>
-      <w:r>
-        <w:rPr>
-          <w:b/>
-        </w:rPr>
-        <w:t xml:space="preserve">Tipo: </w:t>
-      </w:r>
-      <w:r>
-        <w:t>Arquivo</w:t>
-      </w:r>
-    </w:p>
-    <w:p>
-      <w:pPr>
-        <w:spacing w:after="80"/>
-      </w:pPr>
-      <w:r>
-        <w:rPr>
-          <w:b/>
-        </w:rPr>
-        <w:t xml:space="preserve">Funcao principal: </w:t>
-      </w:r>
-      <w:r>
-        <w:t>Gera a estrutura metodologica de Redacao e Leitura com etapas fixas e criterios mais autorais.</w:t>
-      </w:r>
-    </w:p>
-    <w:p>
-      <w:pPr>
-        <w:spacing w:after="80"/>
-      </w:pPr>
-      <w:r>
-        <w:rPr>
-          <w:b/>
-        </w:rPr>
-        <w:t xml:space="preserve">Quando entra no fluxo: </w:t>
-      </w:r>
-      <w:r>
-        <w:t>Atua quando o sistema identifica perfis como leitura literaria, planejamento de producao, devolutiva e producao final.</w:t>
-      </w:r>
-    </w:p>
-    <w:p>
-      <w:pPr>
-        <w:spacing w:after="80"/>
-      </w:pPr>
-      <w:r>
-        <w:rPr>
-          <w:b/>
-        </w:rPr>
-        <w:t xml:space="preserve">Observacoes: </w:t>
-      </w:r>
-      <w:r>
-        <w:t>Foi uma ampliacao importante do repertorio especializado do projeto.</w:t>
-      </w:r>
-    </w:p>
-    <w:p>
-      <w:pPr>
-        <w:pStyle w:val="Heading2"/>
-      </w:pPr>
-      <w:r>
-        <w:t>referencias_metodologia.py</w:t>
-      </w:r>
-    </w:p>
-    <w:p>
-      <w:pPr>
-        <w:spacing w:after="80"/>
-      </w:pPr>
-      <w:r>
-        <w:rPr>
-          <w:b/>
-        </w:rPr>
-        <w:t xml:space="preserve">Tipo: </w:t>
-      </w:r>
-      <w:r>
-        <w:t>Arquivo</w:t>
-      </w:r>
-    </w:p>
-    <w:p>
-      <w:pPr>
-        <w:spacing w:after="80"/>
-      </w:pPr>
-      <w:r>
-        <w:rPr>
-          <w:b/>
-        </w:rPr>
-        <w:t xml:space="preserve">Funcao principal: </w:t>
-      </w:r>
-      <w:r>
-        <w:t>Carrega textos de referencia metodologica salvos no projeto.</w:t>
-      </w:r>
-    </w:p>
-    <w:p>
-      <w:pPr>
-        <w:spacing w:after="80"/>
-      </w:pPr>
-      <w:r>
-        <w:rPr>
-          <w:b/>
-        </w:rPr>
-        <w:t xml:space="preserve">Quando entra no fluxo: </w:t>
-      </w:r>
-      <w:r>
-        <w:t>Entrega material de apoio por disciplina e turma para a IA e para modulos que precisam reforcar o tom pedagogico esperado.</w:t>
-      </w:r>
-    </w:p>
-    <w:p>
-      <w:pPr>
-        <w:spacing w:after="80"/>
-      </w:pPr>
-      <w:r>
-        <w:rPr>
-          <w:b/>
-        </w:rPr>
-        <w:t xml:space="preserve">Observacoes: </w:t>
-      </w:r>
-      <w:r>
-        <w:t>Funciona como uma biblioteca interna de memoria metodologica.</w:t>
-      </w:r>
-    </w:p>
-    <w:p>
-      <w:pPr>
-        <w:pStyle w:val="Heading2"/>
-      </w:pPr>
-      <w:r>
-        <w:t>validador_plano.py</w:t>
-      </w:r>
-    </w:p>
-    <w:p>
-      <w:pPr>
-        <w:spacing w:after="80"/>
-      </w:pPr>
-      <w:r>
-        <w:rPr>
-          <w:b/>
-        </w:rPr>
-        <w:t xml:space="preserve">Tipo: </w:t>
-      </w:r>
-      <w:r>
-        <w:t>Arquivo</w:t>
-      </w:r>
-    </w:p>
-    <w:p>
-      <w:pPr>
-        <w:spacing w:after="80"/>
-      </w:pPr>
-      <w:r>
-        <w:rPr>
-          <w:b/>
-        </w:rPr>
-        <w:t xml:space="preserve">Funcao principal: </w:t>
-      </w:r>
-      <w:r>
-        <w:t>Valida aulas geradas e detecta problemas como tema repetido, metodologia pobre, aprendizagem curta e campos vazios.</w:t>
-      </w:r>
-    </w:p>
-    <w:p>
-      <w:pPr>
-        <w:spacing w:after="80"/>
-      </w:pPr>
-      <w:r>
-        <w:rPr>
-          <w:b/>
-        </w:rPr>
-        <w:t xml:space="preserve">Quando entra no fluxo: </w:t>
-      </w:r>
-      <w:r>
-        <w:t>E uma das ultimas barreiras antes da revisao do usuario e da geracao do DOCX.</w:t>
-      </w:r>
-    </w:p>
-    <w:p>
-      <w:pPr>
-        <w:spacing w:after="80"/>
-      </w:pPr>
-      <w:r>
-        <w:rPr>
-          <w:b/>
-        </w:rPr>
-        <w:t xml:space="preserve">Observacoes: </w:t>
-      </w:r>
-      <w:r>
-        <w:t>Hoje tambem protege o sistema de contaminacao semantica entre disciplinas.</w:t>
+        <w:t>No CDP, a leitura correta continua sendo em duas camadas: core/cdp como nucleo atual e cdp_legacy.py como compatibilidade ainda ativa. No restante do sistema, a principal mudanca de maturidade foi a presenca de uma trilha completa de saneamento: extracao, classificacao, geracao, higienizacao, validacao, auditoria final e cache reaproveitavel por PDF.</w:t>
       </w:r>
     </w:p>
     <w:p>
@@ -3142,72 +2124,17 @@
         <w:pStyle w:val="Heading1"/>
       </w:pPr>
       <w:r>
-        <w:t>Leitura Final da Arquitetura Atual</w:t>
+        <w:t>Observacao importante</w:t>
       </w:r>
     </w:p>
     <w:p>
-      <w:pPr>
-        <w:pStyle w:val="ListBullet"/>
-        <w:spacing w:after="80"/>
-      </w:pPr>
       <w:r>
-        <w:t>Se a pergunta for "onde nascem as aulas comuns a partir dos PDFs?", a resposta principal continua sendo lote.py, apoiado hoje por uma base modular mais forte em core/lib.</w:t>
-      </w:r>
-    </w:p>
-    <w:p>
-      <w:pPr>
-        <w:pStyle w:val="ListBullet"/>
-        <w:spacing w:after="80"/>
-      </w:pPr>
-      <w:r>
-        <w:t>Se a pergunta for "onde esta o cadastro e o historico?", a resposta continua sendo core/database.py, mas com mais responsabilidade do que antes por causa de template_id e componente curricular.</w:t>
-      </w:r>
-    </w:p>
-    <w:p>
-      <w:pPr>
-        <w:pStyle w:val="ListBullet"/>
-        <w:spacing w:after="80"/>
-      </w:pPr>
-      <w:r>
-        <w:t>Se a pergunta for "onde o sistema entende o CDP?", a resposta agora precisa citar dois niveis: o pacote core/cdp como camada atual e cdp_legacy.py como camada de compatibilidade ainda em uso.</w:t>
-      </w:r>
-    </w:p>
-    <w:p>
-      <w:pPr>
-        <w:pStyle w:val="ListBullet"/>
-        <w:spacing w:after="80"/>
-      </w:pPr>
-      <w:r>
-        <w:t>Se a pergunta for "onde entram as novidades do guia priorizado?", a resposta e ae_priorizado.py junto da base em assets/ae_priorizado.</w:t>
-      </w:r>
-    </w:p>
-    <w:p>
-      <w:pPr>
-        <w:pStyle w:val="ListBullet"/>
-        <w:spacing w:after="80"/>
-      </w:pPr>
-      <w:r>
-        <w:t>Se a pergunta for "onde o texto final e saneado?", os destaques continuam sendo qualidade_metodologica.py, metodologia_texto.py e validador_plano.py.</w:t>
-      </w:r>
-    </w:p>
-    <w:p/>
-    <w:p>
-      <w:pPr>
-        <w:spacing w:after="80"/>
-      </w:pPr>
-      <w:r>
-        <w:rPr>
-          <w:b/>
-        </w:rPr>
-        <w:t xml:space="preserve">Observacao importante: </w:t>
-      </w:r>
-      <w:r>
-        <w:t>Esta documentacao descreve o estado atual observado em 05/06/2026. Como o projeto ainda tem camadas novas e legadas convivendo, o texto deve ser revisado sempre que a estrutura de core mudar de forma relevante.</w:t>
+        <w:t>Esta documentacao descreve o estado atual observado em 17/06/2026. Ela passou a ser regenerada por script interno para reduzir envelhecimento entre uma rodada de melhorias e outra.</w:t>
       </w:r>
     </w:p>
     <w:sectPr>
       <w:pgSz w:w="12240" w:h="15840"/>
-      <w:pgMar w:top="1152" w:right="1296" w:bottom="1080" w:left="1296" w:header="720" w:footer="720" w:gutter="0"/>
+      <w:pgMar w:top="1440" w:right="1440" w:bottom="1440" w:left="1440" w:header="720" w:footer="720" w:gutter="0"/>
       <w:cols w:space="720"/>
       <w:docGrid w:linePitch="360"/>
     </w:sectPr>
@@ -3579,8 +2506,8 @@
     <w:qFormat/>
     <w:rsid w:val="00FC693F"/>
     <w:rPr>
-      <w:rFonts w:ascii="Arial" w:hAnsi="Arial"/>
-      <w:sz w:val="21"/>
+      <w:rFonts w:ascii="Calibri" w:hAnsi="Calibri"/>
+      <w:sz w:val="22"/>
     </w:rPr>
   </w:style>
   <w:style w:type="paragraph" w:styleId="Header">
@@ -3642,11 +2569,11 @@
       <w:outlineLvl w:val="0"/>
     </w:pPr>
     <w:rPr>
-      <w:rFonts w:asciiTheme="majorHAnsi" w:eastAsiaTheme="majorEastAsia" w:hAnsiTheme="majorHAnsi" w:cstheme="majorBidi" w:ascii="Arial" w:hAnsi="Arial"/>
+      <w:rFonts w:asciiTheme="majorHAnsi" w:eastAsiaTheme="majorEastAsia" w:hAnsiTheme="majorHAnsi" w:cstheme="majorBidi" w:ascii="Calibri" w:hAnsi="Calibri"/>
       <w:b/>
       <w:bCs/>
-      <w:color w:val="1F4E79"/>
-      <w:sz w:val="30"/>
+      <w:color w:val="365F91" w:themeColor="accent1" w:themeShade="BF"/>
+      <w:sz w:val="28"/>
       <w:szCs w:val="28"/>
     </w:rPr>
   </w:style>
@@ -3666,11 +2593,11 @@
       <w:outlineLvl w:val="1"/>
     </w:pPr>
     <w:rPr>
-      <w:rFonts w:asciiTheme="majorHAnsi" w:eastAsiaTheme="majorEastAsia" w:hAnsiTheme="majorHAnsi" w:cstheme="majorBidi" w:ascii="Arial" w:hAnsi="Arial"/>
+      <w:rFonts w:asciiTheme="majorHAnsi" w:eastAsiaTheme="majorEastAsia" w:hAnsiTheme="majorHAnsi" w:cstheme="majorBidi" w:ascii="Calibri" w:hAnsi="Calibri"/>
       <w:b/>
       <w:bCs/>
-      <w:color w:val="1F4E79"/>
-      <w:sz w:val="23"/>
+      <w:color w:val="4F81BD" w:themeColor="accent1"/>
+      <w:sz w:val="24"/>
       <w:szCs w:val="26"/>
     </w:rPr>
   </w:style>
@@ -3931,12 +2858,11 @@
       <w:contextualSpacing/>
     </w:pPr>
     <w:rPr>
-      <w:rFonts w:asciiTheme="majorHAnsi" w:eastAsiaTheme="majorEastAsia" w:hAnsiTheme="majorHAnsi" w:cstheme="majorBidi" w:ascii="Arial" w:hAnsi="Arial"/>
-      <w:b/>
-      <w:color w:val="194373"/>
+      <w:rFonts w:asciiTheme="majorHAnsi" w:eastAsiaTheme="majorEastAsia" w:hAnsiTheme="majorHAnsi" w:cstheme="majorBidi" w:ascii="Calibri" w:hAnsi="Calibri"/>
+      <w:color w:val="17365D" w:themeColor="text2" w:themeShade="BF"/>
       <w:spacing w:val="5"/>
       <w:kern w:val="28"/>
-      <w:sz w:val="44"/>
+      <w:sz w:val="36"/>
       <w:szCs w:val="52"/>
     </w:rPr>
   </w:style>

</xml_diff>

<commit_message>
Implementa referencias CDP e novas disciplinas
</commit_message>
<xml_diff>
--- a/DOCUMENTACAO_ESTRUTURA_CORE_PLANOS_LUAN.docx
+++ b/DOCUMENTACAO_ESTRUTURA_CORE_PLANOS_LUAN.docx
@@ -16,7 +16,7 @@
     </w:p>
     <w:p>
       <w:r>
-        <w:t>Documento atualizado automaticamente em 17/06/2026 às 00:42, em linguagem simples, com foco na estrutura real observada no codigo.</w:t>
+        <w:t>Documento atualizado automaticamente em 21/06/2026 às 20:23, em linguagem simples, com foco na estrutura real observada no codigo.</w:t>
       </w:r>
     </w:p>
     <w:p>
@@ -55,7 +55,7 @@
         <w:pStyle w:val="ListBullet"/>
       </w:pPr>
       <w:r>
-        <w:t>Arquivos Python diretos em core: 27</w:t>
+        <w:t>Arquivos Python diretos em core: 35</w:t>
       </w:r>
     </w:p>
     <w:p>
@@ -71,7 +71,7 @@
         <w:pStyle w:val="ListBullet"/>
       </w:pPr>
       <w:r>
-        <w:t>Arquivos de teste em tests/: 59</w:t>
+        <w:t>Arquivos de teste em tests/: 66</w:t>
       </w:r>
     </w:p>
     <w:p>
@@ -1451,6 +1451,342 @@
           </w:p>
         </w:tc>
       </w:tr>
+      <w:tr>
+        <w:tc>
+          <w:tcPr>
+            <w:tcW w:type="dxa" w:w="2340"/>
+          </w:tcPr>
+          <w:p>
+            <w:r>
+              <w:t>educacao_financeira_validacao.py</w:t>
+            </w:r>
+          </w:p>
+        </w:tc>
+        <w:tc>
+          <w:tcPr>
+            <w:tcW w:type="dxa" w:w="2340"/>
+          </w:tcPr>
+          <w:p>
+            <w:r>
+              <w:t>Arquivo</w:t>
+            </w:r>
+          </w:p>
+        </w:tc>
+        <w:tc>
+          <w:tcPr>
+            <w:tcW w:type="dxa" w:w="2340"/>
+          </w:tcPr>
+          <w:p>
+            <w:r>
+              <w:t>Modulo ainda nao classificado nesta documentacao automatica.</w:t>
+            </w:r>
+          </w:p>
+        </w:tc>
+        <w:tc>
+          <w:tcPr>
+            <w:tcW w:type="dxa" w:w="2340"/>
+          </w:tcPr>
+          <w:p>
+            <w:r>
+              <w:t>A revisar</w:t>
+            </w:r>
+          </w:p>
+        </w:tc>
+      </w:tr>
+      <w:tr>
+        <w:tc>
+          <w:tcPr>
+            <w:tcW w:type="dxa" w:w="2340"/>
+          </w:tcPr>
+          <w:p>
+            <w:r>
+              <w:t>listas_pedagogicas.py</w:t>
+            </w:r>
+          </w:p>
+        </w:tc>
+        <w:tc>
+          <w:tcPr>
+            <w:tcW w:type="dxa" w:w="2340"/>
+          </w:tcPr>
+          <w:p>
+            <w:r>
+              <w:t>Arquivo</w:t>
+            </w:r>
+          </w:p>
+        </w:tc>
+        <w:tc>
+          <w:tcPr>
+            <w:tcW w:type="dxa" w:w="2340"/>
+          </w:tcPr>
+          <w:p>
+            <w:r>
+              <w:t>Modulo ainda nao classificado nesta documentacao automatica.</w:t>
+            </w:r>
+          </w:p>
+        </w:tc>
+        <w:tc>
+          <w:tcPr>
+            <w:tcW w:type="dxa" w:w="2340"/>
+          </w:tcPr>
+          <w:p>
+            <w:r>
+              <w:t>A revisar</w:t>
+            </w:r>
+          </w:p>
+        </w:tc>
+      </w:tr>
+      <w:tr>
+        <w:tc>
+          <w:tcPr>
+            <w:tcW w:type="dxa" w:w="2340"/>
+          </w:tcPr>
+          <w:p>
+            <w:r>
+              <w:t>referencias_biologia.py</w:t>
+            </w:r>
+          </w:p>
+        </w:tc>
+        <w:tc>
+          <w:tcPr>
+            <w:tcW w:type="dxa" w:w="2340"/>
+          </w:tcPr>
+          <w:p>
+            <w:r>
+              <w:t>Arquivo</w:t>
+            </w:r>
+          </w:p>
+        </w:tc>
+        <w:tc>
+          <w:tcPr>
+            <w:tcW w:type="dxa" w:w="2340"/>
+          </w:tcPr>
+          <w:p>
+            <w:r>
+              <w:t>Modulo ainda nao classificado nesta documentacao automatica.</w:t>
+            </w:r>
+          </w:p>
+        </w:tc>
+        <w:tc>
+          <w:tcPr>
+            <w:tcW w:type="dxa" w:w="2340"/>
+          </w:tcPr>
+          <w:p>
+            <w:r>
+              <w:t>A revisar</w:t>
+            </w:r>
+          </w:p>
+        </w:tc>
+      </w:tr>
+      <w:tr>
+        <w:tc>
+          <w:tcPr>
+            <w:tcW w:type="dxa" w:w="2340"/>
+          </w:tcPr>
+          <w:p>
+            <w:r>
+              <w:t>referencias_educacao_financeira.py</w:t>
+            </w:r>
+          </w:p>
+        </w:tc>
+        <w:tc>
+          <w:tcPr>
+            <w:tcW w:type="dxa" w:w="2340"/>
+          </w:tcPr>
+          <w:p>
+            <w:r>
+              <w:t>Arquivo</w:t>
+            </w:r>
+          </w:p>
+        </w:tc>
+        <w:tc>
+          <w:tcPr>
+            <w:tcW w:type="dxa" w:w="2340"/>
+          </w:tcPr>
+          <w:p>
+            <w:r>
+              <w:t>Modulo ainda nao classificado nesta documentacao automatica.</w:t>
+            </w:r>
+          </w:p>
+        </w:tc>
+        <w:tc>
+          <w:tcPr>
+            <w:tcW w:type="dxa" w:w="2340"/>
+          </w:tcPr>
+          <w:p>
+            <w:r>
+              <w:t>A revisar</w:t>
+            </w:r>
+          </w:p>
+        </w:tc>
+      </w:tr>
+      <w:tr>
+        <w:tc>
+          <w:tcPr>
+            <w:tcW w:type="dxa" w:w="2340"/>
+          </w:tcPr>
+          <w:p>
+            <w:r>
+              <w:t>referencias_geografia.py</w:t>
+            </w:r>
+          </w:p>
+        </w:tc>
+        <w:tc>
+          <w:tcPr>
+            <w:tcW w:type="dxa" w:w="2340"/>
+          </w:tcPr>
+          <w:p>
+            <w:r>
+              <w:t>Arquivo</w:t>
+            </w:r>
+          </w:p>
+        </w:tc>
+        <w:tc>
+          <w:tcPr>
+            <w:tcW w:type="dxa" w:w="2340"/>
+          </w:tcPr>
+          <w:p>
+            <w:r>
+              <w:t>Modulo ainda nao classificado nesta documentacao automatica.</w:t>
+            </w:r>
+          </w:p>
+        </w:tc>
+        <w:tc>
+          <w:tcPr>
+            <w:tcW w:type="dxa" w:w="2340"/>
+          </w:tcPr>
+          <w:p>
+            <w:r>
+              <w:t>A revisar</w:t>
+            </w:r>
+          </w:p>
+        </w:tc>
+      </w:tr>
+      <w:tr>
+        <w:tc>
+          <w:tcPr>
+            <w:tcW w:type="dxa" w:w="2340"/>
+          </w:tcPr>
+          <w:p>
+            <w:r>
+              <w:t>referencias_projeto_vida.py</w:t>
+            </w:r>
+          </w:p>
+        </w:tc>
+        <w:tc>
+          <w:tcPr>
+            <w:tcW w:type="dxa" w:w="2340"/>
+          </w:tcPr>
+          <w:p>
+            <w:r>
+              <w:t>Arquivo</w:t>
+            </w:r>
+          </w:p>
+        </w:tc>
+        <w:tc>
+          <w:tcPr>
+            <w:tcW w:type="dxa" w:w="2340"/>
+          </w:tcPr>
+          <w:p>
+            <w:r>
+              <w:t>Modulo ainda nao classificado nesta documentacao automatica.</w:t>
+            </w:r>
+          </w:p>
+        </w:tc>
+        <w:tc>
+          <w:tcPr>
+            <w:tcW w:type="dxa" w:w="2340"/>
+          </w:tcPr>
+          <w:p>
+            <w:r>
+              <w:t>A revisar</w:t>
+            </w:r>
+          </w:p>
+        </w:tc>
+      </w:tr>
+      <w:tr>
+        <w:tc>
+          <w:tcPr>
+            <w:tcW w:type="dxa" w:w="2340"/>
+          </w:tcPr>
+          <w:p>
+            <w:r>
+              <w:t>turmas.py</w:t>
+            </w:r>
+          </w:p>
+        </w:tc>
+        <w:tc>
+          <w:tcPr>
+            <w:tcW w:type="dxa" w:w="2340"/>
+          </w:tcPr>
+          <w:p>
+            <w:r>
+              <w:t>Arquivo</w:t>
+            </w:r>
+          </w:p>
+        </w:tc>
+        <w:tc>
+          <w:tcPr>
+            <w:tcW w:type="dxa" w:w="2340"/>
+          </w:tcPr>
+          <w:p>
+            <w:r>
+              <w:t>Modulo ainda nao classificado nesta documentacao automatica.</w:t>
+            </w:r>
+          </w:p>
+        </w:tc>
+        <w:tc>
+          <w:tcPr>
+            <w:tcW w:type="dxa" w:w="2340"/>
+          </w:tcPr>
+          <w:p>
+            <w:r>
+              <w:t>A revisar</w:t>
+            </w:r>
+          </w:p>
+        </w:tc>
+      </w:tr>
+      <w:tr>
+        <w:tc>
+          <w:tcPr>
+            <w:tcW w:type="dxa" w:w="2340"/>
+          </w:tcPr>
+          <w:p>
+            <w:r>
+              <w:t>variacao_metodologica.py</w:t>
+            </w:r>
+          </w:p>
+        </w:tc>
+        <w:tc>
+          <w:tcPr>
+            <w:tcW w:type="dxa" w:w="2340"/>
+          </w:tcPr>
+          <w:p>
+            <w:r>
+              <w:t>Arquivo</w:t>
+            </w:r>
+          </w:p>
+        </w:tc>
+        <w:tc>
+          <w:tcPr>
+            <w:tcW w:type="dxa" w:w="2340"/>
+          </w:tcPr>
+          <w:p>
+            <w:r>
+              <w:t>Modulo ainda nao classificado nesta documentacao automatica.</w:t>
+            </w:r>
+          </w:p>
+        </w:tc>
+        <w:tc>
+          <w:tcPr>
+            <w:tcW w:type="dxa" w:w="2340"/>
+          </w:tcPr>
+          <w:p>
+            <w:r>
+              <w:t>A revisar</w:t>
+            </w:r>
+          </w:p>
+        </w:tc>
+      </w:tr>
     </w:tbl>
     <w:p>
       <w:pPr>
@@ -1506,6 +1842,14 @@
       </w:pPr>
       <w:r>
         <w:t>classificador.py e metodologia.py receberam classificadores e geradores especializados para Ciencias, Biologia e Historia.</w:t>
+      </w:r>
+    </w:p>
+    <w:p>
+      <w:pPr>
+        <w:pStyle w:val="ListBullet"/>
+      </w:pPr>
+      <w:r>
+        <w:t>Instalação e mapeamento do LibreOffice (soffice) para automação e conversão local estável de .docx para .pdf.</w:t>
       </w:r>
     </w:p>
     <w:p>
@@ -2129,7 +2473,7 @@
     </w:p>
     <w:p>
       <w:r>
-        <w:t>Esta documentacao descreve o estado atual observado em 17/06/2026. Ela passou a ser regenerada por script interno para reduzir envelhecimento entre uma rodada de melhorias e outra.</w:t>
+        <w:t>Esta documentacao descreve o estado atual observado em 21/06/2026. Ela passou a ser regenerada por script interno para reduzir envelhecimento entre uma rodada de melhorias e outra.</w:t>
       </w:r>
     </w:p>
     <w:sectPr>

</xml_diff>

<commit_message>
docs: atualizar documentos de documentacao docx com as melhorias recentes
</commit_message>
<xml_diff>
--- a/DOCUMENTACAO_ESTRUTURA_CORE_PLANOS_LUAN.docx
+++ b/DOCUMENTACAO_ESTRUTURA_CORE_PLANOS_LUAN.docx
@@ -16,7 +16,7 @@
     </w:p>
     <w:p>
       <w:r>
-        <w:t>Documento atualizado automaticamente em 21/06/2026 às 20:23, em linguagem simples, com foco na estrutura real observada no codigo.</w:t>
+        <w:t>Documento atualizado automaticamente em 26/06/2026 às 20:23, em linguagem simples, com foco na estrutura real observada no codigo.</w:t>
       </w:r>
     </w:p>
     <w:p>
@@ -71,7 +71,7 @@
         <w:pStyle w:val="ListBullet"/>
       </w:pPr>
       <w:r>
-        <w:t>Arquivos de teste em tests/: 66</w:t>
+        <w:t>Arquivos de teste em tests/: 75</w:t>
       </w:r>
     </w:p>
     <w:p>
@@ -1478,7 +1478,7 @@
           </w:tcPr>
           <w:p>
             <w:r>
-              <w:t>Modulo ainda nao classificado nesta documentacao automatica.</w:t>
+              <w:t>Aplica validações e regras específicas para o fluxo de planos de Educação Financeira.</w:t>
             </w:r>
           </w:p>
         </w:tc>
@@ -1488,7 +1488,7 @@
           </w:tcPr>
           <w:p>
             <w:r>
-              <w:t>A revisar</w:t>
+              <w:t>Controle de qualidade</w:t>
             </w:r>
           </w:p>
         </w:tc>
@@ -1520,7 +1520,7 @@
           </w:tcPr>
           <w:p>
             <w:r>
-              <w:t>Modulo ainda nao classificado nesta documentacao automatica.</w:t>
+              <w:t>Utilitário para manipulação e estruturação de itens de listas pedagógicas.</w:t>
             </w:r>
           </w:p>
         </w:tc>
@@ -1530,7 +1530,7 @@
           </w:tcPr>
           <w:p>
             <w:r>
-              <w:t>A revisar</w:t>
+              <w:t>Apoio</w:t>
             </w:r>
           </w:p>
         </w:tc>
@@ -1562,7 +1562,7 @@
           </w:tcPr>
           <w:p>
             <w:r>
-              <w:t>Modulo ainda nao classificado nesta documentacao automatica.</w:t>
+              <w:t>Localiza e extrai referências pedagógicas de arquivos Word (.docx) na pasta de Biologia.</w:t>
             </w:r>
           </w:p>
         </w:tc>
@@ -1572,7 +1572,7 @@
           </w:tcPr>
           <w:p>
             <w:r>
-              <w:t>A revisar</w:t>
+              <w:t>Referência</w:t>
             </w:r>
           </w:p>
         </w:tc>
@@ -1604,7 +1604,7 @@
           </w:tcPr>
           <w:p>
             <w:r>
-              <w:t>Modulo ainda nao classificado nesta documentacao automatica.</w:t>
+              <w:t>Localiza e extrai referências pedagógicas de arquivos Word (.docx) na pasta de Educação Financeira.</w:t>
             </w:r>
           </w:p>
         </w:tc>
@@ -1614,7 +1614,7 @@
           </w:tcPr>
           <w:p>
             <w:r>
-              <w:t>A revisar</w:t>
+              <w:t>Referência</w:t>
             </w:r>
           </w:p>
         </w:tc>
@@ -1646,7 +1646,7 @@
           </w:tcPr>
           <w:p>
             <w:r>
-              <w:t>Modulo ainda nao classificado nesta documentacao automatica.</w:t>
+              <w:t>Localiza e extrai referências pedagógicas de arquivos Word (.docx) na pasta de Geografia.</w:t>
             </w:r>
           </w:p>
         </w:tc>
@@ -1656,7 +1656,7 @@
           </w:tcPr>
           <w:p>
             <w:r>
-              <w:t>A revisar</w:t>
+              <w:t>Referência</w:t>
             </w:r>
           </w:p>
         </w:tc>
@@ -1688,7 +1688,7 @@
           </w:tcPr>
           <w:p>
             <w:r>
-              <w:t>Modulo ainda nao classificado nesta documentacao automatica.</w:t>
+              <w:t>Localiza e extrai referências pedagógicas de arquivos Word (.docx) na pasta de Projeto de Vida.</w:t>
             </w:r>
           </w:p>
         </w:tc>
@@ -1698,7 +1698,7 @@
           </w:tcPr>
           <w:p>
             <w:r>
-              <w:t>A revisar</w:t>
+              <w:t>Referência</w:t>
             </w:r>
           </w:p>
         </w:tc>
@@ -1730,7 +1730,7 @@
           </w:tcPr>
           <w:p>
             <w:r>
-              <w:t>Modulo ainda nao classificado nesta documentacao automatica.</w:t>
+              <w:t>Gerencia normalização, agrupamento e identificação de turmas e salas espelhadas.</w:t>
             </w:r>
           </w:p>
         </w:tc>
@@ -1740,7 +1740,7 @@
           </w:tcPr>
           <w:p>
             <w:r>
-              <w:t>A revisar</w:t>
+              <w:t>Estrutural</w:t>
             </w:r>
           </w:p>
         </w:tc>
@@ -1772,7 +1772,7 @@
           </w:tcPr>
           <w:p>
             <w:r>
-              <w:t>Modulo ainda nao classificado nesta documentacao automatica.</w:t>
+              <w:t>Gerencia o rodízio de perfis pedagógicos por aula/professor para garantir variedade e evitar similaridade excessiva.</w:t>
             </w:r>
           </w:p>
         </w:tc>
@@ -1782,7 +1782,301 @@
           </w:tcPr>
           <w:p>
             <w:r>
-              <w:t>A revisar</w:t>
+              <w:t>Controle de qualidade</w:t>
+            </w:r>
+          </w:p>
+        </w:tc>
+      </w:tr>
+      <w:tr>
+        <w:tc>
+          <w:tcPr>
+            <w:tcW w:type="dxa" w:w="2340"/>
+          </w:tcPr>
+          <w:p>
+            <w:r>
+              <w:t>referencias_arte.py</w:t>
+            </w:r>
+          </w:p>
+        </w:tc>
+        <w:tc>
+          <w:tcPr>
+            <w:tcW w:type="dxa" w:w="2340"/>
+          </w:tcPr>
+          <w:p>
+            <w:r>
+              <w:t>Arquivo</w:t>
+            </w:r>
+          </w:p>
+        </w:tc>
+        <w:tc>
+          <w:tcPr>
+            <w:tcW w:type="dxa" w:w="2340"/>
+          </w:tcPr>
+          <w:p>
+            <w:r>
+              <w:t>Localiza e extrai referências pedagógicas (metodologia, acompanhamento e acessibilidade) de arquivos Word (.docx) para Arte e Mídias Digitais.</w:t>
+            </w:r>
+          </w:p>
+        </w:tc>
+        <w:tc>
+          <w:tcPr>
+            <w:tcW w:type="dxa" w:w="2340"/>
+          </w:tcPr>
+          <w:p>
+            <w:r>
+              <w:t>Referência</w:t>
+            </w:r>
+          </w:p>
+        </w:tc>
+      </w:tr>
+      <w:tr>
+        <w:tc>
+          <w:tcPr>
+            <w:tcW w:type="dxa" w:w="2340"/>
+          </w:tcPr>
+          <w:p>
+            <w:r>
+              <w:t>referencias_cdp_contextual.py</w:t>
+            </w:r>
+          </w:p>
+        </w:tc>
+        <w:tc>
+          <w:tcPr>
+            <w:tcW w:type="dxa" w:w="2340"/>
+          </w:tcPr>
+          <w:p>
+            <w:r>
+              <w:t>Arquivo</w:t>
+            </w:r>
+          </w:p>
+        </w:tc>
+        <w:tc>
+          <w:tcPr>
+            <w:tcW w:type="dxa" w:w="2340"/>
+          </w:tcPr>
+          <w:p>
+            <w:r>
+              <w:t>Localiza e extrai referências pedagógicas de arquivos Word (.docx) para planos CDP.</w:t>
+            </w:r>
+          </w:p>
+        </w:tc>
+        <w:tc>
+          <w:tcPr>
+            <w:tcW w:type="dxa" w:w="2340"/>
+          </w:tcPr>
+          <w:p>
+            <w:r>
+              <w:t>Referência</w:t>
+            </w:r>
+          </w:p>
+        </w:tc>
+      </w:tr>
+      <w:tr>
+        <w:tc>
+          <w:tcPr>
+            <w:tcW w:type="dxa" w:w="2340"/>
+          </w:tcPr>
+          <w:p>
+            <w:r>
+              <w:t>referencias_ciencias.py</w:t>
+            </w:r>
+          </w:p>
+        </w:tc>
+        <w:tc>
+          <w:tcPr>
+            <w:tcW w:type="dxa" w:w="2340"/>
+          </w:tcPr>
+          <w:p>
+            <w:r>
+              <w:t>Arquivo</w:t>
+            </w:r>
+          </w:p>
+        </w:tc>
+        <w:tc>
+          <w:tcPr>
+            <w:tcW w:type="dxa" w:w="2340"/>
+          </w:tcPr>
+          <w:p>
+            <w:r>
+              <w:t>Localiza e extrai referências pedagógicas de arquivos Word (.docx) na pasta de Ciências.</w:t>
+            </w:r>
+          </w:p>
+        </w:tc>
+        <w:tc>
+          <w:tcPr>
+            <w:tcW w:type="dxa" w:w="2340"/>
+          </w:tcPr>
+          <w:p>
+            <w:r>
+              <w:t>Referência</w:t>
+            </w:r>
+          </w:p>
+        </w:tc>
+      </w:tr>
+      <w:tr>
+        <w:tc>
+          <w:tcPr>
+            <w:tcW w:type="dxa" w:w="2340"/>
+          </w:tcPr>
+          <w:p>
+            <w:r>
+              <w:t>referencias_historia.py</w:t>
+            </w:r>
+          </w:p>
+        </w:tc>
+        <w:tc>
+          <w:tcPr>
+            <w:tcW w:type="dxa" w:w="2340"/>
+          </w:tcPr>
+          <w:p>
+            <w:r>
+              <w:t>Arquivo</w:t>
+            </w:r>
+          </w:p>
+        </w:tc>
+        <w:tc>
+          <w:tcPr>
+            <w:tcW w:type="dxa" w:w="2340"/>
+          </w:tcPr>
+          <w:p>
+            <w:r>
+              <w:t>Localiza e extrai referências pedagógicas de arquivos Word (.docx) na pasta de História.</w:t>
+            </w:r>
+          </w:p>
+        </w:tc>
+        <w:tc>
+          <w:tcPr>
+            <w:tcW w:type="dxa" w:w="2340"/>
+          </w:tcPr>
+          <w:p>
+            <w:r>
+              <w:t>Referência</w:t>
+            </w:r>
+          </w:p>
+        </w:tc>
+      </w:tr>
+      <w:tr>
+        <w:tc>
+          <w:tcPr>
+            <w:tcW w:type="dxa" w:w="2340"/>
+          </w:tcPr>
+          <w:p>
+            <w:r>
+              <w:t>referencias_lideranca_oratoria.py</w:t>
+            </w:r>
+          </w:p>
+        </w:tc>
+        <w:tc>
+          <w:tcPr>
+            <w:tcW w:type="dxa" w:w="2340"/>
+          </w:tcPr>
+          <w:p>
+            <w:r>
+              <w:t>Arquivo</w:t>
+            </w:r>
+          </w:p>
+        </w:tc>
+        <w:tc>
+          <w:tcPr>
+            <w:tcW w:type="dxa" w:w="2340"/>
+          </w:tcPr>
+          <w:p>
+            <w:r>
+              <w:t>Localiza e extrai referências pedagógicas de arquivos Word (.docx) na pasta de Liderança e Oratória.</w:t>
+            </w:r>
+          </w:p>
+        </w:tc>
+        <w:tc>
+          <w:tcPr>
+            <w:tcW w:type="dxa" w:w="2340"/>
+          </w:tcPr>
+          <w:p>
+            <w:r>
+              <w:t>Referência</w:t>
+            </w:r>
+          </w:p>
+        </w:tc>
+      </w:tr>
+      <w:tr>
+        <w:tc>
+          <w:tcPr>
+            <w:tcW w:type="dxa" w:w="2340"/>
+          </w:tcPr>
+          <w:p>
+            <w:r>
+              <w:t>referencias_lingua_inglesa.py</w:t>
+            </w:r>
+          </w:p>
+        </w:tc>
+        <w:tc>
+          <w:tcPr>
+            <w:tcW w:type="dxa" w:w="2340"/>
+          </w:tcPr>
+          <w:p>
+            <w:r>
+              <w:t>Arquivo</w:t>
+            </w:r>
+          </w:p>
+        </w:tc>
+        <w:tc>
+          <w:tcPr>
+            <w:tcW w:type="dxa" w:w="2340"/>
+          </w:tcPr>
+          <w:p>
+            <w:r>
+              <w:t>Localiza e extrai referências pedagógicas de arquivos Word (.docx) na pasta de Língua Inglesa.</w:t>
+            </w:r>
+          </w:p>
+        </w:tc>
+        <w:tc>
+          <w:tcPr>
+            <w:tcW w:type="dxa" w:w="2340"/>
+          </w:tcPr>
+          <w:p>
+            <w:r>
+              <w:t>Referência</w:t>
+            </w:r>
+          </w:p>
+        </w:tc>
+      </w:tr>
+      <w:tr>
+        <w:tc>
+          <w:tcPr>
+            <w:tcW w:type="dxa" w:w="2340"/>
+          </w:tcPr>
+          <w:p>
+            <w:r>
+              <w:t>referencias_orientacao_estudos.py</w:t>
+            </w:r>
+          </w:p>
+        </w:tc>
+        <w:tc>
+          <w:tcPr>
+            <w:tcW w:type="dxa" w:w="2340"/>
+          </w:tcPr>
+          <w:p>
+            <w:r>
+              <w:t>Arquivo</w:t>
+            </w:r>
+          </w:p>
+        </w:tc>
+        <w:tc>
+          <w:tcPr>
+            <w:tcW w:type="dxa" w:w="2340"/>
+          </w:tcPr>
+          <w:p>
+            <w:r>
+              <w:t>Localiza e extrai referências pedagógicas de arquivos Word (.docx) na pasta de Orientação de Estudos.</w:t>
+            </w:r>
+          </w:p>
+        </w:tc>
+        <w:tc>
+          <w:tcPr>
+            <w:tcW w:type="dxa" w:w="2340"/>
+          </w:tcPr>
+          <w:p>
+            <w:r>
+              <w:t>Referência</w:t>
             </w:r>
           </w:p>
         </w:tc>
@@ -2473,7 +2767,7 @@
     </w:p>
     <w:p>
       <w:r>
-        <w:t>Esta documentacao descreve o estado atual observado em 21/06/2026. Ela passou a ser regenerada por script interno para reduzir envelhecimento entre uma rodada de melhorias e outra.</w:t>
+        <w:t>Esta documentacao descreve o estado atual observado em 26/06/2026. Ela passou a ser regenerada por script interno para reduzir envelhecimento entre uma rodada de melhorias e outra.</w:t>
       </w:r>
     </w:p>
     <w:sectPr>

</xml_diff>

<commit_message>
Ajuste no limite de caracteres por etapa (600) e bump para versao 1.2.10
</commit_message>
<xml_diff>
--- a/DOCUMENTACAO_ESTRUTURA_CORE_PLANOS_LUAN.docx
+++ b/DOCUMENTACAO_ESTRUTURA_CORE_PLANOS_LUAN.docx
@@ -2770,6 +2770,24 @@
         <w:t>Esta documentacao descreve o estado atual observado em 26/06/2026. Ela passou a ser regenerada por script interno para reduzir envelhecimento entre uma rodada de melhorias e outra.</w:t>
       </w:r>
     </w:p>
+    <w:p>
+      <w:pPr>
+        <w:pStyle w:val="Heading2"/>
+      </w:pPr>
+      <w:r>
+        <w:t>Atualização Recente - Ajuste de Limite de Caracteres e Invalidação de Cache (Versão 1.2.10)</w:t>
+      </w:r>
+    </w:p>
+    <w:p>
+      <w:r>
+        <w:t>Ajuste na instrução da IA em core/ia.py: O limite de caracteres para cada etapa metodológica gerada pela Inteligência Artificial foi reduzido de 1200 para 600 caracteres. O objetivo é evitar planos de aula excessivamente prolixos e redundantes. Essa restrição também foi reforçada na função local de pós-processamento de strings '_compactar_metodologia' (hard limit).</w:t>
+      </w:r>
+    </w:p>
+    <w:p>
+      <w:r>
+        <w:t>Incremento da Versão do Gerador: A constante VERSAO_GERADOR_ATUAL no arquivo core/revisao_final.py foi incrementada para '1.2.10'. Isso garante que o cache antigo de json mantido pelo sistema (em core/reuso_cache_plano.py) seja ignorado, forçando a IA a reprocessar as requisições respeitando as novas diretrizes limitadoras de 600 caracteres.</w:t>
+      </w:r>
+    </w:p>
     <w:sectPr>
       <w:pgSz w:w="12240" w:h="15840"/>
       <w:pgMar w:top="1440" w:right="1440" w:bottom="1440" w:left="1440" w:header="720" w:footer="720" w:gutter="0"/>

</xml_diff>

<commit_message>
Correções no lote de geração: remoção do fallback silencioso da IA, ajuste na divisão de PDFs, mudança do caminho DOCX auxiliar para BASE_DIR e sufixo de arquivos gerados por IA para _In
</commit_message>
<xml_diff>
--- a/DOCUMENTACAO_ESTRUTURA_CORE_PLANOS_LUAN.docx
+++ b/DOCUMENTACAO_ESTRUTURA_CORE_PLANOS_LUAN.docx
@@ -2788,6 +2788,51 @@
         <w:t>Incremento da Versão do Gerador: A constante VERSAO_GERADOR_ATUAL no arquivo core/revisao_final.py foi incrementada para '1.2.10'. Isso garante que o cache antigo de json mantido pelo sistema (em core/reuso_cache_plano.py) seja ignorado, forçando a IA a reprocessar as requisições respeitando as novas diretrizes limitadoras de 600 caracteres.</w:t>
       </w:r>
     </w:p>
+    <w:p>
+      <w:pPr>
+        <w:pStyle w:val="Heading1"/>
+      </w:pPr>
+      <w:r>
+        <w:t>Registro de Atualizações - 07/07/2026</w:t>
+      </w:r>
+    </w:p>
+    <w:p>
+      <w:r>
+        <w:t>Atualizações recentes do sistema (Julho 2026):</w:t>
+      </w:r>
+    </w:p>
+    <w:p>
+      <w:pPr>
+        <w:pStyle w:val="ListBullet"/>
+      </w:pPr>
+      <w:r>
+        <w:t>- Correção no agrupamento de aulas duplas (divisão de metodologia) para não conflitar com a seleção automática de PDFs.</w:t>
+      </w:r>
+    </w:p>
+    <w:p>
+      <w:pPr>
+        <w:pStyle w:val="ListBullet"/>
+      </w:pPr>
+      <w:r>
+        <w:t>- Ajuste na pasta auxiliar DOCX_AUXILIARES_EXTRACAO: transferida para a raiz do projeto (BASE_DIR) para evitar conflitos de permissão do Windows Defender/OneDrive no diretório Documents.</w:t>
+      </w:r>
+    </w:p>
+    <w:p>
+      <w:pPr>
+        <w:pStyle w:val="ListBullet"/>
+      </w:pPr>
+      <w:r>
+        <w:t>- Remoção do fallback silencioso da Inteligência Artificial (OpenAI/Gemini): o sistema agora aborta o processamento com um erro explícito (RuntimeError) caso a IA falhe, em vez de recorrer silenciosamente ao motor heurístico local. Isso garante previsibilidade na geração de lotes.</w:t>
+      </w:r>
+    </w:p>
+    <w:p>
+      <w:pPr>
+        <w:pStyle w:val="ListBullet"/>
+      </w:pPr>
+      <w:r>
+        <w:t>- Nova nomenclatura de arquivos IA: planos gerados com sucesso utilizando motor de IA agora recebem obrigatoriamente o sufixo '_In' (ex: Plano_1o_ANO_A_Biologia_In.docx) indicando Inteligência Artificial, substituindo o antigo '_IA'.</w:t>
+      </w:r>
+    </w:p>
     <w:sectPr>
       <w:pgSz w:w="12240" w:h="15840"/>
       <w:pgMar w:top="1440" w:right="1440" w:bottom="1440" w:left="1440" w:header="720" w:footer="720" w:gutter="0"/>

</xml_diff>

<commit_message>
feat: implementar proteções de dados da auditoria (Fase 1 e 2)
</commit_message>
<xml_diff>
--- a/DOCUMENTACAO_ESTRUTURA_CORE_PLANOS_LUAN.docx
+++ b/DOCUMENTACAO_ESTRUTURA_CORE_PLANOS_LUAN.docx
@@ -2833,6 +2833,54 @@
         <w:t>- Nova nomenclatura de arquivos IA: planos gerados com sucesso utilizando motor de IA agora recebem obrigatoriamente o sufixo '_In' (ex: Plano_1o_ANO_A_Biologia_In.docx) indicando Inteligência Artificial, substituindo o antigo '_IA'.</w:t>
       </w:r>
     </w:p>
+    <w:p>
+      <w:pPr>
+        <w:pStyle w:val="Heading1"/>
+      </w:pPr>
+      <w:r>
+        <w:t>Registro de Atualizações - 12/07/2026</w:t>
+      </w:r>
+    </w:p>
+    <w:p>
+      <w:pPr>
+        <w:pStyle w:val="ListBullet"/>
+      </w:pPr>
+      <w:r>
+        <w:t>Correção no layout das tabelas do template EJA (MODELOCDP), garantindo a preservação da primeira coluna (Data e Horário) ao lidar com células mescladas na extração do acompanhamento.</w:t>
+      </w:r>
+    </w:p>
+    <w:p>
+      <w:pPr>
+        <w:pStyle w:val="ListBullet"/>
+      </w:pPr>
+      <w:r>
+        <w:t>Melhoria na formatação dos rótulos de horários contendo tuplas no gerador de lote (ui/geracao_lote.py), evitando que estruturas de código apareçam na impressão do Word.</w:t>
+      </w:r>
+    </w:p>
+    <w:p>
+      <w:pPr>
+        <w:pStyle w:val="ListBullet"/>
+      </w:pPr>
+      <w:r>
+        <w:t>Nova disciplina 'Biologia-EJA' incorporada nativamente aos identificadores do core (core/disciplinas.py e aliases do core/helpers.py).</w:t>
+      </w:r>
+    </w:p>
+    <w:p>
+      <w:pPr>
+        <w:pStyle w:val="ListBullet"/>
+      </w:pPr>
+      <w:r>
+        <w:t>Ampliação do dicionário de conjugação e normalização de verbos metodológicos da Inteligência Artificial em core/metodologia_texto.py (ex: Projete, Peça, Divida, Sugira, etc.).</w:t>
+      </w:r>
+    </w:p>
+    <w:p>
+      <w:pPr>
+        <w:pStyle w:val="ListBullet"/>
+      </w:pPr>
+      <w:r>
+        <w:t>Limpeza de interface aprimorada no Histórico (ui/historico.py): planos deletados das pastas físicas ocultam-se totalmente, ao invés de constarem como 'Indisponível'.</w:t>
+      </w:r>
+    </w:p>
     <w:sectPr>
       <w:pgSz w:w="12240" w:h="15840"/>
       <w:pgMar w:top="1440" w:right="1440" w:bottom="1440" w:left="1440" w:header="720" w:footer="720" w:gutter="0"/>

</xml_diff>

<commit_message>
docs: atualiza docx com refatoracoes de banco e strangler fig (Fases 1, 2 e 3)
</commit_message>
<xml_diff>
--- a/DOCUMENTACAO_ESTRUTURA_CORE_PLANOS_LUAN.docx
+++ b/DOCUMENTACAO_ESTRUTURA_CORE_PLANOS_LUAN.docx
@@ -2881,6 +2881,24 @@
         <w:t>Limpeza de interface aprimorada no Histórico (ui/historico.py): planos deletados das pastas físicas ocultam-se totalmente, ao invés de constarem como 'Indisponível'.</w:t>
       </w:r>
     </w:p>
+    <w:p>
+      <w:r>
+        <w:t>Registro de Atualizações - 13/07/2026 (Auditoria Fases 1 a 3)</w:t>
+        <w:br/>
+        <w:t>Resumo das últimas atualizações focadas na estabilidade do banco de dados, resiliência do Word e reestruturação arquitetural (Padrão Strangler Fig):</w:t>
+        <w:br/>
+        <w:t>- Refatoração do Word (Logical Grid): A gravação nas células (.docx) foi protegida contra o bug do `gridSpan` e `vMerge` (células mescladas). Isso previne a sobreposição de textos silenciosa no arquivo final gerado.</w:t>
+        <w:br/>
+        <w:t>- UUID4 no Histórico: Ao salvar no banco de dados e no disco físico, o timestamp obsoleto foi substituído por geração baseada em UUID, mitigando riscos de sobrescrita de arquivos se gerados no mesmo milissegundo.</w:t>
+        <w:br/>
+        <w:t>- Fallback Transparente de Inteligência Artificial: Se a requisição de IA (Gemini/OpenAI) retornar um Timeout ou Erro de Servidor, a rotina não fará o lote inteiro falhar. O sistema registrará o erro no log e utilizará, com transparência, o motor local de geração heurística, evitando interrupções na fila.</w:t>
+        <w:br/>
+        <w:t>- Desacoplamento Estrutural (Fase 3): A gigantesca rotina do arquivo `lote.py` começou a ser dividida em módulos dedicados (`core/application`, `core/domain`, `core/extraction`, `core/generation`).</w:t>
+        <w:br/>
+        <w:t>- Padrão Strangler Fig: Um orquestrador (`GerarPlanoService`) com injeção de contexto (`ContextBuilder`) e motor de geração (`PlanGenerator`) foi injetado em paralelo no sistema legado. Eles processam e logam a geração de planos usando as novas lógicas otimizadas sem interferir no pipeline original enquanto são validados em produção.</w:t>
+        <w:br/>
+      </w:r>
+    </w:p>
     <w:sectPr>
       <w:pgSz w:w="12240" w:h="15840"/>
       <w:pgMar w:top="1440" w:right="1440" w:bottom="1440" w:left="1440" w:header="720" w:footer="720" w:gutter="0"/>

</xml_diff>